<commit_message>
Limit case study scope to Netflix (Q1) and Amazon (Q2)
</commit_message>
<xml_diff>
--- a/docs/CA2_DevOps_Case_Studies.docx
+++ b/docs/CA2_DevOps_Case_Studies.docx
@@ -46,7 +46,7 @@
           <w:sz w:val="30"/>
           <w:szCs w:val="30"/>
         </w:rPr>
-        <w:t>Netflix  |  Amazon  |  Capital One</w:t>
+        <w:t>Netflix  |  Amazon</w:t>
       </w:r>
     </w:p>
     <w:p>
@@ -65,7 +65,7 @@
           <w:sz w:val="21"/>
           <w:szCs w:val="21"/>
         </w:rPr>
-        <w:t>Microservices  •  Chaos Engineering  •  Two-Pizza Teams  •  DevSecOps &amp; Shift-Left Security</w:t>
+        <w:t>Microservices  •  Chaos Engineering  •  Two-Pizza Teams  •  Continuous Delivery</w:t>
       </w:r>
     </w:p>
     <w:tbl>
@@ -91,12 +91,6 @@
         <w:gridCol w:w="5200"/>
       </w:tblGrid>
       <w:tr>
-        <w:tblPrEx>
-          <w:tblCellMar>
-            <w:top w:w="0" w:type="dxa"/>
-            <w:bottom w:w="0" w:type="dxa"/>
-          </w:tblCellMar>
-        </w:tblPrEx>
         <w:trPr>
           <w:jc w:val="center"/>
         </w:trPr>
@@ -149,12 +143,6 @@
         </w:tc>
       </w:tr>
       <w:tr>
-        <w:tblPrEx>
-          <w:tblCellMar>
-            <w:top w:w="0" w:type="dxa"/>
-            <w:bottom w:w="0" w:type="dxa"/>
-          </w:tblCellMar>
-        </w:tblPrEx>
         <w:trPr>
           <w:jc w:val="center"/>
         </w:trPr>
@@ -207,12 +195,6 @@
         </w:tc>
       </w:tr>
       <w:tr>
-        <w:tblPrEx>
-          <w:tblCellMar>
-            <w:top w:w="0" w:type="dxa"/>
-            <w:bottom w:w="0" w:type="dxa"/>
-          </w:tblCellMar>
-        </w:tblPrEx>
         <w:trPr>
           <w:jc w:val="center"/>
         </w:trPr>
@@ -265,12 +247,6 @@
         </w:tc>
       </w:tr>
       <w:tr>
-        <w:tblPrEx>
-          <w:tblCellMar>
-            <w:top w:w="0" w:type="dxa"/>
-            <w:bottom w:w="0" w:type="dxa"/>
-          </w:tblCellMar>
-        </w:tblPrEx>
         <w:trPr>
           <w:jc w:val="center"/>
         </w:trPr>
@@ -323,12 +299,6 @@
         </w:tc>
       </w:tr>
       <w:tr>
-        <w:tblPrEx>
-          <w:tblCellMar>
-            <w:top w:w="0" w:type="dxa"/>
-            <w:bottom w:w="0" w:type="dxa"/>
-          </w:tblCellMar>
-        </w:tblPrEx>
         <w:trPr>
           <w:jc w:val="center"/>
         </w:trPr>
@@ -381,12 +351,6 @@
         </w:tc>
       </w:tr>
       <w:tr>
-        <w:tblPrEx>
-          <w:tblCellMar>
-            <w:top w:w="0" w:type="dxa"/>
-            <w:bottom w:w="0" w:type="dxa"/>
-          </w:tblCellMar>
-        </w:tblPrEx>
         <w:trPr>
           <w:jc w:val="center"/>
         </w:trPr>
@@ -503,7 +467,7 @@
           <w:r>
             <w:fldChar w:fldCharType="separate"/>
           </w:r>
-          <w:hyperlink w:anchor="_Toc241757545" w:history="1">
+          <w:hyperlink w:anchor="_Toc241782119" w:history="1">
             <w:r>
               <w:rPr>
                 <w:rStyle w:val="Hyperlink"/>
@@ -527,7 +491,7 @@
               <w:rPr>
                 <w:noProof/>
               </w:rPr>
-              <w:instrText xml:space="preserve"> PAGEREF _Toc241757545 \h </w:instrText>
+              <w:instrText xml:space="preserve"> PAGEREF _Toc241782119 \h </w:instrText>
             </w:r>
             <w:r>
               <w:rPr>
@@ -569,7 +533,7 @@
               <w14:ligatures w14:val="standardContextual"/>
             </w:rPr>
           </w:pPr>
-          <w:hyperlink w:anchor="_Toc241757546" w:history="1">
+          <w:hyperlink w:anchor="_Toc241782120" w:history="1">
             <w:r>
               <w:rPr>
                 <w:rStyle w:val="Hyperlink"/>
@@ -593,7 +557,7 @@
               <w:rPr>
                 <w:noProof/>
               </w:rPr>
-              <w:instrText xml:space="preserve"> PAGEREF _Toc241757546 \h </w:instrText>
+              <w:instrText xml:space="preserve"> PAGEREF _Toc241782120 \h </w:instrText>
             </w:r>
             <w:r>
               <w:rPr>
@@ -635,7 +599,7 @@
               <w14:ligatures w14:val="standardContextual"/>
             </w:rPr>
           </w:pPr>
-          <w:hyperlink w:anchor="_Toc241757547" w:history="1">
+          <w:hyperlink w:anchor="_Toc241782121" w:history="1">
             <w:r>
               <w:rPr>
                 <w:rStyle w:val="Hyperlink"/>
@@ -659,7 +623,7 @@
               <w:rPr>
                 <w:noProof/>
               </w:rPr>
-              <w:instrText xml:space="preserve"> PAGEREF _Toc241757547 \h </w:instrText>
+              <w:instrText xml:space="preserve"> PAGEREF _Toc241782121 \h </w:instrText>
             </w:r>
             <w:r>
               <w:rPr>
@@ -701,7 +665,7 @@
               <w14:ligatures w14:val="standardContextual"/>
             </w:rPr>
           </w:pPr>
-          <w:hyperlink w:anchor="_Toc241757548" w:history="1">
+          <w:hyperlink w:anchor="_Toc241782122" w:history="1">
             <w:r>
               <w:rPr>
                 <w:rStyle w:val="Hyperlink"/>
@@ -725,7 +689,7 @@
               <w:rPr>
                 <w:noProof/>
               </w:rPr>
-              <w:instrText xml:space="preserve"> PAGEREF _Toc241757548 \h </w:instrText>
+              <w:instrText xml:space="preserve"> PAGEREF _Toc241782122 \h </w:instrText>
             </w:r>
             <w:r>
               <w:rPr>
@@ -767,7 +731,7 @@
               <w14:ligatures w14:val="standardContextual"/>
             </w:rPr>
           </w:pPr>
-          <w:hyperlink w:anchor="_Toc241757549" w:history="1">
+          <w:hyperlink w:anchor="_Toc241782123" w:history="1">
             <w:r>
               <w:rPr>
                 <w:rStyle w:val="Hyperlink"/>
@@ -791,7 +755,7 @@
               <w:rPr>
                 <w:noProof/>
               </w:rPr>
-              <w:instrText xml:space="preserve"> PAGEREF _Toc241757549 \h </w:instrText>
+              <w:instrText xml:space="preserve"> PAGEREF _Toc241782123 \h </w:instrText>
             </w:r>
             <w:r>
               <w:rPr>
@@ -833,7 +797,7 @@
               <w14:ligatures w14:val="standardContextual"/>
             </w:rPr>
           </w:pPr>
-          <w:hyperlink w:anchor="_Toc241757550" w:history="1">
+          <w:hyperlink w:anchor="_Toc241782124" w:history="1">
             <w:r>
               <w:rPr>
                 <w:rStyle w:val="Hyperlink"/>
@@ -857,7 +821,7 @@
               <w:rPr>
                 <w:noProof/>
               </w:rPr>
-              <w:instrText xml:space="preserve"> PAGEREF _Toc241757550 \h </w:instrText>
+              <w:instrText xml:space="preserve"> PAGEREF _Toc241782124 \h </w:instrText>
             </w:r>
             <w:r>
               <w:rPr>
@@ -899,7 +863,7 @@
               <w14:ligatures w14:val="standardContextual"/>
             </w:rPr>
           </w:pPr>
-          <w:hyperlink w:anchor="_Toc241757551" w:history="1">
+          <w:hyperlink w:anchor="_Toc241782125" w:history="1">
             <w:r>
               <w:rPr>
                 <w:rStyle w:val="Hyperlink"/>
@@ -923,7 +887,7 @@
               <w:rPr>
                 <w:noProof/>
               </w:rPr>
-              <w:instrText xml:space="preserve"> PAGEREF _Toc241757551 \h </w:instrText>
+              <w:instrText xml:space="preserve"> PAGEREF _Toc241782125 \h </w:instrText>
             </w:r>
             <w:r>
               <w:rPr>
@@ -965,7 +929,7 @@
               <w14:ligatures w14:val="standardContextual"/>
             </w:rPr>
           </w:pPr>
-          <w:hyperlink w:anchor="_Toc241757552" w:history="1">
+          <w:hyperlink w:anchor="_Toc241782126" w:history="1">
             <w:r>
               <w:rPr>
                 <w:rStyle w:val="Hyperlink"/>
@@ -989,7 +953,7 @@
               <w:rPr>
                 <w:noProof/>
               </w:rPr>
-              <w:instrText xml:space="preserve"> PAGEREF _Toc241757552 \h </w:instrText>
+              <w:instrText xml:space="preserve"> PAGEREF _Toc241782126 \h </w:instrText>
             </w:r>
             <w:r>
               <w:rPr>
@@ -1031,7 +995,7 @@
               <w14:ligatures w14:val="standardContextual"/>
             </w:rPr>
           </w:pPr>
-          <w:hyperlink w:anchor="_Toc241757553" w:history="1">
+          <w:hyperlink w:anchor="_Toc241782127" w:history="1">
             <w:r>
               <w:rPr>
                 <w:rStyle w:val="Hyperlink"/>
@@ -1055,7 +1019,7 @@
               <w:rPr>
                 <w:noProof/>
               </w:rPr>
-              <w:instrText xml:space="preserve"> PAGEREF _Toc241757553 \h </w:instrText>
+              <w:instrText xml:space="preserve"> PAGEREF _Toc241782127 \h </w:instrText>
             </w:r>
             <w:r>
               <w:rPr>
@@ -1097,7 +1061,7 @@
               <w14:ligatures w14:val="standardContextual"/>
             </w:rPr>
           </w:pPr>
-          <w:hyperlink w:anchor="_Toc241757554" w:history="1">
+          <w:hyperlink w:anchor="_Toc241782128" w:history="1">
             <w:r>
               <w:rPr>
                 <w:rStyle w:val="Hyperlink"/>
@@ -1121,7 +1085,7 @@
               <w:rPr>
                 <w:noProof/>
               </w:rPr>
-              <w:instrText xml:space="preserve"> PAGEREF _Toc241757554 \h </w:instrText>
+              <w:instrText xml:space="preserve"> PAGEREF _Toc241782128 \h </w:instrText>
             </w:r>
             <w:r>
               <w:rPr>
@@ -1163,7 +1127,7 @@
               <w14:ligatures w14:val="standardContextual"/>
             </w:rPr>
           </w:pPr>
-          <w:hyperlink w:anchor="_Toc241757555" w:history="1">
+          <w:hyperlink w:anchor="_Toc241782129" w:history="1">
             <w:r>
               <w:rPr>
                 <w:rStyle w:val="Hyperlink"/>
@@ -1187,7 +1151,7 @@
               <w:rPr>
                 <w:noProof/>
               </w:rPr>
-              <w:instrText xml:space="preserve"> PAGEREF _Toc241757555 \h </w:instrText>
+              <w:instrText xml:space="preserve"> PAGEREF _Toc241782129 \h </w:instrText>
             </w:r>
             <w:r>
               <w:rPr>
@@ -1229,7 +1193,7 @@
               <w14:ligatures w14:val="standardContextual"/>
             </w:rPr>
           </w:pPr>
-          <w:hyperlink w:anchor="_Toc241757556" w:history="1">
+          <w:hyperlink w:anchor="_Toc241782130" w:history="1">
             <w:r>
               <w:rPr>
                 <w:rStyle w:val="Hyperlink"/>
@@ -1253,7 +1217,7 @@
               <w:rPr>
                 <w:noProof/>
               </w:rPr>
-              <w:instrText xml:space="preserve"> PAGEREF _Toc241757556 \h </w:instrText>
+              <w:instrText xml:space="preserve"> PAGEREF _Toc241782130 \h </w:instrText>
             </w:r>
             <w:r>
               <w:rPr>
@@ -1295,7 +1259,7 @@
               <w14:ligatures w14:val="standardContextual"/>
             </w:rPr>
           </w:pPr>
-          <w:hyperlink w:anchor="_Toc241757557" w:history="1">
+          <w:hyperlink w:anchor="_Toc241782131" w:history="1">
             <w:r>
               <w:rPr>
                 <w:rStyle w:val="Hyperlink"/>
@@ -1319,7 +1283,7 @@
               <w:rPr>
                 <w:noProof/>
               </w:rPr>
-              <w:instrText xml:space="preserve"> PAGEREF _Toc241757557 \h </w:instrText>
+              <w:instrText xml:space="preserve"> PAGEREF _Toc241782131 \h </w:instrText>
             </w:r>
             <w:r>
               <w:rPr>
@@ -1361,7 +1325,7 @@
               <w14:ligatures w14:val="standardContextual"/>
             </w:rPr>
           </w:pPr>
-          <w:hyperlink w:anchor="_Toc241757558" w:history="1">
+          <w:hyperlink w:anchor="_Toc241782132" w:history="1">
             <w:r>
               <w:rPr>
                 <w:rStyle w:val="Hyperlink"/>
@@ -1385,7 +1349,7 @@
               <w:rPr>
                 <w:noProof/>
               </w:rPr>
-              <w:instrText xml:space="preserve"> PAGEREF _Toc241757558 \h </w:instrText>
+              <w:instrText xml:space="preserve"> PAGEREF _Toc241782132 \h </w:instrText>
             </w:r>
             <w:r>
               <w:rPr>
@@ -1427,7 +1391,7 @@
               <w14:ligatures w14:val="standardContextual"/>
             </w:rPr>
           </w:pPr>
-          <w:hyperlink w:anchor="_Toc241757559" w:history="1">
+          <w:hyperlink w:anchor="_Toc241782133" w:history="1">
             <w:r>
               <w:rPr>
                 <w:rStyle w:val="Hyperlink"/>
@@ -1451,7 +1415,7 @@
               <w:rPr>
                 <w:noProof/>
               </w:rPr>
-              <w:instrText xml:space="preserve"> PAGEREF _Toc241757559 \h </w:instrText>
+              <w:instrText xml:space="preserve"> PAGEREF _Toc241782133 \h </w:instrText>
             </w:r>
             <w:r>
               <w:rPr>
@@ -1493,13 +1457,13 @@
               <w14:ligatures w14:val="standardContextual"/>
             </w:rPr>
           </w:pPr>
-          <w:hyperlink w:anchor="_Toc241757560" w:history="1">
+          <w:hyperlink w:anchor="_Toc241782134" w:history="1">
             <w:r>
               <w:rPr>
                 <w:rStyle w:val="Hyperlink"/>
                 <w:noProof/>
               </w:rPr>
-              <w:t>Question 3: Capital One — DevSecOps and “Shift-Left” Security in a Regulated Bank</w:t>
+              <w:t>Comparative Summary</w:t>
             </w:r>
             <w:r>
               <w:rPr>
@@ -1517,7 +1481,7 @@
               <w:rPr>
                 <w:noProof/>
               </w:rPr>
-              <w:instrText xml:space="preserve"> PAGEREF _Toc241757560 \h </w:instrText>
+              <w:instrText xml:space="preserve"> PAGEREF _Toc241782134 \h </w:instrText>
             </w:r>
             <w:r>
               <w:rPr>
@@ -1559,13 +1523,13 @@
               <w14:ligatures w14:val="standardContextual"/>
             </w:rPr>
           </w:pPr>
-          <w:hyperlink w:anchor="_Toc241757561" w:history="1">
+          <w:hyperlink w:anchor="_Toc241782135" w:history="1">
             <w:r>
               <w:rPr>
                 <w:rStyle w:val="Hyperlink"/>
                 <w:noProof/>
               </w:rPr>
-              <w:t>3.1 Introduction and Background</w:t>
+              <w:t>Overall Conclusion</w:t>
             </w:r>
             <w:r>
               <w:rPr>
@@ -1583,7 +1547,7 @@
               <w:rPr>
                 <w:noProof/>
               </w:rPr>
-              <w:instrText xml:space="preserve"> PAGEREF _Toc241757561 \h </w:instrText>
+              <w:instrText xml:space="preserve"> PAGEREF _Toc241782135 \h </w:instrText>
             </w:r>
             <w:r>
               <w:rPr>
@@ -1601,402 +1565,6 @@
                 <w:noProof/>
               </w:rPr>
               <w:t>15</w:t>
-            </w:r>
-            <w:r>
-              <w:rPr>
-                <w:noProof/>
-              </w:rPr>
-              <w:fldChar w:fldCharType="end"/>
-            </w:r>
-          </w:hyperlink>
-        </w:p>
-        <w:p>
-          <w:pPr>
-            <w:pStyle w:val="TOC2"/>
-            <w:tabs>
-              <w:tab w:val="right" w:leader="dot" w:pos="9016"/>
-            </w:tabs>
-            <w:rPr>
-              <w:rFonts w:asciiTheme="minorHAnsi" w:eastAsiaTheme="minorEastAsia" w:hAnsiTheme="minorHAnsi" w:cstheme="minorBidi"/>
-              <w:noProof/>
-              <w:kern w:val="2"/>
-              <w:sz w:val="24"/>
-              <w:szCs w:val="24"/>
-              <w14:ligatures w14:val="standardContextual"/>
-            </w:rPr>
-          </w:pPr>
-          <w:hyperlink w:anchor="_Toc241757562" w:history="1">
-            <w:r>
-              <w:rPr>
-                <w:rStyle w:val="Hyperlink"/>
-                <w:noProof/>
-              </w:rPr>
-              <w:t>3.2 The Dual Challenge: Speed versus Security and Compliance</w:t>
-            </w:r>
-            <w:r>
-              <w:rPr>
-                <w:noProof/>
-              </w:rPr>
-              <w:tab/>
-            </w:r>
-            <w:r>
-              <w:rPr>
-                <w:noProof/>
-              </w:rPr>
-              <w:fldChar w:fldCharType="begin"/>
-            </w:r>
-            <w:r>
-              <w:rPr>
-                <w:noProof/>
-              </w:rPr>
-              <w:instrText xml:space="preserve"> PAGEREF _Toc241757562 \h </w:instrText>
-            </w:r>
-            <w:r>
-              <w:rPr>
-                <w:noProof/>
-              </w:rPr>
-            </w:r>
-            <w:r>
-              <w:rPr>
-                <w:noProof/>
-              </w:rPr>
-              <w:fldChar w:fldCharType="separate"/>
-            </w:r>
-            <w:r>
-              <w:rPr>
-                <w:noProof/>
-              </w:rPr>
-              <w:t>15</w:t>
-            </w:r>
-            <w:r>
-              <w:rPr>
-                <w:noProof/>
-              </w:rPr>
-              <w:fldChar w:fldCharType="end"/>
-            </w:r>
-          </w:hyperlink>
-        </w:p>
-        <w:p>
-          <w:pPr>
-            <w:pStyle w:val="TOC2"/>
-            <w:tabs>
-              <w:tab w:val="right" w:leader="dot" w:pos="9016"/>
-            </w:tabs>
-            <w:rPr>
-              <w:rFonts w:asciiTheme="minorHAnsi" w:eastAsiaTheme="minorEastAsia" w:hAnsiTheme="minorHAnsi" w:cstheme="minorBidi"/>
-              <w:noProof/>
-              <w:kern w:val="2"/>
-              <w:sz w:val="24"/>
-              <w:szCs w:val="24"/>
-              <w14:ligatures w14:val="standardContextual"/>
-            </w:rPr>
-          </w:pPr>
-          <w:hyperlink w:anchor="_Toc241757563" w:history="1">
-            <w:r>
-              <w:rPr>
-                <w:rStyle w:val="Hyperlink"/>
-                <w:noProof/>
-              </w:rPr>
-              <w:t>3.3 Capital One’s DevSecOps Approach</w:t>
-            </w:r>
-            <w:r>
-              <w:rPr>
-                <w:noProof/>
-              </w:rPr>
-              <w:tab/>
-            </w:r>
-            <w:r>
-              <w:rPr>
-                <w:noProof/>
-              </w:rPr>
-              <w:fldChar w:fldCharType="begin"/>
-            </w:r>
-            <w:r>
-              <w:rPr>
-                <w:noProof/>
-              </w:rPr>
-              <w:instrText xml:space="preserve"> PAGEREF _Toc241757563 \h </w:instrText>
-            </w:r>
-            <w:r>
-              <w:rPr>
-                <w:noProof/>
-              </w:rPr>
-            </w:r>
-            <w:r>
-              <w:rPr>
-                <w:noProof/>
-              </w:rPr>
-              <w:fldChar w:fldCharType="separate"/>
-            </w:r>
-            <w:r>
-              <w:rPr>
-                <w:noProof/>
-              </w:rPr>
-              <w:t>16</w:t>
-            </w:r>
-            <w:r>
-              <w:rPr>
-                <w:noProof/>
-              </w:rPr>
-              <w:fldChar w:fldCharType="end"/>
-            </w:r>
-          </w:hyperlink>
-        </w:p>
-        <w:p>
-          <w:pPr>
-            <w:pStyle w:val="TOC2"/>
-            <w:tabs>
-              <w:tab w:val="right" w:leader="dot" w:pos="9016"/>
-            </w:tabs>
-            <w:rPr>
-              <w:rFonts w:asciiTheme="minorHAnsi" w:eastAsiaTheme="minorEastAsia" w:hAnsiTheme="minorHAnsi" w:cstheme="minorBidi"/>
-              <w:noProof/>
-              <w:kern w:val="2"/>
-              <w:sz w:val="24"/>
-              <w:szCs w:val="24"/>
-              <w14:ligatures w14:val="standardContextual"/>
-            </w:rPr>
-          </w:pPr>
-          <w:hyperlink w:anchor="_Toc241757564" w:history="1">
-            <w:r>
-              <w:rPr>
-                <w:rStyle w:val="Hyperlink"/>
-                <w:noProof/>
-              </w:rPr>
-              <w:t>3.4 How Embedding Security Accelerates Innovation and Reduces Incidents</w:t>
-            </w:r>
-            <w:r>
-              <w:rPr>
-                <w:noProof/>
-              </w:rPr>
-              <w:tab/>
-            </w:r>
-            <w:r>
-              <w:rPr>
-                <w:noProof/>
-              </w:rPr>
-              <w:fldChar w:fldCharType="begin"/>
-            </w:r>
-            <w:r>
-              <w:rPr>
-                <w:noProof/>
-              </w:rPr>
-              <w:instrText xml:space="preserve"> PAGEREF _Toc241757564 \h </w:instrText>
-            </w:r>
-            <w:r>
-              <w:rPr>
-                <w:noProof/>
-              </w:rPr>
-            </w:r>
-            <w:r>
-              <w:rPr>
-                <w:noProof/>
-              </w:rPr>
-              <w:fldChar w:fldCharType="separate"/>
-            </w:r>
-            <w:r>
-              <w:rPr>
-                <w:noProof/>
-              </w:rPr>
-              <w:t>18</w:t>
-            </w:r>
-            <w:r>
-              <w:rPr>
-                <w:noProof/>
-              </w:rPr>
-              <w:fldChar w:fldCharType="end"/>
-            </w:r>
-          </w:hyperlink>
-        </w:p>
-        <w:p>
-          <w:pPr>
-            <w:pStyle w:val="TOC2"/>
-            <w:tabs>
-              <w:tab w:val="right" w:leader="dot" w:pos="9016"/>
-            </w:tabs>
-            <w:rPr>
-              <w:rFonts w:asciiTheme="minorHAnsi" w:eastAsiaTheme="minorEastAsia" w:hAnsiTheme="minorHAnsi" w:cstheme="minorBidi"/>
-              <w:noProof/>
-              <w:kern w:val="2"/>
-              <w:sz w:val="24"/>
-              <w:szCs w:val="24"/>
-              <w14:ligatures w14:val="standardContextual"/>
-            </w:rPr>
-          </w:pPr>
-          <w:hyperlink w:anchor="_Toc241757565" w:history="1">
-            <w:r>
-              <w:rPr>
-                <w:rStyle w:val="Hyperlink"/>
-                <w:noProof/>
-              </w:rPr>
-              <w:t>3.5 Outcomes at Capital One</w:t>
-            </w:r>
-            <w:r>
-              <w:rPr>
-                <w:noProof/>
-              </w:rPr>
-              <w:tab/>
-            </w:r>
-            <w:r>
-              <w:rPr>
-                <w:noProof/>
-              </w:rPr>
-              <w:fldChar w:fldCharType="begin"/>
-            </w:r>
-            <w:r>
-              <w:rPr>
-                <w:noProof/>
-              </w:rPr>
-              <w:instrText xml:space="preserve"> PAGEREF _Toc241757565 \h </w:instrText>
-            </w:r>
-            <w:r>
-              <w:rPr>
-                <w:noProof/>
-              </w:rPr>
-            </w:r>
-            <w:r>
-              <w:rPr>
-                <w:noProof/>
-              </w:rPr>
-              <w:fldChar w:fldCharType="separate"/>
-            </w:r>
-            <w:r>
-              <w:rPr>
-                <w:noProof/>
-              </w:rPr>
-              <w:t>19</w:t>
-            </w:r>
-            <w:r>
-              <w:rPr>
-                <w:noProof/>
-              </w:rPr>
-              <w:fldChar w:fldCharType="end"/>
-            </w:r>
-          </w:hyperlink>
-        </w:p>
-        <w:p>
-          <w:pPr>
-            <w:pStyle w:val="TOC2"/>
-            <w:tabs>
-              <w:tab w:val="right" w:leader="dot" w:pos="9016"/>
-            </w:tabs>
-            <w:rPr>
-              <w:rFonts w:asciiTheme="minorHAnsi" w:eastAsiaTheme="minorEastAsia" w:hAnsiTheme="minorHAnsi" w:cstheme="minorBidi"/>
-              <w:noProof/>
-              <w:kern w:val="2"/>
-              <w:sz w:val="24"/>
-              <w:szCs w:val="24"/>
-              <w14:ligatures w14:val="standardContextual"/>
-            </w:rPr>
-          </w:pPr>
-          <w:hyperlink w:anchor="_Toc241757566" w:history="1">
-            <w:r>
-              <w:rPr>
-                <w:rStyle w:val="Hyperlink"/>
-                <w:noProof/>
-              </w:rPr>
-              <w:t>3.6 Critical Analysis: Lessons from the 2019 Breach</w:t>
-            </w:r>
-            <w:r>
-              <w:rPr>
-                <w:noProof/>
-              </w:rPr>
-              <w:tab/>
-            </w:r>
-            <w:r>
-              <w:rPr>
-                <w:noProof/>
-              </w:rPr>
-              <w:fldChar w:fldCharType="begin"/>
-            </w:r>
-            <w:r>
-              <w:rPr>
-                <w:noProof/>
-              </w:rPr>
-              <w:instrText xml:space="preserve"> PAGEREF _Toc241757566 \h </w:instrText>
-            </w:r>
-            <w:r>
-              <w:rPr>
-                <w:noProof/>
-              </w:rPr>
-            </w:r>
-            <w:r>
-              <w:rPr>
-                <w:noProof/>
-              </w:rPr>
-              <w:fldChar w:fldCharType="separate"/>
-            </w:r>
-            <w:r>
-              <w:rPr>
-                <w:noProof/>
-              </w:rPr>
-              <w:t>20</w:t>
-            </w:r>
-            <w:r>
-              <w:rPr>
-                <w:noProof/>
-              </w:rPr>
-              <w:fldChar w:fldCharType="end"/>
-            </w:r>
-          </w:hyperlink>
-        </w:p>
-        <w:p>
-          <w:pPr>
-            <w:pStyle w:val="TOC2"/>
-            <w:tabs>
-              <w:tab w:val="right" w:leader="dot" w:pos="9016"/>
-            </w:tabs>
-            <w:rPr>
-              <w:rFonts w:asciiTheme="minorHAnsi" w:eastAsiaTheme="minorEastAsia" w:hAnsiTheme="minorHAnsi" w:cstheme="minorBidi"/>
-              <w:noProof/>
-              <w:kern w:val="2"/>
-              <w:sz w:val="24"/>
-              <w:szCs w:val="24"/>
-              <w14:ligatures w14:val="standardContextual"/>
-            </w:rPr>
-          </w:pPr>
-          <w:hyperlink w:anchor="_Toc241757567" w:history="1">
-            <w:r>
-              <w:rPr>
-                <w:rStyle w:val="Hyperlink"/>
-                <w:noProof/>
-              </w:rPr>
-              <w:t>3.7 Conclusion</w:t>
-            </w:r>
-            <w:r>
-              <w:rPr>
-                <w:noProof/>
-              </w:rPr>
-              <w:tab/>
-            </w:r>
-            <w:r>
-              <w:rPr>
-                <w:noProof/>
-              </w:rPr>
-              <w:fldChar w:fldCharType="begin"/>
-            </w:r>
-            <w:r>
-              <w:rPr>
-                <w:noProof/>
-              </w:rPr>
-              <w:instrText xml:space="preserve"> PAGEREF _Toc241757567 \h </w:instrText>
-            </w:r>
-            <w:r>
-              <w:rPr>
-                <w:noProof/>
-              </w:rPr>
-            </w:r>
-            <w:r>
-              <w:rPr>
-                <w:noProof/>
-              </w:rPr>
-              <w:fldChar w:fldCharType="separate"/>
-            </w:r>
-            <w:r>
-              <w:rPr>
-                <w:noProof/>
-              </w:rPr>
-              <w:t>20</w:t>
             </w:r>
             <w:r>
               <w:rPr>
@@ -2021,13 +1589,13 @@
               <w14:ligatures w14:val="standardContextual"/>
             </w:rPr>
           </w:pPr>
-          <w:hyperlink w:anchor="_Toc241757568" w:history="1">
+          <w:hyperlink w:anchor="_Toc241782136" w:history="1">
             <w:r>
               <w:rPr>
                 <w:rStyle w:val="Hyperlink"/>
                 <w:noProof/>
               </w:rPr>
-              <w:t>Comparative Summary</w:t>
+              <w:t>References</w:t>
             </w:r>
             <w:r>
               <w:rPr>
@@ -2045,7 +1613,7 @@
               <w:rPr>
                 <w:noProof/>
               </w:rPr>
-              <w:instrText xml:space="preserve"> PAGEREF _Toc241757568 \h </w:instrText>
+              <w:instrText xml:space="preserve"> PAGEREF _Toc241782136 \h </w:instrText>
             </w:r>
             <w:r>
               <w:rPr>
@@ -2062,139 +1630,7 @@
               <w:rPr>
                 <w:noProof/>
               </w:rPr>
-              <w:t>21</w:t>
-            </w:r>
-            <w:r>
-              <w:rPr>
-                <w:noProof/>
-              </w:rPr>
-              <w:fldChar w:fldCharType="end"/>
-            </w:r>
-          </w:hyperlink>
-        </w:p>
-        <w:p>
-          <w:pPr>
-            <w:pStyle w:val="TOC2"/>
-            <w:tabs>
-              <w:tab w:val="right" w:leader="dot" w:pos="9016"/>
-            </w:tabs>
-            <w:rPr>
-              <w:rFonts w:asciiTheme="minorHAnsi" w:eastAsiaTheme="minorEastAsia" w:hAnsiTheme="minorHAnsi" w:cstheme="minorBidi"/>
-              <w:noProof/>
-              <w:kern w:val="2"/>
-              <w:sz w:val="24"/>
-              <w:szCs w:val="24"/>
-              <w14:ligatures w14:val="standardContextual"/>
-            </w:rPr>
-          </w:pPr>
-          <w:hyperlink w:anchor="_Toc241757569" w:history="1">
-            <w:r>
-              <w:rPr>
-                <w:rStyle w:val="Hyperlink"/>
-                <w:noProof/>
-              </w:rPr>
-              <w:t>Overall Conclusion</w:t>
-            </w:r>
-            <w:r>
-              <w:rPr>
-                <w:noProof/>
-              </w:rPr>
-              <w:tab/>
-            </w:r>
-            <w:r>
-              <w:rPr>
-                <w:noProof/>
-              </w:rPr>
-              <w:fldChar w:fldCharType="begin"/>
-            </w:r>
-            <w:r>
-              <w:rPr>
-                <w:noProof/>
-              </w:rPr>
-              <w:instrText xml:space="preserve"> PAGEREF _Toc241757569 \h </w:instrText>
-            </w:r>
-            <w:r>
-              <w:rPr>
-                <w:noProof/>
-              </w:rPr>
-            </w:r>
-            <w:r>
-              <w:rPr>
-                <w:noProof/>
-              </w:rPr>
-              <w:fldChar w:fldCharType="separate"/>
-            </w:r>
-            <w:r>
-              <w:rPr>
-                <w:noProof/>
-              </w:rPr>
-              <w:t>21</w:t>
-            </w:r>
-            <w:r>
-              <w:rPr>
-                <w:noProof/>
-              </w:rPr>
-              <w:fldChar w:fldCharType="end"/>
-            </w:r>
-          </w:hyperlink>
-        </w:p>
-        <w:p>
-          <w:pPr>
-            <w:pStyle w:val="TOC1"/>
-            <w:tabs>
-              <w:tab w:val="right" w:leader="dot" w:pos="9016"/>
-            </w:tabs>
-            <w:rPr>
-              <w:rFonts w:asciiTheme="minorHAnsi" w:eastAsiaTheme="minorEastAsia" w:hAnsiTheme="minorHAnsi" w:cstheme="minorBidi"/>
-              <w:noProof/>
-              <w:kern w:val="2"/>
-              <w:sz w:val="24"/>
-              <w:szCs w:val="24"/>
-              <w14:ligatures w14:val="standardContextual"/>
-            </w:rPr>
-          </w:pPr>
-          <w:hyperlink w:anchor="_Toc241757570" w:history="1">
-            <w:r>
-              <w:rPr>
-                <w:rStyle w:val="Hyperlink"/>
-                <w:noProof/>
-              </w:rPr>
-              <w:t>References</w:t>
-            </w:r>
-            <w:r>
-              <w:rPr>
-                <w:noProof/>
-              </w:rPr>
-              <w:tab/>
-            </w:r>
-            <w:r>
-              <w:rPr>
-                <w:noProof/>
-              </w:rPr>
-              <w:fldChar w:fldCharType="begin"/>
-            </w:r>
-            <w:r>
-              <w:rPr>
-                <w:noProof/>
-              </w:rPr>
-              <w:instrText xml:space="preserve"> PAGEREF _Toc241757570 \h </w:instrText>
-            </w:r>
-            <w:r>
-              <w:rPr>
-                <w:noProof/>
-              </w:rPr>
-            </w:r>
-            <w:r>
-              <w:rPr>
-                <w:noProof/>
-              </w:rPr>
-              <w:fldChar w:fldCharType="separate"/>
-            </w:r>
-            <w:r>
-              <w:rPr>
-                <w:noProof/>
-              </w:rPr>
-              <w:t>22</w:t>
+              <w:t>16</w:t>
             </w:r>
             <w:r>
               <w:rPr>
@@ -2216,7 +1652,7 @@
         <w:pStyle w:val="Heading1"/>
         <w:pageBreakBefore/>
       </w:pPr>
-      <w:bookmarkStart w:id="0" w:name="_Toc241757545"/>
+      <w:bookmarkStart w:id="0" w:name="_Toc241782119"/>
       <w:r>
         <w:lastRenderedPageBreak/>
         <w:t>Question 1: Netflix — From a Fragile Monolith to Resilient, Chaos-Tested Microservices</w:t>
@@ -2244,12 +1680,6 @@
         <w:gridCol w:w="9026"/>
       </w:tblGrid>
       <w:tr>
-        <w:tblPrEx>
-          <w:tblCellMar>
-            <w:top w:w="0" w:type="dxa"/>
-            <w:bottom w:w="0" w:type="dxa"/>
-          </w:tblCellMar>
-        </w:tblPrEx>
         <w:tc>
           <w:tcPr>
             <w:tcW w:w="9026" w:type="dxa"/>
@@ -2322,7 +1752,7 @@
       <w:pPr>
         <w:pStyle w:val="Heading2"/>
       </w:pPr>
-      <w:bookmarkStart w:id="1" w:name="_Toc241757546"/>
+      <w:bookmarkStart w:id="1" w:name="_Toc241782120"/>
       <w:r>
         <w:t>1.1 Introduction and Background</w:t>
       </w:r>
@@ -2400,7 +1830,7 @@
       <w:pPr>
         <w:pStyle w:val="Heading2"/>
       </w:pPr>
-      <w:bookmarkStart w:id="2" w:name="_Toc241757547"/>
+      <w:bookmarkStart w:id="2" w:name="_Toc241782121"/>
       <w:r>
         <w:t>1.2 Challenges Exposed by the 2008 Database Corruption</w:t>
       </w:r>
@@ -2645,7 +2075,7 @@
       <w:pPr>
         <w:pStyle w:val="Heading2"/>
       </w:pPr>
-      <w:bookmarkStart w:id="3" w:name="_Toc241757548"/>
+      <w:bookmarkStart w:id="3" w:name="_Toc241782122"/>
       <w:r>
         <w:t>1.3 The DevOps Solution</w:t>
       </w:r>
@@ -3361,7 +2791,7 @@
       <w:pPr>
         <w:pStyle w:val="Heading2"/>
       </w:pPr>
-      <w:bookmarkStart w:id="4" w:name="_Toc241757549"/>
+      <w:bookmarkStart w:id="4" w:name="_Toc241782123"/>
       <w:r>
         <w:t>1.4 Impact on Resilience and Scalability</w:t>
       </w:r>
@@ -3407,12 +2837,6 @@
         <w:gridCol w:w="3626"/>
       </w:tblGrid>
       <w:tr>
-        <w:tblPrEx>
-          <w:tblCellMar>
-            <w:top w:w="0" w:type="dxa"/>
-            <w:bottom w:w="0" w:type="dxa"/>
-          </w:tblCellMar>
-        </w:tblPrEx>
         <w:trPr>
           <w:tblHeader/>
         </w:trPr>
@@ -3520,12 +2944,6 @@
         </w:tc>
       </w:tr>
       <w:tr>
-        <w:tblPrEx>
-          <w:tblCellMar>
-            <w:top w:w="0" w:type="dxa"/>
-            <w:bottom w:w="0" w:type="dxa"/>
-          </w:tblCellMar>
-        </w:tblPrEx>
         <w:trPr>
           <w:cantSplit/>
         </w:trPr>
@@ -3624,12 +3042,6 @@
         </w:tc>
       </w:tr>
       <w:tr>
-        <w:tblPrEx>
-          <w:tblCellMar>
-            <w:top w:w="0" w:type="dxa"/>
-            <w:bottom w:w="0" w:type="dxa"/>
-          </w:tblCellMar>
-        </w:tblPrEx>
         <w:trPr>
           <w:cantSplit/>
         </w:trPr>
@@ -3728,12 +3140,6 @@
         </w:tc>
       </w:tr>
       <w:tr>
-        <w:tblPrEx>
-          <w:tblCellMar>
-            <w:top w:w="0" w:type="dxa"/>
-            <w:bottom w:w="0" w:type="dxa"/>
-          </w:tblCellMar>
-        </w:tblPrEx>
         <w:trPr>
           <w:cantSplit/>
         </w:trPr>
@@ -3832,12 +3238,6 @@
         </w:tc>
       </w:tr>
       <w:tr>
-        <w:tblPrEx>
-          <w:tblCellMar>
-            <w:top w:w="0" w:type="dxa"/>
-            <w:bottom w:w="0" w:type="dxa"/>
-          </w:tblCellMar>
-        </w:tblPrEx>
         <w:trPr>
           <w:cantSplit/>
         </w:trPr>
@@ -3936,12 +3336,6 @@
         </w:tc>
       </w:tr>
       <w:tr>
-        <w:tblPrEx>
-          <w:tblCellMar>
-            <w:top w:w="0" w:type="dxa"/>
-            <w:bottom w:w="0" w:type="dxa"/>
-          </w:tblCellMar>
-        </w:tblPrEx>
         <w:trPr>
           <w:cantSplit/>
         </w:trPr>
@@ -4040,12 +3434,6 @@
         </w:tc>
       </w:tr>
       <w:tr>
-        <w:tblPrEx>
-          <w:tblCellMar>
-            <w:top w:w="0" w:type="dxa"/>
-            <w:bottom w:w="0" w:type="dxa"/>
-          </w:tblCellMar>
-        </w:tblPrEx>
         <w:trPr>
           <w:cantSplit/>
         </w:trPr>
@@ -4376,7 +3764,7 @@
       <w:pPr>
         <w:pStyle w:val="Heading2"/>
       </w:pPr>
-      <w:bookmarkStart w:id="5" w:name="_Toc241757550"/>
+      <w:bookmarkStart w:id="5" w:name="_Toc241782124"/>
       <w:r>
         <w:t>1.5 Critical Analysis</w:t>
       </w:r>
@@ -4471,12 +3859,6 @@
         <w:gridCol w:w="9026"/>
       </w:tblGrid>
       <w:tr>
-        <w:tblPrEx>
-          <w:tblCellMar>
-            <w:top w:w="0" w:type="dxa"/>
-            <w:bottom w:w="0" w:type="dxa"/>
-          </w:tblCellMar>
-        </w:tblPrEx>
         <w:tc>
           <w:tcPr>
             <w:tcW w:w="9026" w:type="dxa"/>
@@ -4558,7 +3940,7 @@
       <w:pPr>
         <w:pStyle w:val="Heading2"/>
       </w:pPr>
-      <w:bookmarkStart w:id="6" w:name="_Toc241757551"/>
+      <w:bookmarkStart w:id="6" w:name="_Toc241782125"/>
       <w:r>
         <w:t>1.6 Conclusion</w:t>
       </w:r>
@@ -4570,10 +3952,7 @@
         <w:jc w:val="both"/>
       </w:pPr>
       <w:r>
-        <w:t>The 2008 database corruption exposed the core weaknesses of Netflix’s monolith: a single point of failure, tight coupling, vertical scaling limits, slow recovery and slow releases. By adopting DevOps principles — rebuilding as cloud-native microservices on AWS, giving teams end-to-end ownership, automating delivery, and pioneering Chaos Engineering — Netflix replaced fragility with resilience and rigid capacity with elastic, global scalability. Its practices and open-source tools have since become a referen</w:t>
-      </w:r>
-      <w:r>
-        <w:t>ce model for the entire industry.</w:t>
+        <w:t>The 2008 database corruption exposed the core weaknesses of Netflix’s monolith: a single point of failure, tight coupling, vertical scaling limits, slow recovery and slow releases. By adopting DevOps principles — rebuilding as cloud-native microservices on AWS, giving teams end-to-end ownership, automating delivery, and pioneering Chaos Engineering — Netflix replaced fragility with resilience and rigid capacity with elastic, global scalability. Its practices and open-source tools have since become a reference model for the entire industry.</w:t>
       </w:r>
     </w:p>
     <w:p>
@@ -4581,7 +3960,7 @@
         <w:pStyle w:val="Heading1"/>
         <w:pageBreakBefore/>
       </w:pPr>
-      <w:bookmarkStart w:id="7" w:name="_Toc241757552"/>
+      <w:bookmarkStart w:id="7" w:name="_Toc241782126"/>
       <w:r>
         <w:lastRenderedPageBreak/>
         <w:t>Question 2: Amazon — Two-Pizza Teams, Microservices and a Culture of Continuous Innovation</w:t>
@@ -4609,12 +3988,6 @@
         <w:gridCol w:w="9026"/>
       </w:tblGrid>
       <w:tr>
-        <w:tblPrEx>
-          <w:tblCellMar>
-            <w:top w:w="0" w:type="dxa"/>
-            <w:bottom w:w="0" w:type="dxa"/>
-          </w:tblCellMar>
-        </w:tblPrEx>
         <w:tc>
           <w:tcPr>
             <w:tcW w:w="9026" w:type="dxa"/>
@@ -4687,7 +4060,7 @@
       <w:pPr>
         <w:pStyle w:val="Heading2"/>
       </w:pPr>
-      <w:bookmarkStart w:id="8" w:name="_Toc241757553"/>
+      <w:bookmarkStart w:id="8" w:name="_Toc241782127"/>
       <w:r>
         <w:t>2.1 Introduction and Background</w:t>
       </w:r>
@@ -4726,7 +4099,7 @@
       <w:pPr>
         <w:pStyle w:val="Heading2"/>
       </w:pPr>
-      <w:bookmarkStart w:id="9" w:name="_Toc241757554"/>
+      <w:bookmarkStart w:id="9" w:name="_Toc241782128"/>
       <w:r>
         <w:t>2.2 Challenges of the Monolithic System</w:t>
       </w:r>
@@ -4997,12 +4370,6 @@
         <w:gridCol w:w="3726"/>
       </w:tblGrid>
       <w:tr>
-        <w:tblPrEx>
-          <w:tblCellMar>
-            <w:top w:w="0" w:type="dxa"/>
-            <w:bottom w:w="0" w:type="dxa"/>
-          </w:tblCellMar>
-        </w:tblPrEx>
         <w:trPr>
           <w:tblHeader/>
         </w:trPr>
@@ -5110,12 +4477,6 @@
         </w:tc>
       </w:tr>
       <w:tr>
-        <w:tblPrEx>
-          <w:tblCellMar>
-            <w:top w:w="0" w:type="dxa"/>
-            <w:bottom w:w="0" w:type="dxa"/>
-          </w:tblCellMar>
-        </w:tblPrEx>
         <w:trPr>
           <w:cantSplit/>
         </w:trPr>
@@ -5214,12 +4575,6 @@
         </w:tc>
       </w:tr>
       <w:tr>
-        <w:tblPrEx>
-          <w:tblCellMar>
-            <w:top w:w="0" w:type="dxa"/>
-            <w:bottom w:w="0" w:type="dxa"/>
-          </w:tblCellMar>
-        </w:tblPrEx>
         <w:trPr>
           <w:cantSplit/>
         </w:trPr>
@@ -5318,12 +4673,6 @@
         </w:tc>
       </w:tr>
       <w:tr>
-        <w:tblPrEx>
-          <w:tblCellMar>
-            <w:top w:w="0" w:type="dxa"/>
-            <w:bottom w:w="0" w:type="dxa"/>
-          </w:tblCellMar>
-        </w:tblPrEx>
         <w:trPr>
           <w:cantSplit/>
         </w:trPr>
@@ -5422,12 +4771,6 @@
         </w:tc>
       </w:tr>
       <w:tr>
-        <w:tblPrEx>
-          <w:tblCellMar>
-            <w:top w:w="0" w:type="dxa"/>
-            <w:bottom w:w="0" w:type="dxa"/>
-          </w:tblCellMar>
-        </w:tblPrEx>
         <w:trPr>
           <w:cantSplit/>
         </w:trPr>
@@ -5535,7 +4878,7 @@
       <w:pPr>
         <w:pStyle w:val="Heading2"/>
       </w:pPr>
-      <w:bookmarkStart w:id="10" w:name="_Toc241757555"/>
+      <w:bookmarkStart w:id="10" w:name="_Toc241782129"/>
       <w:r>
         <w:t>2.3 Amazon’s Solution</w:t>
       </w:r>
@@ -5976,7 +5319,7 @@
       <w:pPr>
         <w:pStyle w:val="Heading2"/>
       </w:pPr>
-      <w:bookmarkStart w:id="11" w:name="_Toc241757556"/>
+      <w:bookmarkStart w:id="11" w:name="_Toc241782130"/>
       <w:r>
         <w:t>2.4 How the Shift Directly Solved the Monolith’s Problems</w:t>
       </w:r>
@@ -6022,12 +5365,6 @@
         <w:gridCol w:w="3226"/>
       </w:tblGrid>
       <w:tr>
-        <w:tblPrEx>
-          <w:tblCellMar>
-            <w:top w:w="0" w:type="dxa"/>
-            <w:bottom w:w="0" w:type="dxa"/>
-          </w:tblCellMar>
-        </w:tblPrEx>
         <w:trPr>
           <w:tblHeader/>
         </w:trPr>
@@ -6135,12 +5472,6 @@
         </w:tc>
       </w:tr>
       <w:tr>
-        <w:tblPrEx>
-          <w:tblCellMar>
-            <w:top w:w="0" w:type="dxa"/>
-            <w:bottom w:w="0" w:type="dxa"/>
-          </w:tblCellMar>
-        </w:tblPrEx>
         <w:trPr>
           <w:cantSplit/>
         </w:trPr>
@@ -6239,12 +5570,6 @@
         </w:tc>
       </w:tr>
       <w:tr>
-        <w:tblPrEx>
-          <w:tblCellMar>
-            <w:top w:w="0" w:type="dxa"/>
-            <w:bottom w:w="0" w:type="dxa"/>
-          </w:tblCellMar>
-        </w:tblPrEx>
         <w:trPr>
           <w:cantSplit/>
         </w:trPr>
@@ -6343,12 +5668,6 @@
         </w:tc>
       </w:tr>
       <w:tr>
-        <w:tblPrEx>
-          <w:tblCellMar>
-            <w:top w:w="0" w:type="dxa"/>
-            <w:bottom w:w="0" w:type="dxa"/>
-          </w:tblCellMar>
-        </w:tblPrEx>
         <w:trPr>
           <w:cantSplit/>
         </w:trPr>
@@ -6447,12 +5766,6 @@
         </w:tc>
       </w:tr>
       <w:tr>
-        <w:tblPrEx>
-          <w:tblCellMar>
-            <w:top w:w="0" w:type="dxa"/>
-            <w:bottom w:w="0" w:type="dxa"/>
-          </w:tblCellMar>
-        </w:tblPrEx>
         <w:trPr>
           <w:cantSplit/>
         </w:trPr>
@@ -6551,12 +5864,6 @@
         </w:tc>
       </w:tr>
       <w:tr>
-        <w:tblPrEx>
-          <w:tblCellMar>
-            <w:top w:w="0" w:type="dxa"/>
-            <w:bottom w:w="0" w:type="dxa"/>
-          </w:tblCellMar>
-        </w:tblPrEx>
         <w:trPr>
           <w:cantSplit/>
         </w:trPr>
@@ -6655,12 +5962,6 @@
         </w:tc>
       </w:tr>
       <w:tr>
-        <w:tblPrEx>
-          <w:tblCellMar>
-            <w:top w:w="0" w:type="dxa"/>
-            <w:bottom w:w="0" w:type="dxa"/>
-          </w:tblCellMar>
-        </w:tblPrEx>
         <w:trPr>
           <w:cantSplit/>
         </w:trPr>
@@ -6768,7 +6069,7 @@
       <w:pPr>
         <w:pStyle w:val="Heading2"/>
       </w:pPr>
-      <w:bookmarkStart w:id="12" w:name="_Toc241757557"/>
+      <w:bookmarkStart w:id="12" w:name="_Toc241782131"/>
       <w:r>
         <w:t>2.5 Fostering a Culture of Continuous Innovation (Deploying Every 11.7 Seconds)</w:t>
       </w:r>
@@ -7105,12 +6406,6 @@
         <w:gridCol w:w="9026"/>
       </w:tblGrid>
       <w:tr>
-        <w:tblPrEx>
-          <w:tblCellMar>
-            <w:top w:w="0" w:type="dxa"/>
-            <w:bottom w:w="0" w:type="dxa"/>
-          </w:tblCellMar>
-        </w:tblPrEx>
         <w:tc>
           <w:tcPr>
             <w:tcW w:w="9026" w:type="dxa"/>
@@ -7162,7 +6457,7 @@
       <w:pPr>
         <w:pStyle w:val="Heading2"/>
       </w:pPr>
-      <w:bookmarkStart w:id="13" w:name="_Toc241757558"/>
+      <w:bookmarkStart w:id="13" w:name="_Toc241782132"/>
       <w:r>
         <w:t>2.6 Critical Analysis</w:t>
       </w:r>
@@ -7245,7 +6540,7 @@
       <w:pPr>
         <w:pStyle w:val="Heading2"/>
       </w:pPr>
-      <w:bookmarkStart w:id="14" w:name="_Toc241757559"/>
+      <w:bookmarkStart w:id="14" w:name="_Toc241782133"/>
       <w:r>
         <w:t>2.7 Conclusion</w:t>
       </w:r>
@@ -7257,10 +6552,7 @@
         <w:jc w:val="both"/>
       </w:pPr>
       <w:r>
-        <w:t>Amazon’s monolith caused frequent outages and slow releases because everything was coupled — code, data, releases and people. By adopting a service-oriented / microservices architecture and reorganising into two-pizza teams that own their services end-to-end, Amazon decoupled all four. Combined with automated deployment pipelines and a culture of ownership, experimentation and blameless learning, this shift created a self-reinforcing flywheel of continuous innovation — the foundation that made deployments e</w:t>
-      </w:r>
-      <w:r>
-        <w:t>very ~11.7 seconds possible and, ultimately, gave birth to AWS.</w:t>
+        <w:t>Amazon’s monolith caused frequent outages and slow releases because everything was coupled — code, data, releases and people. By adopting a service-oriented / microservices architecture and reorganising into two-pizza teams that own their services end-to-end, Amazon decoupled all four. Combined with automated deployment pipelines and a culture of ownership, experimentation and blameless learning, this shift created a self-reinforcing flywheel of continuous innovation — the foundation that made deployments every ~11.7 seconds possible and, ultimately, gave birth to AWS.</w:t>
       </w:r>
     </w:p>
     <w:p>
@@ -7268,117 +6560,12 @@
         <w:pStyle w:val="Heading1"/>
         <w:pageBreakBefore/>
       </w:pPr>
-      <w:bookmarkStart w:id="15" w:name="_Toc241757560"/>
+      <w:bookmarkStart w:id="15" w:name="_Toc241782134"/>
       <w:r>
         <w:lastRenderedPageBreak/>
-        <w:t>Question 3: Capital One — DevSecOps and “Shift-Left” Security in a Regulated Bank</w:t>
+        <w:t>Comparative Summary</w:t>
       </w:r>
       <w:bookmarkEnd w:id="15"/>
-    </w:p>
-    <w:tbl>
-      <w:tblPr>
-        <w:tblW w:w="9026" w:type="dxa"/>
-        <w:tblBorders>
-          <w:top w:val="single" w:sz="4" w:space="0" w:color="auto"/>
-          <w:left w:val="single" w:sz="4" w:space="0" w:color="auto"/>
-          <w:bottom w:val="single" w:sz="4" w:space="0" w:color="auto"/>
-          <w:right w:val="single" w:sz="4" w:space="0" w:color="auto"/>
-          <w:insideH w:val="single" w:sz="4" w:space="0" w:color="auto"/>
-          <w:insideV w:val="single" w:sz="4" w:space="0" w:color="auto"/>
-        </w:tblBorders>
-        <w:tblCellMar>
-          <w:left w:w="10" w:type="dxa"/>
-          <w:right w:w="10" w:type="dxa"/>
-        </w:tblCellMar>
-        <w:tblLook w:val="04A0" w:firstRow="1" w:lastRow="0" w:firstColumn="1" w:lastColumn="0" w:noHBand="0" w:noVBand="1"/>
-      </w:tblPr>
-      <w:tblGrid>
-        <w:gridCol w:w="9026"/>
-      </w:tblGrid>
-      <w:tr>
-        <w:tblPrEx>
-          <w:tblCellMar>
-            <w:top w:w="0" w:type="dxa"/>
-            <w:bottom w:w="0" w:type="dxa"/>
-          </w:tblCellMar>
-        </w:tblPrEx>
-        <w:tc>
-          <w:tcPr>
-            <w:tcW w:w="9026" w:type="dxa"/>
-            <w:tcBorders>
-              <w:top w:val="none" w:sz="0" w:space="0" w:color="FFFFFF"/>
-              <w:left w:val="single" w:sz="24" w:space="0" w:color="1F3864"/>
-              <w:bottom w:val="none" w:sz="0" w:space="0" w:color="FFFFFF"/>
-              <w:right w:val="none" w:sz="0" w:space="0" w:color="FFFFFF"/>
-            </w:tcBorders>
-            <w:shd w:val="clear" w:color="auto" w:fill="EAF1FB"/>
-            <w:tcMar>
-              <w:top w:w="140" w:type="dxa"/>
-              <w:left w:w="220" w:type="dxa"/>
-              <w:bottom w:w="140" w:type="dxa"/>
-              <w:right w:w="220" w:type="dxa"/>
-            </w:tcMar>
-          </w:tcPr>
-          <w:p>
-            <w:pPr>
-              <w:spacing w:after="80"/>
-            </w:pPr>
-            <w:r>
-              <w:rPr>
-                <w:b/>
-                <w:bCs/>
-                <w:color w:val="1F3864"/>
-              </w:rPr>
-              <w:t>Question 3 (5 marks)</w:t>
-            </w:r>
-          </w:p>
-          <w:p>
-            <w:pPr>
-              <w:spacing w:after="80" w:line="264" w:lineRule="auto"/>
-              <w:jc w:val="both"/>
-            </w:pPr>
-            <w:r>
-              <w:rPr>
-                <w:i/>
-                <w:iCs/>
-                <w:sz w:val="21"/>
-                <w:szCs w:val="21"/>
-              </w:rPr>
-              <w:t>Challenge: As a highly regulated financial institution, Capital One struggled with long release cycles (6–9 months) and the need to innovate in an increasingly digital market while maintaining stringent security and compliance standards.</w:t>
-            </w:r>
-          </w:p>
-          <w:p>
-            <w:pPr>
-              <w:spacing w:after="80" w:line="264" w:lineRule="auto"/>
-              <w:jc w:val="both"/>
-            </w:pPr>
-            <w:r>
-              <w:rPr>
-                <w:i/>
-                <w:iCs/>
-                <w:sz w:val="21"/>
-                <w:szCs w:val="21"/>
-              </w:rPr>
-              <w:t>Brainstorm: How did Capital One’s “DevSecOps” approach, particularly the “shift-left” mentality and automated security scanning, address the dual challenges of long release cycles and stringent regulatory compliance? How can embedding security into the development pipeline, rather than treating it as a final gate, actually accelerate innovation and reduce production incidents in a highly regulated industry like finance?</w:t>
-            </w:r>
-          </w:p>
-        </w:tc>
-      </w:tr>
-    </w:tbl>
-    <w:p>
-      <w:pPr>
-        <w:spacing w:after="120"/>
-      </w:pPr>
-    </w:p>
-    <w:p>
-      <w:pPr>
-        <w:pStyle w:val="Heading2"/>
-      </w:pPr>
-      <w:bookmarkStart w:id="16" w:name="_Toc241757561"/>
-      <w:r>
-        <w:t>3.1 Introduction and Background</w:t>
-      </w:r>
-      <w:bookmarkEnd w:id="16"/>
     </w:p>
     <w:p>
       <w:pPr>
@@ -7386,1106 +6573,7 @@
         <w:jc w:val="both"/>
       </w:pPr>
       <w:r>
-        <w:t xml:space="preserve">Capital One is one of the largest banks in the United States, best known for credit cards and consumer banking. As a bank it operates under strict regulation and supervision — for example by the Office of the Comptroller of the Currency (OCC) and the Federal Reserve — and must comply with standards such as </w:t>
-      </w:r>
-      <w:r>
-        <w:rPr>
-          <w:b/>
-          <w:bCs/>
-        </w:rPr>
-        <w:t>PCI DSS</w:t>
-      </w:r>
-      <w:r>
-        <w:t xml:space="preserve"> (card data), </w:t>
-      </w:r>
-      <w:r>
-        <w:rPr>
-          <w:b/>
-          <w:bCs/>
-        </w:rPr>
-        <w:t>SOX</w:t>
-      </w:r>
-      <w:r>
-        <w:t xml:space="preserve"> (financial reporting controls) and </w:t>
-      </w:r>
-      <w:r>
-        <w:rPr>
-          <w:b/>
-          <w:bCs/>
-        </w:rPr>
-        <w:t>GLBA</w:t>
-      </w:r>
-      <w:r>
-        <w:t xml:space="preserve"> (customer privacy). Like most banks, it traditionally relied on waterfall processes, outsourced IT and manual controls, which resulted in </w:t>
-      </w:r>
-      <w:r>
-        <w:rPr>
-          <w:b/>
-          <w:bCs/>
-        </w:rPr>
-        <w:t>release cycles of 6–9 months</w:t>
-      </w:r>
-      <w:r>
-        <w:t>.</w:t>
-      </w:r>
-    </w:p>
-    <w:p>
-      <w:pPr>
-        <w:spacing w:after="140" w:line="276" w:lineRule="auto"/>
-        <w:jc w:val="both"/>
-      </w:pPr>
-      <w:r>
-        <w:t xml:space="preserve">During the 2010s, facing fintech challengers and customers who expected modern mobile banking, Capital One decided to compete as a </w:t>
-      </w:r>
-      <w:r>
-        <w:rPr>
-          <w:b/>
-          <w:bCs/>
-        </w:rPr>
-        <w:t>technology company that does banking</w:t>
-      </w:r>
-      <w:r>
-        <w:t xml:space="preserve">. It brought software engineering in-house, hired thousands of engineers, adopted Agile and DevOps, and moved to the public cloud on AWS, closing its own data centres in 2020. The central question was how to go much faster </w:t>
-      </w:r>
-      <w:r>
-        <w:rPr>
-          <w:b/>
-          <w:bCs/>
-        </w:rPr>
-        <w:t>without</w:t>
-      </w:r>
-      <w:r>
-        <w:t xml:space="preserve"> weakening security or compliance. Its answer was </w:t>
-      </w:r>
-      <w:r>
-        <w:rPr>
-          <w:b/>
-          <w:bCs/>
-        </w:rPr>
-        <w:t>DevSecOps</w:t>
-      </w:r>
-      <w:r>
-        <w:t>.</w:t>
-      </w:r>
-    </w:p>
-    <w:p>
-      <w:pPr>
-        <w:pStyle w:val="Heading2"/>
-      </w:pPr>
-      <w:bookmarkStart w:id="17" w:name="_Toc241757562"/>
-      <w:r>
-        <w:t>3.2 The Dual Challenge: Speed versus Security and Compliance</w:t>
-      </w:r>
-      <w:bookmarkEnd w:id="17"/>
-    </w:p>
-    <w:p>
-      <w:pPr>
-        <w:pStyle w:val="ListParagraph"/>
-        <w:numPr>
-          <w:ilvl w:val="0"/>
-          <w:numId w:val="3"/>
-        </w:numPr>
-        <w:spacing w:after="80" w:line="264" w:lineRule="auto"/>
-        <w:jc w:val="both"/>
-      </w:pPr>
-      <w:r>
-        <w:rPr>
-          <w:b/>
-          <w:bCs/>
-        </w:rPr>
-        <w:t>Long release cycles (6–9 months):</w:t>
-      </w:r>
-      <w:r>
-        <w:t xml:space="preserve"> large batches of changes moved through sequential hand-offs between business, development, QA, security and operations, with manual Change Advisory Board (CAB) approvals.</w:t>
-      </w:r>
-    </w:p>
-    <w:p>
-      <w:pPr>
-        <w:pStyle w:val="ListParagraph"/>
-        <w:numPr>
-          <w:ilvl w:val="0"/>
-          <w:numId w:val="3"/>
-        </w:numPr>
-        <w:spacing w:after="80" w:line="264" w:lineRule="auto"/>
-        <w:jc w:val="both"/>
-      </w:pPr>
-      <w:r>
-        <w:rPr>
-          <w:b/>
-          <w:bCs/>
-        </w:rPr>
-        <w:t>Security as a final gate:</w:t>
-      </w:r>
-      <w:r>
-        <w:t xml:space="preserve"> security reviews and penetration tests happened at the end. Vulnerabilities were discovered late, causing expensive rework and release delays, and the small security team became a bottleneck for many development teams.</w:t>
-      </w:r>
-    </w:p>
-    <w:p>
-      <w:pPr>
-        <w:pStyle w:val="ListParagraph"/>
-        <w:numPr>
-          <w:ilvl w:val="0"/>
-          <w:numId w:val="3"/>
-        </w:numPr>
-        <w:spacing w:after="80" w:line="264" w:lineRule="auto"/>
-        <w:jc w:val="both"/>
-      </w:pPr>
-      <w:r>
-        <w:rPr>
-          <w:b/>
-          <w:bCs/>
-        </w:rPr>
-        <w:t>Manual compliance evidence:</w:t>
-      </w:r>
-      <w:r>
-        <w:t xml:space="preserve"> auditors require proof of controls such as segregation of duties, approvals and test results. Collecting this evidence by hand through documents and tickets was slow and error-prone.</w:t>
-      </w:r>
-    </w:p>
-    <w:p>
-      <w:pPr>
-        <w:pStyle w:val="ListParagraph"/>
-        <w:numPr>
-          <w:ilvl w:val="0"/>
-          <w:numId w:val="3"/>
-        </w:numPr>
-        <w:spacing w:after="80" w:line="264" w:lineRule="auto"/>
-        <w:jc w:val="both"/>
-      </w:pPr>
-      <w:r>
-        <w:rPr>
-          <w:b/>
-          <w:bCs/>
-        </w:rPr>
-        <w:t>High-risk “big-bang” releases:</w:t>
-      </w:r>
-      <w:r>
-        <w:t xml:space="preserve"> bundling hundreds of changes into one release made failures more likely and harder to diagnose, creating a culture of fear around change.</w:t>
-      </w:r>
-    </w:p>
-    <w:p>
-      <w:pPr>
-        <w:pStyle w:val="ListParagraph"/>
-        <w:numPr>
-          <w:ilvl w:val="0"/>
-          <w:numId w:val="3"/>
-        </w:numPr>
-        <w:spacing w:after="80" w:line="264" w:lineRule="auto"/>
-        <w:jc w:val="both"/>
-      </w:pPr>
-      <w:r>
-        <w:rPr>
-          <w:b/>
-          <w:bCs/>
-        </w:rPr>
-        <w:t>A perceived trade-off:</w:t>
-      </w:r>
-      <w:r>
-        <w:t xml:space="preserve"> the traditional belief in banking was that going faster necessarily means being less safe.</w:t>
-      </w:r>
-    </w:p>
-    <w:p>
-      <w:pPr>
-        <w:keepNext/>
-        <w:spacing w:before="160" w:after="60"/>
-        <w:jc w:val="center"/>
-      </w:pPr>
-      <w:r>
-        <w:rPr>
-          <w:noProof/>
-        </w:rPr>
-        <w:lastRenderedPageBreak/>
-        <w:drawing>
-          <wp:inline distT="0" distB="0" distL="0" distR="0" wp14:anchorId="154F445B" wp14:editId="1CFE1A59">
-            <wp:extent cx="5715000" cy="3857625"/>
-            <wp:effectExtent l="0" t="0" r="0" b="0"/>
-            <wp:docPr id="9" name="q3_shift_left.png" descr="Traditional ‘security as a final gate’ (top) versus DevSecOps shift-left security embedded at every stage (bottom)." title="Traditional ‘security as a final gate’ (top) versus DevSecOps shift-left security embedded at every stage (bottom)."/>
-            <wp:cNvGraphicFramePr>
-              <a:graphicFrameLocks xmlns:a="http://schemas.openxmlformats.org/drawingml/2006/main" noChangeAspect="1"/>
-            </wp:cNvGraphicFramePr>
-            <a:graphic xmlns:a="http://schemas.openxmlformats.org/drawingml/2006/main">
-              <a:graphicData uri="http://schemas.openxmlformats.org/drawingml/2006/picture">
-                <pic:pic xmlns:pic="http://schemas.openxmlformats.org/drawingml/2006/picture">
-                  <pic:nvPicPr>
-                    <pic:cNvPr id="0" name=""/>
-                    <pic:cNvPicPr>
-                      <a:picLocks noChangeAspect="1" noChangeArrowheads="1"/>
-                    </pic:cNvPicPr>
-                  </pic:nvPicPr>
-                  <pic:blipFill>
-                    <a:blip r:embed="rId15"/>
-                    <a:srcRect/>
-                    <a:stretch>
-                      <a:fillRect/>
-                    </a:stretch>
-                  </pic:blipFill>
-                  <pic:spPr bwMode="auto">
-                    <a:xfrm>
-                      <a:off x="0" y="0"/>
-                      <a:ext cx="5715000" cy="3857625"/>
-                    </a:xfrm>
-                    <a:prstGeom prst="rect">
-                      <a:avLst/>
-                    </a:prstGeom>
-                  </pic:spPr>
-                </pic:pic>
-              </a:graphicData>
-            </a:graphic>
-          </wp:inline>
-        </w:drawing>
-      </w:r>
-    </w:p>
-    <w:p>
-      <w:pPr>
-        <w:spacing w:after="220"/>
-        <w:jc w:val="center"/>
-      </w:pPr>
-      <w:r>
-        <w:rPr>
-          <w:b/>
-          <w:bCs/>
-          <w:i/>
-          <w:iCs/>
-          <w:color w:val="595959"/>
-          <w:sz w:val="19"/>
-          <w:szCs w:val="19"/>
-        </w:rPr>
-        <w:t xml:space="preserve">Figure 3.1: </w:t>
-      </w:r>
-      <w:r>
-        <w:rPr>
-          <w:i/>
-          <w:iCs/>
-          <w:color w:val="595959"/>
-          <w:sz w:val="19"/>
-          <w:szCs w:val="19"/>
-        </w:rPr>
-        <w:t>Traditional ‘security as a final gate’ (top) versus DevSecOps shift-left security embedded at every stage (bottom).</w:t>
-      </w:r>
-    </w:p>
-    <w:p>
-      <w:pPr>
-        <w:pStyle w:val="Heading2"/>
-      </w:pPr>
-      <w:bookmarkStart w:id="18" w:name="_Toc241757563"/>
-      <w:r>
-        <w:t>3.3 Capital One’s DevSecOps Approach</w:t>
-      </w:r>
-      <w:bookmarkEnd w:id="18"/>
-    </w:p>
-    <w:p>
-      <w:pPr>
-        <w:pStyle w:val="Heading3"/>
-      </w:pPr>
-      <w:r>
-        <w:t>3.3.1 The “Shift-Left” Mentality</w:t>
-      </w:r>
-    </w:p>
-    <w:p>
-      <w:pPr>
-        <w:spacing w:after="140" w:line="276" w:lineRule="auto"/>
-        <w:jc w:val="both"/>
-      </w:pPr>
-      <w:r>
-        <w:t xml:space="preserve">“Shift-left” means moving security and compliance activities to the </w:t>
-      </w:r>
-      <w:r>
-        <w:rPr>
-          <w:b/>
-          <w:bCs/>
-        </w:rPr>
-        <w:t>earliest possible point</w:t>
-      </w:r>
-      <w:r>
-        <w:t xml:space="preserve"> in the software lifecycle (to the left on a timeline that runs from design to production) and making them a </w:t>
-      </w:r>
-      <w:r>
-        <w:rPr>
-          <w:b/>
-          <w:bCs/>
-        </w:rPr>
-        <w:t>continuous responsibility of the delivery team</w:t>
-      </w:r>
-      <w:r>
-        <w:t>, rather than a one-time inspection by a separate team at the end. In practice this includes:</w:t>
-      </w:r>
-    </w:p>
-    <w:p>
-      <w:pPr>
-        <w:pStyle w:val="ListParagraph"/>
-        <w:numPr>
-          <w:ilvl w:val="0"/>
-          <w:numId w:val="3"/>
-        </w:numPr>
-        <w:spacing w:after="80" w:line="264" w:lineRule="auto"/>
-        <w:jc w:val="both"/>
-      </w:pPr>
-      <w:r>
-        <w:rPr>
-          <w:b/>
-          <w:bCs/>
-        </w:rPr>
-        <w:t>Security requirements and threat modelling</w:t>
-      </w:r>
-      <w:r>
-        <w:t xml:space="preserve"> during planning and design, so that risks are designed out rather than patched later.</w:t>
-      </w:r>
-    </w:p>
-    <w:p>
-      <w:pPr>
-        <w:pStyle w:val="ListParagraph"/>
-        <w:numPr>
-          <w:ilvl w:val="0"/>
-          <w:numId w:val="3"/>
-        </w:numPr>
-        <w:spacing w:after="80" w:line="264" w:lineRule="auto"/>
-        <w:jc w:val="both"/>
-      </w:pPr>
-      <w:r>
-        <w:rPr>
-          <w:b/>
-          <w:bCs/>
-        </w:rPr>
-        <w:t>Secure-coding training and “security champions”</w:t>
-      </w:r>
-      <w:r>
-        <w:t xml:space="preserve"> inside development teams, with security engineers acting as partners and enablers rather than gatekeepers.</w:t>
-      </w:r>
-    </w:p>
-    <w:p>
-      <w:pPr>
-        <w:pStyle w:val="ListParagraph"/>
-        <w:numPr>
-          <w:ilvl w:val="0"/>
-          <w:numId w:val="3"/>
-        </w:numPr>
-        <w:spacing w:after="80" w:line="264" w:lineRule="auto"/>
-        <w:jc w:val="both"/>
-      </w:pPr>
-      <w:r>
-        <w:rPr>
-          <w:b/>
-          <w:bCs/>
-        </w:rPr>
-        <w:t>Developer-side tooling:</w:t>
-      </w:r>
-      <w:r>
-        <w:t xml:space="preserve"> IDE security plug-ins, pre-commit hooks for </w:t>
-      </w:r>
-      <w:r>
-        <w:rPr>
-          <w:b/>
-          <w:bCs/>
-        </w:rPr>
-        <w:t>secrets detection</w:t>
-      </w:r>
-      <w:r>
-        <w:t xml:space="preserve"> and mandatory peer review, so many issues are caught before code is even merged.</w:t>
-      </w:r>
-    </w:p>
-    <w:p>
-      <w:pPr>
-        <w:pStyle w:val="ListParagraph"/>
-        <w:numPr>
-          <w:ilvl w:val="0"/>
-          <w:numId w:val="3"/>
-        </w:numPr>
-        <w:spacing w:after="80" w:line="264" w:lineRule="auto"/>
-        <w:jc w:val="both"/>
-      </w:pPr>
-      <w:r>
-        <w:rPr>
-          <w:b/>
-          <w:bCs/>
-        </w:rPr>
-        <w:t>Pre-approved secure templates (“paved roads”):</w:t>
-      </w:r>
-      <w:r>
-        <w:t xml:space="preserve"> reusable, security-reviewed infrastructure and application patterns that teams can adopt without a fresh review each time.</w:t>
-      </w:r>
-    </w:p>
-    <w:p>
-      <w:pPr>
-        <w:pStyle w:val="Heading3"/>
-      </w:pPr>
-      <w:r>
-        <w:t>3.3.2 Automated Security Scanning in the CI/CD Pipeline</w:t>
-      </w:r>
-    </w:p>
-    <w:p>
-      <w:pPr>
-        <w:spacing w:after="140" w:line="276" w:lineRule="auto"/>
-        <w:jc w:val="both"/>
-      </w:pPr>
-      <w:r>
-        <w:t xml:space="preserve">Capital One standardised its delivery pipelines and defined a set of mandatory, automated quality and security </w:t>
-      </w:r>
-      <w:r>
-        <w:rPr>
-          <w:b/>
-          <w:bCs/>
-        </w:rPr>
-        <w:t>“gates”</w:t>
-      </w:r>
-      <w:r>
-        <w:t xml:space="preserve"> that every application must pass before reaching production (its engineering blog described sixteen such gates). Examples include:</w:t>
-      </w:r>
-    </w:p>
-    <w:p>
-      <w:pPr>
-        <w:pStyle w:val="ListParagraph"/>
-        <w:numPr>
-          <w:ilvl w:val="0"/>
-          <w:numId w:val="3"/>
-        </w:numPr>
-        <w:spacing w:after="80" w:line="264" w:lineRule="auto"/>
-        <w:jc w:val="both"/>
-      </w:pPr>
-      <w:r>
-        <w:rPr>
-          <w:b/>
-          <w:bCs/>
-        </w:rPr>
-        <w:t>Static Application Security Testing (SAST)</w:t>
-      </w:r>
-      <w:r>
-        <w:t xml:space="preserve"> on every commit to find insecure code patterns.</w:t>
-      </w:r>
-    </w:p>
-    <w:p>
-      <w:pPr>
-        <w:pStyle w:val="ListParagraph"/>
-        <w:numPr>
-          <w:ilvl w:val="0"/>
-          <w:numId w:val="3"/>
-        </w:numPr>
-        <w:spacing w:after="80" w:line="264" w:lineRule="auto"/>
-        <w:jc w:val="both"/>
-      </w:pPr>
-      <w:r>
-        <w:rPr>
-          <w:b/>
-          <w:bCs/>
-        </w:rPr>
-        <w:lastRenderedPageBreak/>
-        <w:t>Software Composition Analysis (SCA) / open-source scanning</w:t>
-      </w:r>
-      <w:r>
-        <w:t xml:space="preserve"> to detect vulnerable or badly licensed third-party libraries — essential, because most modern applications are built largely from open-source components.</w:t>
-      </w:r>
-    </w:p>
-    <w:p>
-      <w:pPr>
-        <w:pStyle w:val="ListParagraph"/>
-        <w:numPr>
-          <w:ilvl w:val="0"/>
-          <w:numId w:val="3"/>
-        </w:numPr>
-        <w:spacing w:after="80" w:line="264" w:lineRule="auto"/>
-        <w:jc w:val="both"/>
-      </w:pPr>
-      <w:r>
-        <w:rPr>
-          <w:b/>
-          <w:bCs/>
-        </w:rPr>
-        <w:t>Code-coverage thresholds</w:t>
-      </w:r>
-      <w:r>
-        <w:t xml:space="preserve"> (for example, above 80% unit-test coverage), integration and performance testing.</w:t>
-      </w:r>
-    </w:p>
-    <w:p>
-      <w:pPr>
-        <w:pStyle w:val="ListParagraph"/>
-        <w:numPr>
-          <w:ilvl w:val="0"/>
-          <w:numId w:val="3"/>
-        </w:numPr>
-        <w:spacing w:after="80" w:line="264" w:lineRule="auto"/>
-        <w:jc w:val="both"/>
-      </w:pPr>
-      <w:r>
-        <w:rPr>
-          <w:b/>
-          <w:bCs/>
-        </w:rPr>
-        <w:t>Dynamic Application Security Testing (DAST)</w:t>
-      </w:r>
-      <w:r>
-        <w:t xml:space="preserve"> against the running application in a test environment.</w:t>
-      </w:r>
-    </w:p>
-    <w:p>
-      <w:pPr>
-        <w:pStyle w:val="ListParagraph"/>
-        <w:numPr>
-          <w:ilvl w:val="0"/>
-          <w:numId w:val="3"/>
-        </w:numPr>
-        <w:spacing w:after="80" w:line="264" w:lineRule="auto"/>
-        <w:jc w:val="both"/>
-      </w:pPr>
-      <w:r>
-        <w:rPr>
-          <w:b/>
-          <w:bCs/>
-        </w:rPr>
-        <w:t>Immutable servers, automated provisioning and zero-downtime deployment with automated rollback</w:t>
-      </w:r>
-      <w:r>
-        <w:t>, so production is never changed by hand.</w:t>
-      </w:r>
-    </w:p>
-    <w:p>
-      <w:pPr>
-        <w:spacing w:after="140" w:line="276" w:lineRule="auto"/>
-        <w:jc w:val="both"/>
-      </w:pPr>
-      <w:r>
-        <w:t>If any gate fails, the pipeline stops and the developer receives feedback within minutes, while the change is still small and fresh in their mind.</w:t>
-      </w:r>
-    </w:p>
-    <w:p>
-      <w:pPr>
-        <w:keepNext/>
-        <w:spacing w:before="160" w:after="60"/>
-        <w:jc w:val="center"/>
-      </w:pPr>
-      <w:r>
-        <w:rPr>
-          <w:noProof/>
-        </w:rPr>
-        <w:drawing>
-          <wp:inline distT="0" distB="0" distL="0" distR="0" wp14:anchorId="5B458027" wp14:editId="14523E60">
-            <wp:extent cx="5715000" cy="4076700"/>
-            <wp:effectExtent l="0" t="0" r="0" b="0"/>
-            <wp:docPr id="10" name="q3_pipeline.png" descr="A DevSecOps delivery pipeline: automated security and compliance checks at every stage, each acting as a gate." title="A DevSecOps delivery pipeline: automated security and compliance checks at every stage, each acting as a gate."/>
-            <wp:cNvGraphicFramePr>
-              <a:graphicFrameLocks xmlns:a="http://schemas.openxmlformats.org/drawingml/2006/main" noChangeAspect="1"/>
-            </wp:cNvGraphicFramePr>
-            <a:graphic xmlns:a="http://schemas.openxmlformats.org/drawingml/2006/main">
-              <a:graphicData uri="http://schemas.openxmlformats.org/drawingml/2006/picture">
-                <pic:pic xmlns:pic="http://schemas.openxmlformats.org/drawingml/2006/picture">
-                  <pic:nvPicPr>
-                    <pic:cNvPr id="0" name=""/>
-                    <pic:cNvPicPr>
-                      <a:picLocks noChangeAspect="1" noChangeArrowheads="1"/>
-                    </pic:cNvPicPr>
-                  </pic:nvPicPr>
-                  <pic:blipFill>
-                    <a:blip r:embed="rId16"/>
-                    <a:srcRect/>
-                    <a:stretch>
-                      <a:fillRect/>
-                    </a:stretch>
-                  </pic:blipFill>
-                  <pic:spPr bwMode="auto">
-                    <a:xfrm>
-                      <a:off x="0" y="0"/>
-                      <a:ext cx="5715000" cy="4076700"/>
-                    </a:xfrm>
-                    <a:prstGeom prst="rect">
-                      <a:avLst/>
-                    </a:prstGeom>
-                  </pic:spPr>
-                </pic:pic>
-              </a:graphicData>
-            </a:graphic>
-          </wp:inline>
-        </w:drawing>
-      </w:r>
-    </w:p>
-    <w:p>
-      <w:pPr>
-        <w:spacing w:after="220"/>
-        <w:jc w:val="center"/>
-      </w:pPr>
-      <w:r>
-        <w:rPr>
-          <w:b/>
-          <w:bCs/>
-          <w:i/>
-          <w:iCs/>
-          <w:color w:val="595959"/>
-          <w:sz w:val="19"/>
-          <w:szCs w:val="19"/>
-        </w:rPr>
-        <w:t xml:space="preserve">Figure 3.2: </w:t>
-      </w:r>
-      <w:r>
-        <w:rPr>
-          <w:i/>
-          <w:iCs/>
-          <w:color w:val="595959"/>
-          <w:sz w:val="19"/>
-          <w:szCs w:val="19"/>
-        </w:rPr>
-        <w:t>A DevSecOps delivery pipeline: automated security and compliance checks at every stage, each acting as a gate.</w:t>
-      </w:r>
-    </w:p>
-    <w:p>
-      <w:pPr>
-        <w:pStyle w:val="Heading3"/>
-      </w:pPr>
-      <w:r>
-        <w:t>3.3.3 Compliance as Code and Automated Governance</w:t>
-      </w:r>
-    </w:p>
-    <w:p>
-      <w:pPr>
-        <w:pStyle w:val="ListParagraph"/>
-        <w:numPr>
-          <w:ilvl w:val="0"/>
-          <w:numId w:val="3"/>
-        </w:numPr>
-        <w:spacing w:after="80" w:line="264" w:lineRule="auto"/>
-        <w:jc w:val="both"/>
-      </w:pPr>
-      <w:r>
-        <w:rPr>
-          <w:b/>
-          <w:bCs/>
-        </w:rPr>
-        <w:t>Policy as code with Cloud Custodian:</w:t>
-      </w:r>
-      <w:r>
-        <w:t xml:space="preserve"> Capital One created and open-sourced (2016) Cloud Custodian, a rules engine in which cloud policies — such as “all storage must be encrypted”, “no public buckets” or “mandatory tags” — are written as simple YAML files and enforced automatically, including real-time detection and auto-remediation of non-compliant resources. It is now a Cloud Native Computing Foundation (CNCF) project.</w:t>
-      </w:r>
-    </w:p>
-    <w:p>
-      <w:pPr>
-        <w:pStyle w:val="ListParagraph"/>
-        <w:numPr>
-          <w:ilvl w:val="0"/>
-          <w:numId w:val="3"/>
-        </w:numPr>
-        <w:spacing w:after="80" w:line="264" w:lineRule="auto"/>
-        <w:jc w:val="both"/>
-      </w:pPr>
-      <w:r>
-        <w:rPr>
-          <w:b/>
-          <w:bCs/>
-        </w:rPr>
-        <w:t>Automated change records:</w:t>
-      </w:r>
-      <w:r>
-        <w:t xml:space="preserve"> the pipeline itself generates the change record together with its evidence (tests passed, scans clean, approvals recorded), replacing slow manual CAB meetings for standard changes and giving auditors </w:t>
-      </w:r>
-      <w:r>
-        <w:rPr>
-          <w:b/>
-          <w:bCs/>
-        </w:rPr>
-        <w:t>better</w:t>
-      </w:r>
-      <w:r>
-        <w:t xml:space="preserve"> evidence than paperwork.</w:t>
-      </w:r>
-    </w:p>
-    <w:p>
-      <w:pPr>
-        <w:pStyle w:val="ListParagraph"/>
-        <w:numPr>
-          <w:ilvl w:val="0"/>
-          <w:numId w:val="3"/>
-        </w:numPr>
-        <w:spacing w:after="80" w:line="264" w:lineRule="auto"/>
-        <w:jc w:val="both"/>
-      </w:pPr>
-      <w:r>
-        <w:rPr>
-          <w:b/>
-          <w:bCs/>
-        </w:rPr>
-        <w:lastRenderedPageBreak/>
-        <w:t>Visibility with Hygieia:</w:t>
-      </w:r>
-      <w:r>
-        <w:t xml:space="preserve"> Capital One’s open-source DevOps dashboard (2015) shows the health of every pipeline — build status, code quality, test coverage and security-scan results — in one place, for both engineers and leadership.</w:t>
-      </w:r>
-    </w:p>
-    <w:p>
-      <w:pPr>
-        <w:pStyle w:val="ListParagraph"/>
-        <w:numPr>
-          <w:ilvl w:val="0"/>
-          <w:numId w:val="3"/>
-        </w:numPr>
-        <w:spacing w:after="80" w:line="264" w:lineRule="auto"/>
-        <w:jc w:val="both"/>
-      </w:pPr>
-      <w:r>
-        <w:rPr>
-          <w:b/>
-          <w:bCs/>
-        </w:rPr>
-        <w:t>Immutable infrastructure:</w:t>
-      </w:r>
-      <w:r>
-        <w:t xml:space="preserve"> servers are replaced, never manually patched, which prevents configuration drift and keeps every environment consistent and auditable.</w:t>
-      </w:r>
-    </w:p>
-    <w:p>
-      <w:pPr>
-        <w:pStyle w:val="Heading3"/>
-      </w:pPr>
-      <w:r>
-        <w:t>3.3.4 Culture and Organisation</w:t>
-      </w:r>
-    </w:p>
-    <w:p>
-      <w:pPr>
-        <w:spacing w:after="140" w:line="276" w:lineRule="auto"/>
-        <w:jc w:val="both"/>
-      </w:pPr>
-      <w:r>
-        <w:t xml:space="preserve">DevSecOps at Capital One was as much a cultural change as a technical one: cross-functional product teams, security treated as a </w:t>
-      </w:r>
-      <w:r>
-        <w:rPr>
-          <w:b/>
-          <w:bCs/>
-        </w:rPr>
-        <w:t>shared responsibility</w:t>
-      </w:r>
-      <w:r>
-        <w:t xml:space="preserve">, the security function acting as a provider of </w:t>
-      </w:r>
-      <w:r>
-        <w:rPr>
-          <w:b/>
-          <w:bCs/>
-        </w:rPr>
-        <w:t>“guardrails, not gates”</w:t>
-      </w:r>
-      <w:r>
-        <w:t>, continuous training, and metrics that make security and quality visible to everyone.</w:t>
-      </w:r>
-    </w:p>
-    <w:p>
-      <w:pPr>
-        <w:pStyle w:val="Heading2"/>
-      </w:pPr>
-      <w:bookmarkStart w:id="19" w:name="_Toc241757564"/>
-      <w:r>
-        <w:t>3.4 How Embedding Security Accelerates Innovation and Reduces Incidents</w:t>
-      </w:r>
-      <w:bookmarkEnd w:id="19"/>
-    </w:p>
-    <w:p>
-      <w:pPr>
-        <w:spacing w:after="140" w:line="276" w:lineRule="auto"/>
-        <w:jc w:val="both"/>
-      </w:pPr>
-      <w:r>
-        <w:t xml:space="preserve">It may seem counter-intuitive that adding more security checks makes delivery faster. A useful analogy is a racing car: </w:t>
-      </w:r>
-      <w:r>
-        <w:rPr>
-          <w:b/>
-          <w:bCs/>
-        </w:rPr>
-        <w:t>good brakes are what allow the driver to go fast safely</w:t>
-      </w:r>
-      <w:r>
-        <w:t>. Embedding security in the pipeline works the same way:</w:t>
-      </w:r>
-    </w:p>
-    <w:p>
-      <w:pPr>
-        <w:pStyle w:val="ListParagraph"/>
-        <w:numPr>
-          <w:ilvl w:val="0"/>
-          <w:numId w:val="5"/>
-        </w:numPr>
-        <w:spacing w:after="90" w:line="264" w:lineRule="auto"/>
-        <w:jc w:val="both"/>
-      </w:pPr>
-      <w:r>
-        <w:rPr>
-          <w:b/>
-          <w:bCs/>
-        </w:rPr>
-        <w:t>Problems are fixed when they are cheapest.</w:t>
-      </w:r>
-      <w:r>
-        <w:t xml:space="preserve"> The later a defect is found, the more it costs to fix (Figure 3.3). A vulnerability caught by an automated scan minutes after it was written is fixed in minutes; the same issue found in a pre-release audit can delay the whole release.</w:t>
-      </w:r>
-    </w:p>
-    <w:p>
-      <w:pPr>
-        <w:pStyle w:val="ListParagraph"/>
-        <w:numPr>
-          <w:ilvl w:val="0"/>
-          <w:numId w:val="5"/>
-        </w:numPr>
-        <w:spacing w:after="90" w:line="264" w:lineRule="auto"/>
-        <w:jc w:val="both"/>
-      </w:pPr>
-      <w:r>
-        <w:rPr>
-          <w:b/>
-          <w:bCs/>
-        </w:rPr>
-        <w:t>The end-of-line bottleneck disappears.</w:t>
-      </w:r>
-      <w:r>
-        <w:t xml:space="preserve"> Automated checks run in parallel for every team on every commit, so a small central security team no longer has to manually review every release and can focus on high-risk design reviews.</w:t>
-      </w:r>
-    </w:p>
-    <w:p>
-      <w:pPr>
-        <w:pStyle w:val="ListParagraph"/>
-        <w:numPr>
-          <w:ilvl w:val="0"/>
-          <w:numId w:val="5"/>
-        </w:numPr>
-        <w:spacing w:after="90" w:line="264" w:lineRule="auto"/>
-        <w:jc w:val="both"/>
-      </w:pPr>
-      <w:r>
-        <w:rPr>
-          <w:b/>
-          <w:bCs/>
-        </w:rPr>
-        <w:t>Small batches reduce risk.</w:t>
-      </w:r>
-      <w:r>
-        <w:t xml:space="preserve"> Frequent, small changes have a smaller attack surface, are easier to review and are easier to roll back. This lowers the change-failure rate and the time to restore service.</w:t>
-      </w:r>
-    </w:p>
-    <w:p>
-      <w:pPr>
-        <w:pStyle w:val="ListParagraph"/>
-        <w:numPr>
-          <w:ilvl w:val="0"/>
-          <w:numId w:val="5"/>
-        </w:numPr>
-        <w:spacing w:after="90" w:line="264" w:lineRule="auto"/>
-        <w:jc w:val="both"/>
-      </w:pPr>
-      <w:r>
-        <w:rPr>
-          <w:b/>
-          <w:bCs/>
-        </w:rPr>
-        <w:t>Automation is consistent.</w:t>
-      </w:r>
-      <w:r>
-        <w:t xml:space="preserve"> Scripts apply the same controls every time, whereas humans under deadline pressure skip steps. This sharply reduces misconfigurations, one of the leading causes of cloud security incidents.</w:t>
-      </w:r>
-    </w:p>
-    <w:p>
-      <w:pPr>
-        <w:pStyle w:val="ListParagraph"/>
-        <w:numPr>
-          <w:ilvl w:val="0"/>
-          <w:numId w:val="5"/>
-        </w:numPr>
-        <w:spacing w:after="90" w:line="264" w:lineRule="auto"/>
-        <w:jc w:val="both"/>
-      </w:pPr>
-      <w:r>
-        <w:rPr>
-          <w:b/>
-          <w:bCs/>
-        </w:rPr>
-        <w:t>Compliance becomes continuous.</w:t>
-      </w:r>
-      <w:r>
-        <w:t xml:space="preserve"> Evidence is produced automatically as a by-product of delivery, so audits become faster and regulators see a real-time compliance posture instead of a point-in-time snapshot.</w:t>
-      </w:r>
-    </w:p>
-    <w:p>
-      <w:pPr>
-        <w:pStyle w:val="ListParagraph"/>
-        <w:numPr>
-          <w:ilvl w:val="0"/>
-          <w:numId w:val="5"/>
-        </w:numPr>
-        <w:spacing w:after="90" w:line="264" w:lineRule="auto"/>
-        <w:jc w:val="both"/>
-      </w:pPr>
-      <w:r>
-        <w:rPr>
-          <w:b/>
-          <w:bCs/>
-        </w:rPr>
-        <w:t>Paved roads speed up new products.</w:t>
-      </w:r>
-      <w:r>
-        <w:t xml:space="preserve"> Teams that use pre-approved secure templates avoid lengthy one-off reviews and reach the market faster.</w:t>
-      </w:r>
-    </w:p>
-    <w:p>
-      <w:pPr>
-        <w:pStyle w:val="ListParagraph"/>
-        <w:numPr>
-          <w:ilvl w:val="0"/>
-          <w:numId w:val="5"/>
-        </w:numPr>
-        <w:spacing w:after="90" w:line="264" w:lineRule="auto"/>
-        <w:jc w:val="both"/>
-      </w:pPr>
-      <w:r>
-        <w:rPr>
-          <w:b/>
-          <w:bCs/>
-        </w:rPr>
-        <w:t>Fewer production incidents.</w:t>
-      </w:r>
-      <w:r>
-        <w:t xml:space="preserve"> Defects and vulnerabilities are caught before production, while immutable servers, zero-downtime deployment and automated rollback reduce both the number and the duration of incidents.</w:t>
-      </w:r>
-    </w:p>
-    <w:p>
-      <w:pPr>
-        <w:pStyle w:val="ListParagraph"/>
-        <w:numPr>
-          <w:ilvl w:val="0"/>
-          <w:numId w:val="5"/>
-        </w:numPr>
-        <w:spacing w:after="90" w:line="264" w:lineRule="auto"/>
-        <w:jc w:val="both"/>
-      </w:pPr>
-      <w:r>
-        <w:rPr>
-          <w:b/>
-          <w:bCs/>
-        </w:rPr>
-        <w:t>Trust enables innovation.</w:t>
-      </w:r>
-      <w:r>
-        <w:t xml:space="preserve"> When the business, risk teams and regulators trust the pipeline, teams are allowed to release more often and experiment with new digital features.</w:t>
-      </w:r>
-    </w:p>
-    <w:p>
-      <w:pPr>
-        <w:spacing w:after="140" w:line="276" w:lineRule="auto"/>
-        <w:jc w:val="both"/>
-      </w:pPr>
-      <w:r>
-        <w:t xml:space="preserve">Industry research supports this. The DORA research summarised in </w:t>
-      </w:r>
-      <w:r>
-        <w:rPr>
-          <w:b/>
-          <w:bCs/>
-        </w:rPr>
-        <w:t>Accelerate</w:t>
-      </w:r>
-      <w:r>
-        <w:t xml:space="preserve"> (Forsgren, Humble and Kim, 2018) found that high-performing teams achieve </w:t>
-      </w:r>
-      <w:r>
-        <w:rPr>
-          <w:b/>
-          <w:bCs/>
-        </w:rPr>
-        <w:t>both</w:t>
-      </w:r>
-      <w:r>
-        <w:t xml:space="preserve"> higher deployment frequency </w:t>
-      </w:r>
-      <w:r>
-        <w:rPr>
-          <w:b/>
-          <w:bCs/>
-        </w:rPr>
-        <w:t>and</w:t>
-      </w:r>
-      <w:r>
-        <w:t xml:space="preserve"> lower change-failure rates, and that integrating security into the delivery process is associated with higher performance. In other words, </w:t>
-      </w:r>
-      <w:r>
-        <w:rPr>
-          <w:b/>
-          <w:bCs/>
-        </w:rPr>
-        <w:t>speed and stability are not a trade-off</w:t>
-      </w:r>
-      <w:r>
-        <w:t xml:space="preserve"> — they reinforce each other.</w:t>
-      </w:r>
-    </w:p>
-    <w:p>
-      <w:pPr>
-        <w:keepNext/>
-        <w:spacing w:before="160" w:after="60"/>
-        <w:jc w:val="center"/>
-      </w:pPr>
-      <w:r>
-        <w:rPr>
-          <w:noProof/>
-        </w:rPr>
-        <w:lastRenderedPageBreak/>
-        <w:drawing>
-          <wp:inline distT="0" distB="0" distL="0" distR="0" wp14:anchorId="322F9310" wp14:editId="66298A67">
-            <wp:extent cx="5715000" cy="2571750"/>
-            <wp:effectExtent l="0" t="0" r="0" b="0"/>
-            <wp:docPr id="11" name="q3_cost.png" descr="Relative cost of fixing a defect at different stages — the economic reason for shifting security left." title="Relative cost of fixing a defect at different stages — the economic reason for shifting security left."/>
-            <wp:cNvGraphicFramePr>
-              <a:graphicFrameLocks xmlns:a="http://schemas.openxmlformats.org/drawingml/2006/main" noChangeAspect="1"/>
-            </wp:cNvGraphicFramePr>
-            <a:graphic xmlns:a="http://schemas.openxmlformats.org/drawingml/2006/main">
-              <a:graphicData uri="http://schemas.openxmlformats.org/drawingml/2006/picture">
-                <pic:pic xmlns:pic="http://schemas.openxmlformats.org/drawingml/2006/picture">
-                  <pic:nvPicPr>
-                    <pic:cNvPr id="0" name=""/>
-                    <pic:cNvPicPr>
-                      <a:picLocks noChangeAspect="1" noChangeArrowheads="1"/>
-                    </pic:cNvPicPr>
-                  </pic:nvPicPr>
-                  <pic:blipFill>
-                    <a:blip r:embed="rId17"/>
-                    <a:srcRect/>
-                    <a:stretch>
-                      <a:fillRect/>
-                    </a:stretch>
-                  </pic:blipFill>
-                  <pic:spPr bwMode="auto">
-                    <a:xfrm>
-                      <a:off x="0" y="0"/>
-                      <a:ext cx="5715000" cy="2571750"/>
-                    </a:xfrm>
-                    <a:prstGeom prst="rect">
-                      <a:avLst/>
-                    </a:prstGeom>
-                  </pic:spPr>
-                </pic:pic>
-              </a:graphicData>
-            </a:graphic>
-          </wp:inline>
-        </w:drawing>
-      </w:r>
-    </w:p>
-    <w:p>
-      <w:pPr>
-        <w:spacing w:after="220"/>
-        <w:jc w:val="center"/>
-      </w:pPr>
-      <w:r>
-        <w:rPr>
-          <w:b/>
-          <w:bCs/>
-          <w:i/>
-          <w:iCs/>
-          <w:color w:val="595959"/>
-          <w:sz w:val="19"/>
-          <w:szCs w:val="19"/>
-        </w:rPr>
-        <w:t xml:space="preserve">Figure 3.3: </w:t>
-      </w:r>
-      <w:r>
-        <w:rPr>
-          <w:i/>
-          <w:iCs/>
-          <w:color w:val="595959"/>
-          <w:sz w:val="19"/>
-          <w:szCs w:val="19"/>
-        </w:rPr>
-        <w:t>Relative cost of fixing a defect at different stages — the economic reason for shifting security left.</w:t>
+        <w:t>Although Netflix and Amazon faced different problems at different times, their DevOps journeys share a common pattern: a painful limitation of the old monolithic way of working led to changes in architecture, organisation and automation, producing delivery that is both faster and more reliable.</w:t>
       </w:r>
     </w:p>
     <w:p>
@@ -8501,7 +6589,7 @@
           <w:sz w:val="20"/>
           <w:szCs w:val="20"/>
         </w:rPr>
-        <w:t>Table 3.1: Traditional security gate versus DevSecOps shift-left</w:t>
+        <w:t>Table 3.1: The two case studies at a glance</w:t>
       </w:r>
     </w:p>
     <w:tbl>
@@ -8523,1270 +6611,17 @@
         <w:tblLook w:val="04A0" w:firstRow="1" w:lastRow="0" w:firstColumn="1" w:lastColumn="0" w:noHBand="0" w:noVBand="1"/>
       </w:tblPr>
       <w:tblGrid>
-        <w:gridCol w:w="2300"/>
-        <w:gridCol w:w="3300"/>
-        <w:gridCol w:w="3426"/>
+        <w:gridCol w:w="2026"/>
+        <w:gridCol w:w="3500"/>
+        <w:gridCol w:w="3500"/>
       </w:tblGrid>
       <w:tr>
-        <w:tblPrEx>
-          <w:tblCellMar>
-            <w:top w:w="0" w:type="dxa"/>
-            <w:bottom w:w="0" w:type="dxa"/>
-          </w:tblCellMar>
-        </w:tblPrEx>
         <w:trPr>
           <w:tblHeader/>
         </w:trPr>
         <w:tc>
           <w:tcPr>
-            <w:tcW w:w="2300" w:type="dxa"/>
-            <w:tcBorders>
-              <w:top w:val="single" w:sz="4" w:space="0" w:color="BFBFBF"/>
-              <w:left w:val="single" w:sz="4" w:space="0" w:color="BFBFBF"/>
-              <w:bottom w:val="single" w:sz="4" w:space="0" w:color="BFBFBF"/>
-              <w:right w:val="single" w:sz="4" w:space="0" w:color="BFBFBF"/>
-            </w:tcBorders>
-            <w:shd w:val="clear" w:color="auto" w:fill="1F3864"/>
-            <w:tcMar>
-              <w:top w:w="70" w:type="dxa"/>
-              <w:left w:w="110" w:type="dxa"/>
-              <w:bottom w:w="70" w:type="dxa"/>
-              <w:right w:w="110" w:type="dxa"/>
-            </w:tcMar>
-            <w:vAlign w:val="center"/>
-          </w:tcPr>
-          <w:p>
-            <w:pPr>
-              <w:spacing w:line="252" w:lineRule="auto"/>
-            </w:pPr>
-            <w:r>
-              <w:rPr>
-                <w:b/>
-                <w:bCs/>
-                <w:color w:val="FFFFFF"/>
-                <w:sz w:val="20"/>
-                <w:szCs w:val="20"/>
-              </w:rPr>
-              <w:t>Aspect</w:t>
-            </w:r>
-          </w:p>
-        </w:tc>
-        <w:tc>
-          <w:tcPr>
-            <w:tcW w:w="3300" w:type="dxa"/>
-            <w:tcBorders>
-              <w:top w:val="single" w:sz="4" w:space="0" w:color="BFBFBF"/>
-              <w:left w:val="single" w:sz="4" w:space="0" w:color="BFBFBF"/>
-              <w:bottom w:val="single" w:sz="4" w:space="0" w:color="BFBFBF"/>
-              <w:right w:val="single" w:sz="4" w:space="0" w:color="BFBFBF"/>
-            </w:tcBorders>
-            <w:shd w:val="clear" w:color="auto" w:fill="1F3864"/>
-            <w:tcMar>
-              <w:top w:w="70" w:type="dxa"/>
-              <w:left w:w="110" w:type="dxa"/>
-              <w:bottom w:w="70" w:type="dxa"/>
-              <w:right w:w="110" w:type="dxa"/>
-            </w:tcMar>
-            <w:vAlign w:val="center"/>
-          </w:tcPr>
-          <w:p>
-            <w:pPr>
-              <w:spacing w:line="252" w:lineRule="auto"/>
-            </w:pPr>
-            <w:r>
-              <w:rPr>
-                <w:b/>
-                <w:bCs/>
-                <w:color w:val="FFFFFF"/>
-                <w:sz w:val="20"/>
-                <w:szCs w:val="20"/>
-              </w:rPr>
-              <w:t>Traditional “final gate”</w:t>
-            </w:r>
-          </w:p>
-        </w:tc>
-        <w:tc>
-          <w:tcPr>
-            <w:tcW w:w="3426" w:type="dxa"/>
-            <w:tcBorders>
-              <w:top w:val="single" w:sz="4" w:space="0" w:color="BFBFBF"/>
-              <w:left w:val="single" w:sz="4" w:space="0" w:color="BFBFBF"/>
-              <w:bottom w:val="single" w:sz="4" w:space="0" w:color="BFBFBF"/>
-              <w:right w:val="single" w:sz="4" w:space="0" w:color="BFBFBF"/>
-            </w:tcBorders>
-            <w:shd w:val="clear" w:color="auto" w:fill="1F3864"/>
-            <w:tcMar>
-              <w:top w:w="70" w:type="dxa"/>
-              <w:left w:w="110" w:type="dxa"/>
-              <w:bottom w:w="70" w:type="dxa"/>
-              <w:right w:w="110" w:type="dxa"/>
-            </w:tcMar>
-            <w:vAlign w:val="center"/>
-          </w:tcPr>
-          <w:p>
-            <w:pPr>
-              <w:spacing w:line="252" w:lineRule="auto"/>
-            </w:pPr>
-            <w:r>
-              <w:rPr>
-                <w:b/>
-                <w:bCs/>
-                <w:color w:val="FFFFFF"/>
-                <w:sz w:val="20"/>
-                <w:szCs w:val="20"/>
-              </w:rPr>
-              <w:t>DevSecOps “shift-left”</w:t>
-            </w:r>
-          </w:p>
-        </w:tc>
-      </w:tr>
-      <w:tr>
-        <w:tblPrEx>
-          <w:tblCellMar>
-            <w:top w:w="0" w:type="dxa"/>
-            <w:bottom w:w="0" w:type="dxa"/>
-          </w:tblCellMar>
-        </w:tblPrEx>
-        <w:trPr>
-          <w:cantSplit/>
-        </w:trPr>
-        <w:tc>
-          <w:tcPr>
-            <w:tcW w:w="2300" w:type="dxa"/>
-            <w:tcBorders>
-              <w:top w:val="single" w:sz="4" w:space="0" w:color="BFBFBF"/>
-              <w:left w:val="single" w:sz="4" w:space="0" w:color="BFBFBF"/>
-              <w:bottom w:val="single" w:sz="4" w:space="0" w:color="BFBFBF"/>
-              <w:right w:val="single" w:sz="4" w:space="0" w:color="BFBFBF"/>
-            </w:tcBorders>
-            <w:shd w:val="clear" w:color="auto" w:fill="FFFFFF"/>
-            <w:tcMar>
-              <w:top w:w="70" w:type="dxa"/>
-              <w:left w:w="110" w:type="dxa"/>
-              <w:bottom w:w="70" w:type="dxa"/>
-              <w:right w:w="110" w:type="dxa"/>
-            </w:tcMar>
-            <w:vAlign w:val="center"/>
-          </w:tcPr>
-          <w:p>
-            <w:pPr>
-              <w:spacing w:line="252" w:lineRule="auto"/>
-            </w:pPr>
-            <w:r>
-              <w:rPr>
-                <w:sz w:val="20"/>
-                <w:szCs w:val="20"/>
-              </w:rPr>
-              <w:t>When security is checked</w:t>
-            </w:r>
-          </w:p>
-        </w:tc>
-        <w:tc>
-          <w:tcPr>
-            <w:tcW w:w="3300" w:type="dxa"/>
-            <w:tcBorders>
-              <w:top w:val="single" w:sz="4" w:space="0" w:color="BFBFBF"/>
-              <w:left w:val="single" w:sz="4" w:space="0" w:color="BFBFBF"/>
-              <w:bottom w:val="single" w:sz="4" w:space="0" w:color="BFBFBF"/>
-              <w:right w:val="single" w:sz="4" w:space="0" w:color="BFBFBF"/>
-            </w:tcBorders>
-            <w:shd w:val="clear" w:color="auto" w:fill="FFFFFF"/>
-            <w:tcMar>
-              <w:top w:w="70" w:type="dxa"/>
-              <w:left w:w="110" w:type="dxa"/>
-              <w:bottom w:w="70" w:type="dxa"/>
-              <w:right w:w="110" w:type="dxa"/>
-            </w:tcMar>
-            <w:vAlign w:val="center"/>
-          </w:tcPr>
-          <w:p>
-            <w:pPr>
-              <w:spacing w:line="252" w:lineRule="auto"/>
-            </w:pPr>
-            <w:r>
-              <w:rPr>
-                <w:sz w:val="20"/>
-                <w:szCs w:val="20"/>
-              </w:rPr>
-              <w:t>Once, at the end, before release</w:t>
-            </w:r>
-          </w:p>
-        </w:tc>
-        <w:tc>
-          <w:tcPr>
-            <w:tcW w:w="3426" w:type="dxa"/>
-            <w:tcBorders>
-              <w:top w:val="single" w:sz="4" w:space="0" w:color="BFBFBF"/>
-              <w:left w:val="single" w:sz="4" w:space="0" w:color="BFBFBF"/>
-              <w:bottom w:val="single" w:sz="4" w:space="0" w:color="BFBFBF"/>
-              <w:right w:val="single" w:sz="4" w:space="0" w:color="BFBFBF"/>
-            </w:tcBorders>
-            <w:shd w:val="clear" w:color="auto" w:fill="FFFFFF"/>
-            <w:tcMar>
-              <w:top w:w="70" w:type="dxa"/>
-              <w:left w:w="110" w:type="dxa"/>
-              <w:bottom w:w="70" w:type="dxa"/>
-              <w:right w:w="110" w:type="dxa"/>
-            </w:tcMar>
-            <w:vAlign w:val="center"/>
-          </w:tcPr>
-          <w:p>
-            <w:pPr>
-              <w:spacing w:line="252" w:lineRule="auto"/>
-            </w:pPr>
-            <w:r>
-              <w:rPr>
-                <w:sz w:val="20"/>
-                <w:szCs w:val="20"/>
-              </w:rPr>
-              <w:t>Continuously, on every commit and at every stage</w:t>
-            </w:r>
-          </w:p>
-        </w:tc>
-      </w:tr>
-      <w:tr>
-        <w:tblPrEx>
-          <w:tblCellMar>
-            <w:top w:w="0" w:type="dxa"/>
-            <w:bottom w:w="0" w:type="dxa"/>
-          </w:tblCellMar>
-        </w:tblPrEx>
-        <w:trPr>
-          <w:cantSplit/>
-        </w:trPr>
-        <w:tc>
-          <w:tcPr>
-            <w:tcW w:w="2300" w:type="dxa"/>
-            <w:tcBorders>
-              <w:top w:val="single" w:sz="4" w:space="0" w:color="BFBFBF"/>
-              <w:left w:val="single" w:sz="4" w:space="0" w:color="BFBFBF"/>
-              <w:bottom w:val="single" w:sz="4" w:space="0" w:color="BFBFBF"/>
-              <w:right w:val="single" w:sz="4" w:space="0" w:color="BFBFBF"/>
-            </w:tcBorders>
-            <w:shd w:val="clear" w:color="auto" w:fill="F3F6FA"/>
-            <w:tcMar>
-              <w:top w:w="70" w:type="dxa"/>
-              <w:left w:w="110" w:type="dxa"/>
-              <w:bottom w:w="70" w:type="dxa"/>
-              <w:right w:w="110" w:type="dxa"/>
-            </w:tcMar>
-            <w:vAlign w:val="center"/>
-          </w:tcPr>
-          <w:p>
-            <w:pPr>
-              <w:spacing w:line="252" w:lineRule="auto"/>
-            </w:pPr>
-            <w:r>
-              <w:rPr>
-                <w:sz w:val="20"/>
-                <w:szCs w:val="20"/>
-              </w:rPr>
-              <w:t>Who is responsible</w:t>
-            </w:r>
-          </w:p>
-        </w:tc>
-        <w:tc>
-          <w:tcPr>
-            <w:tcW w:w="3300" w:type="dxa"/>
-            <w:tcBorders>
-              <w:top w:val="single" w:sz="4" w:space="0" w:color="BFBFBF"/>
-              <w:left w:val="single" w:sz="4" w:space="0" w:color="BFBFBF"/>
-              <w:bottom w:val="single" w:sz="4" w:space="0" w:color="BFBFBF"/>
-              <w:right w:val="single" w:sz="4" w:space="0" w:color="BFBFBF"/>
-            </w:tcBorders>
-            <w:shd w:val="clear" w:color="auto" w:fill="F3F6FA"/>
-            <w:tcMar>
-              <w:top w:w="70" w:type="dxa"/>
-              <w:left w:w="110" w:type="dxa"/>
-              <w:bottom w:w="70" w:type="dxa"/>
-              <w:right w:w="110" w:type="dxa"/>
-            </w:tcMar>
-            <w:vAlign w:val="center"/>
-          </w:tcPr>
-          <w:p>
-            <w:pPr>
-              <w:spacing w:line="252" w:lineRule="auto"/>
-            </w:pPr>
-            <w:r>
-              <w:rPr>
-                <w:sz w:val="20"/>
-                <w:szCs w:val="20"/>
-              </w:rPr>
-              <w:t>Separate security team</w:t>
-            </w:r>
-          </w:p>
-        </w:tc>
-        <w:tc>
-          <w:tcPr>
-            <w:tcW w:w="3426" w:type="dxa"/>
-            <w:tcBorders>
-              <w:top w:val="single" w:sz="4" w:space="0" w:color="BFBFBF"/>
-              <w:left w:val="single" w:sz="4" w:space="0" w:color="BFBFBF"/>
-              <w:bottom w:val="single" w:sz="4" w:space="0" w:color="BFBFBF"/>
-              <w:right w:val="single" w:sz="4" w:space="0" w:color="BFBFBF"/>
-            </w:tcBorders>
-            <w:shd w:val="clear" w:color="auto" w:fill="F3F6FA"/>
-            <w:tcMar>
-              <w:top w:w="70" w:type="dxa"/>
-              <w:left w:w="110" w:type="dxa"/>
-              <w:bottom w:w="70" w:type="dxa"/>
-              <w:right w:w="110" w:type="dxa"/>
-            </w:tcMar>
-            <w:vAlign w:val="center"/>
-          </w:tcPr>
-          <w:p>
-            <w:pPr>
-              <w:spacing w:line="252" w:lineRule="auto"/>
-            </w:pPr>
-            <w:r>
-              <w:rPr>
-                <w:sz w:val="20"/>
-                <w:szCs w:val="20"/>
-              </w:rPr>
-              <w:t>Whole team; security acts as enabler and coach</w:t>
-            </w:r>
-          </w:p>
-        </w:tc>
-      </w:tr>
-      <w:tr>
-        <w:tblPrEx>
-          <w:tblCellMar>
-            <w:top w:w="0" w:type="dxa"/>
-            <w:bottom w:w="0" w:type="dxa"/>
-          </w:tblCellMar>
-        </w:tblPrEx>
-        <w:trPr>
-          <w:cantSplit/>
-        </w:trPr>
-        <w:tc>
-          <w:tcPr>
-            <w:tcW w:w="2300" w:type="dxa"/>
-            <w:tcBorders>
-              <w:top w:val="single" w:sz="4" w:space="0" w:color="BFBFBF"/>
-              <w:left w:val="single" w:sz="4" w:space="0" w:color="BFBFBF"/>
-              <w:bottom w:val="single" w:sz="4" w:space="0" w:color="BFBFBF"/>
-              <w:right w:val="single" w:sz="4" w:space="0" w:color="BFBFBF"/>
-            </w:tcBorders>
-            <w:shd w:val="clear" w:color="auto" w:fill="FFFFFF"/>
-            <w:tcMar>
-              <w:top w:w="70" w:type="dxa"/>
-              <w:left w:w="110" w:type="dxa"/>
-              <w:bottom w:w="70" w:type="dxa"/>
-              <w:right w:w="110" w:type="dxa"/>
-            </w:tcMar>
-            <w:vAlign w:val="center"/>
-          </w:tcPr>
-          <w:p>
-            <w:pPr>
-              <w:spacing w:line="252" w:lineRule="auto"/>
-            </w:pPr>
-            <w:r>
-              <w:rPr>
-                <w:sz w:val="20"/>
-                <w:szCs w:val="20"/>
-              </w:rPr>
-              <w:t>Feedback time</w:t>
-            </w:r>
-          </w:p>
-        </w:tc>
-        <w:tc>
-          <w:tcPr>
-            <w:tcW w:w="3300" w:type="dxa"/>
-            <w:tcBorders>
-              <w:top w:val="single" w:sz="4" w:space="0" w:color="BFBFBF"/>
-              <w:left w:val="single" w:sz="4" w:space="0" w:color="BFBFBF"/>
-              <w:bottom w:val="single" w:sz="4" w:space="0" w:color="BFBFBF"/>
-              <w:right w:val="single" w:sz="4" w:space="0" w:color="BFBFBF"/>
-            </w:tcBorders>
-            <w:shd w:val="clear" w:color="auto" w:fill="FFFFFF"/>
-            <w:tcMar>
-              <w:top w:w="70" w:type="dxa"/>
-              <w:left w:w="110" w:type="dxa"/>
-              <w:bottom w:w="70" w:type="dxa"/>
-              <w:right w:w="110" w:type="dxa"/>
-            </w:tcMar>
-            <w:vAlign w:val="center"/>
-          </w:tcPr>
-          <w:p>
-            <w:pPr>
-              <w:spacing w:line="252" w:lineRule="auto"/>
-            </w:pPr>
-            <w:r>
-              <w:rPr>
-                <w:sz w:val="20"/>
-                <w:szCs w:val="20"/>
-              </w:rPr>
-              <w:t>Weeks or months</w:t>
-            </w:r>
-          </w:p>
-        </w:tc>
-        <w:tc>
-          <w:tcPr>
-            <w:tcW w:w="3426" w:type="dxa"/>
-            <w:tcBorders>
-              <w:top w:val="single" w:sz="4" w:space="0" w:color="BFBFBF"/>
-              <w:left w:val="single" w:sz="4" w:space="0" w:color="BFBFBF"/>
-              <w:bottom w:val="single" w:sz="4" w:space="0" w:color="BFBFBF"/>
-              <w:right w:val="single" w:sz="4" w:space="0" w:color="BFBFBF"/>
-            </w:tcBorders>
-            <w:shd w:val="clear" w:color="auto" w:fill="FFFFFF"/>
-            <w:tcMar>
-              <w:top w:w="70" w:type="dxa"/>
-              <w:left w:w="110" w:type="dxa"/>
-              <w:bottom w:w="70" w:type="dxa"/>
-              <w:right w:w="110" w:type="dxa"/>
-            </w:tcMar>
-            <w:vAlign w:val="center"/>
-          </w:tcPr>
-          <w:p>
-            <w:pPr>
-              <w:spacing w:line="252" w:lineRule="auto"/>
-            </w:pPr>
-            <w:r>
-              <w:rPr>
-                <w:sz w:val="20"/>
-                <w:szCs w:val="20"/>
-              </w:rPr>
-              <w:t>Minutes</w:t>
-            </w:r>
-          </w:p>
-        </w:tc>
-      </w:tr>
-      <w:tr>
-        <w:tblPrEx>
-          <w:tblCellMar>
-            <w:top w:w="0" w:type="dxa"/>
-            <w:bottom w:w="0" w:type="dxa"/>
-          </w:tblCellMar>
-        </w:tblPrEx>
-        <w:trPr>
-          <w:cantSplit/>
-        </w:trPr>
-        <w:tc>
-          <w:tcPr>
-            <w:tcW w:w="2300" w:type="dxa"/>
-            <w:tcBorders>
-              <w:top w:val="single" w:sz="4" w:space="0" w:color="BFBFBF"/>
-              <w:left w:val="single" w:sz="4" w:space="0" w:color="BFBFBF"/>
-              <w:bottom w:val="single" w:sz="4" w:space="0" w:color="BFBFBF"/>
-              <w:right w:val="single" w:sz="4" w:space="0" w:color="BFBFBF"/>
-            </w:tcBorders>
-            <w:shd w:val="clear" w:color="auto" w:fill="F3F6FA"/>
-            <w:tcMar>
-              <w:top w:w="70" w:type="dxa"/>
-              <w:left w:w="110" w:type="dxa"/>
-              <w:bottom w:w="70" w:type="dxa"/>
-              <w:right w:w="110" w:type="dxa"/>
-            </w:tcMar>
-            <w:vAlign w:val="center"/>
-          </w:tcPr>
-          <w:p>
-            <w:pPr>
-              <w:spacing w:line="252" w:lineRule="auto"/>
-            </w:pPr>
-            <w:r>
-              <w:rPr>
-                <w:sz w:val="20"/>
-                <w:szCs w:val="20"/>
-              </w:rPr>
-              <w:t>Cost of fixing issues</w:t>
-            </w:r>
-          </w:p>
-        </w:tc>
-        <w:tc>
-          <w:tcPr>
-            <w:tcW w:w="3300" w:type="dxa"/>
-            <w:tcBorders>
-              <w:top w:val="single" w:sz="4" w:space="0" w:color="BFBFBF"/>
-              <w:left w:val="single" w:sz="4" w:space="0" w:color="BFBFBF"/>
-              <w:bottom w:val="single" w:sz="4" w:space="0" w:color="BFBFBF"/>
-              <w:right w:val="single" w:sz="4" w:space="0" w:color="BFBFBF"/>
-            </w:tcBorders>
-            <w:shd w:val="clear" w:color="auto" w:fill="F3F6FA"/>
-            <w:tcMar>
-              <w:top w:w="70" w:type="dxa"/>
-              <w:left w:w="110" w:type="dxa"/>
-              <w:bottom w:w="70" w:type="dxa"/>
-              <w:right w:w="110" w:type="dxa"/>
-            </w:tcMar>
-            <w:vAlign w:val="center"/>
-          </w:tcPr>
-          <w:p>
-            <w:pPr>
-              <w:spacing w:line="252" w:lineRule="auto"/>
-            </w:pPr>
-            <w:r>
-              <w:rPr>
-                <w:sz w:val="20"/>
-                <w:szCs w:val="20"/>
-              </w:rPr>
-              <w:t>High (late rework, delayed release)</w:t>
-            </w:r>
-          </w:p>
-        </w:tc>
-        <w:tc>
-          <w:tcPr>
-            <w:tcW w:w="3426" w:type="dxa"/>
-            <w:tcBorders>
-              <w:top w:val="single" w:sz="4" w:space="0" w:color="BFBFBF"/>
-              <w:left w:val="single" w:sz="4" w:space="0" w:color="BFBFBF"/>
-              <w:bottom w:val="single" w:sz="4" w:space="0" w:color="BFBFBF"/>
-              <w:right w:val="single" w:sz="4" w:space="0" w:color="BFBFBF"/>
-            </w:tcBorders>
-            <w:shd w:val="clear" w:color="auto" w:fill="F3F6FA"/>
-            <w:tcMar>
-              <w:top w:w="70" w:type="dxa"/>
-              <w:left w:w="110" w:type="dxa"/>
-              <w:bottom w:w="70" w:type="dxa"/>
-              <w:right w:w="110" w:type="dxa"/>
-            </w:tcMar>
-            <w:vAlign w:val="center"/>
-          </w:tcPr>
-          <w:p>
-            <w:pPr>
-              <w:spacing w:line="252" w:lineRule="auto"/>
-            </w:pPr>
-            <w:r>
-              <w:rPr>
-                <w:sz w:val="20"/>
-                <w:szCs w:val="20"/>
-              </w:rPr>
-              <w:t>Low (fixed while the change is small)</w:t>
-            </w:r>
-          </w:p>
-        </w:tc>
-      </w:tr>
-      <w:tr>
-        <w:tblPrEx>
-          <w:tblCellMar>
-            <w:top w:w="0" w:type="dxa"/>
-            <w:bottom w:w="0" w:type="dxa"/>
-          </w:tblCellMar>
-        </w:tblPrEx>
-        <w:trPr>
-          <w:cantSplit/>
-        </w:trPr>
-        <w:tc>
-          <w:tcPr>
-            <w:tcW w:w="2300" w:type="dxa"/>
-            <w:tcBorders>
-              <w:top w:val="single" w:sz="4" w:space="0" w:color="BFBFBF"/>
-              <w:left w:val="single" w:sz="4" w:space="0" w:color="BFBFBF"/>
-              <w:bottom w:val="single" w:sz="4" w:space="0" w:color="BFBFBF"/>
-              <w:right w:val="single" w:sz="4" w:space="0" w:color="BFBFBF"/>
-            </w:tcBorders>
-            <w:shd w:val="clear" w:color="auto" w:fill="FFFFFF"/>
-            <w:tcMar>
-              <w:top w:w="70" w:type="dxa"/>
-              <w:left w:w="110" w:type="dxa"/>
-              <w:bottom w:w="70" w:type="dxa"/>
-              <w:right w:w="110" w:type="dxa"/>
-            </w:tcMar>
-            <w:vAlign w:val="center"/>
-          </w:tcPr>
-          <w:p>
-            <w:pPr>
-              <w:spacing w:line="252" w:lineRule="auto"/>
-            </w:pPr>
-            <w:r>
-              <w:rPr>
-                <w:sz w:val="20"/>
-                <w:szCs w:val="20"/>
-              </w:rPr>
-              <w:t>Compliance evidence</w:t>
-            </w:r>
-          </w:p>
-        </w:tc>
-        <w:tc>
-          <w:tcPr>
-            <w:tcW w:w="3300" w:type="dxa"/>
-            <w:tcBorders>
-              <w:top w:val="single" w:sz="4" w:space="0" w:color="BFBFBF"/>
-              <w:left w:val="single" w:sz="4" w:space="0" w:color="BFBFBF"/>
-              <w:bottom w:val="single" w:sz="4" w:space="0" w:color="BFBFBF"/>
-              <w:right w:val="single" w:sz="4" w:space="0" w:color="BFBFBF"/>
-            </w:tcBorders>
-            <w:shd w:val="clear" w:color="auto" w:fill="FFFFFF"/>
-            <w:tcMar>
-              <w:top w:w="70" w:type="dxa"/>
-              <w:left w:w="110" w:type="dxa"/>
-              <w:bottom w:w="70" w:type="dxa"/>
-              <w:right w:w="110" w:type="dxa"/>
-            </w:tcMar>
-            <w:vAlign w:val="center"/>
-          </w:tcPr>
-          <w:p>
-            <w:pPr>
-              <w:spacing w:line="252" w:lineRule="auto"/>
-            </w:pPr>
-            <w:r>
-              <w:rPr>
-                <w:sz w:val="20"/>
-                <w:szCs w:val="20"/>
-              </w:rPr>
-              <w:t>Manual documents, point-in-time audits</w:t>
-            </w:r>
-          </w:p>
-        </w:tc>
-        <w:tc>
-          <w:tcPr>
-            <w:tcW w:w="3426" w:type="dxa"/>
-            <w:tcBorders>
-              <w:top w:val="single" w:sz="4" w:space="0" w:color="BFBFBF"/>
-              <w:left w:val="single" w:sz="4" w:space="0" w:color="BFBFBF"/>
-              <w:bottom w:val="single" w:sz="4" w:space="0" w:color="BFBFBF"/>
-              <w:right w:val="single" w:sz="4" w:space="0" w:color="BFBFBF"/>
-            </w:tcBorders>
-            <w:shd w:val="clear" w:color="auto" w:fill="FFFFFF"/>
-            <w:tcMar>
-              <w:top w:w="70" w:type="dxa"/>
-              <w:left w:w="110" w:type="dxa"/>
-              <w:bottom w:w="70" w:type="dxa"/>
-              <w:right w:w="110" w:type="dxa"/>
-            </w:tcMar>
-            <w:vAlign w:val="center"/>
-          </w:tcPr>
-          <w:p>
-            <w:pPr>
-              <w:spacing w:line="252" w:lineRule="auto"/>
-            </w:pPr>
-            <w:r>
-              <w:rPr>
-                <w:sz w:val="20"/>
-                <w:szCs w:val="20"/>
-              </w:rPr>
-              <w:t>Automatic, continuous and auditable (compliance as code)</w:t>
-            </w:r>
-          </w:p>
-        </w:tc>
-      </w:tr>
-      <w:tr>
-        <w:tblPrEx>
-          <w:tblCellMar>
-            <w:top w:w="0" w:type="dxa"/>
-            <w:bottom w:w="0" w:type="dxa"/>
-          </w:tblCellMar>
-        </w:tblPrEx>
-        <w:trPr>
-          <w:cantSplit/>
-        </w:trPr>
-        <w:tc>
-          <w:tcPr>
-            <w:tcW w:w="2300" w:type="dxa"/>
-            <w:tcBorders>
-              <w:top w:val="single" w:sz="4" w:space="0" w:color="BFBFBF"/>
-              <w:left w:val="single" w:sz="4" w:space="0" w:color="BFBFBF"/>
-              <w:bottom w:val="single" w:sz="4" w:space="0" w:color="BFBFBF"/>
-              <w:right w:val="single" w:sz="4" w:space="0" w:color="BFBFBF"/>
-            </w:tcBorders>
-            <w:shd w:val="clear" w:color="auto" w:fill="F3F6FA"/>
-            <w:tcMar>
-              <w:top w:w="70" w:type="dxa"/>
-              <w:left w:w="110" w:type="dxa"/>
-              <w:bottom w:w="70" w:type="dxa"/>
-              <w:right w:w="110" w:type="dxa"/>
-            </w:tcMar>
-            <w:vAlign w:val="center"/>
-          </w:tcPr>
-          <w:p>
-            <w:pPr>
-              <w:spacing w:line="252" w:lineRule="auto"/>
-            </w:pPr>
-            <w:r>
-              <w:rPr>
-                <w:sz w:val="20"/>
-                <w:szCs w:val="20"/>
-              </w:rPr>
-              <w:t>Release frequency</w:t>
-            </w:r>
-          </w:p>
-        </w:tc>
-        <w:tc>
-          <w:tcPr>
-            <w:tcW w:w="3300" w:type="dxa"/>
-            <w:tcBorders>
-              <w:top w:val="single" w:sz="4" w:space="0" w:color="BFBFBF"/>
-              <w:left w:val="single" w:sz="4" w:space="0" w:color="BFBFBF"/>
-              <w:bottom w:val="single" w:sz="4" w:space="0" w:color="BFBFBF"/>
-              <w:right w:val="single" w:sz="4" w:space="0" w:color="BFBFBF"/>
-            </w:tcBorders>
-            <w:shd w:val="clear" w:color="auto" w:fill="F3F6FA"/>
-            <w:tcMar>
-              <w:top w:w="70" w:type="dxa"/>
-              <w:left w:w="110" w:type="dxa"/>
-              <w:bottom w:w="70" w:type="dxa"/>
-              <w:right w:w="110" w:type="dxa"/>
-            </w:tcMar>
-            <w:vAlign w:val="center"/>
-          </w:tcPr>
-          <w:p>
-            <w:pPr>
-              <w:spacing w:line="252" w:lineRule="auto"/>
-            </w:pPr>
-            <w:r>
-              <w:rPr>
-                <w:sz w:val="20"/>
-                <w:szCs w:val="20"/>
-              </w:rPr>
-              <w:t>Every 6–9 months</w:t>
-            </w:r>
-          </w:p>
-        </w:tc>
-        <w:tc>
-          <w:tcPr>
-            <w:tcW w:w="3426" w:type="dxa"/>
-            <w:tcBorders>
-              <w:top w:val="single" w:sz="4" w:space="0" w:color="BFBFBF"/>
-              <w:left w:val="single" w:sz="4" w:space="0" w:color="BFBFBF"/>
-              <w:bottom w:val="single" w:sz="4" w:space="0" w:color="BFBFBF"/>
-              <w:right w:val="single" w:sz="4" w:space="0" w:color="BFBFBF"/>
-            </w:tcBorders>
-            <w:shd w:val="clear" w:color="auto" w:fill="F3F6FA"/>
-            <w:tcMar>
-              <w:top w:w="70" w:type="dxa"/>
-              <w:left w:w="110" w:type="dxa"/>
-              <w:bottom w:w="70" w:type="dxa"/>
-              <w:right w:w="110" w:type="dxa"/>
-            </w:tcMar>
-            <w:vAlign w:val="center"/>
-          </w:tcPr>
-          <w:p>
-            <w:pPr>
-              <w:spacing w:line="252" w:lineRule="auto"/>
-            </w:pPr>
-            <w:r>
-              <w:rPr>
-                <w:sz w:val="20"/>
-                <w:szCs w:val="20"/>
-              </w:rPr>
-              <w:t>Weeks to days, and on demand for mature teams</w:t>
-            </w:r>
-          </w:p>
-        </w:tc>
-      </w:tr>
-      <w:tr>
-        <w:tblPrEx>
-          <w:tblCellMar>
-            <w:top w:w="0" w:type="dxa"/>
-            <w:bottom w:w="0" w:type="dxa"/>
-          </w:tblCellMar>
-        </w:tblPrEx>
-        <w:trPr>
-          <w:cantSplit/>
-        </w:trPr>
-        <w:tc>
-          <w:tcPr>
-            <w:tcW w:w="2300" w:type="dxa"/>
-            <w:tcBorders>
-              <w:top w:val="single" w:sz="4" w:space="0" w:color="BFBFBF"/>
-              <w:left w:val="single" w:sz="4" w:space="0" w:color="BFBFBF"/>
-              <w:bottom w:val="single" w:sz="4" w:space="0" w:color="BFBFBF"/>
-              <w:right w:val="single" w:sz="4" w:space="0" w:color="BFBFBF"/>
-            </w:tcBorders>
-            <w:shd w:val="clear" w:color="auto" w:fill="FFFFFF"/>
-            <w:tcMar>
-              <w:top w:w="70" w:type="dxa"/>
-              <w:left w:w="110" w:type="dxa"/>
-              <w:bottom w:w="70" w:type="dxa"/>
-              <w:right w:w="110" w:type="dxa"/>
-            </w:tcMar>
-            <w:vAlign w:val="center"/>
-          </w:tcPr>
-          <w:p>
-            <w:pPr>
-              <w:spacing w:line="252" w:lineRule="auto"/>
-            </w:pPr>
-            <w:r>
-              <w:rPr>
-                <w:sz w:val="20"/>
-                <w:szCs w:val="20"/>
-              </w:rPr>
-              <w:t>Production incidents</w:t>
-            </w:r>
-          </w:p>
-        </w:tc>
-        <w:tc>
-          <w:tcPr>
-            <w:tcW w:w="3300" w:type="dxa"/>
-            <w:tcBorders>
-              <w:top w:val="single" w:sz="4" w:space="0" w:color="BFBFBF"/>
-              <w:left w:val="single" w:sz="4" w:space="0" w:color="BFBFBF"/>
-              <w:bottom w:val="single" w:sz="4" w:space="0" w:color="BFBFBF"/>
-              <w:right w:val="single" w:sz="4" w:space="0" w:color="BFBFBF"/>
-            </w:tcBorders>
-            <w:shd w:val="clear" w:color="auto" w:fill="FFFFFF"/>
-            <w:tcMar>
-              <w:top w:w="70" w:type="dxa"/>
-              <w:left w:w="110" w:type="dxa"/>
-              <w:bottom w:w="70" w:type="dxa"/>
-              <w:right w:w="110" w:type="dxa"/>
-            </w:tcMar>
-            <w:vAlign w:val="center"/>
-          </w:tcPr>
-          <w:p>
-            <w:pPr>
-              <w:spacing w:line="252" w:lineRule="auto"/>
-            </w:pPr>
-            <w:r>
-              <w:rPr>
-                <w:sz w:val="20"/>
-                <w:szCs w:val="20"/>
-              </w:rPr>
-              <w:t>Large, risky releases that are hard to diagnose</w:t>
-            </w:r>
-          </w:p>
-        </w:tc>
-        <w:tc>
-          <w:tcPr>
-            <w:tcW w:w="3426" w:type="dxa"/>
-            <w:tcBorders>
-              <w:top w:val="single" w:sz="4" w:space="0" w:color="BFBFBF"/>
-              <w:left w:val="single" w:sz="4" w:space="0" w:color="BFBFBF"/>
-              <w:bottom w:val="single" w:sz="4" w:space="0" w:color="BFBFBF"/>
-              <w:right w:val="single" w:sz="4" w:space="0" w:color="BFBFBF"/>
-            </w:tcBorders>
-            <w:shd w:val="clear" w:color="auto" w:fill="FFFFFF"/>
-            <w:tcMar>
-              <w:top w:w="70" w:type="dxa"/>
-              <w:left w:w="110" w:type="dxa"/>
-              <w:bottom w:w="70" w:type="dxa"/>
-              <w:right w:w="110" w:type="dxa"/>
-            </w:tcMar>
-            <w:vAlign w:val="center"/>
-          </w:tcPr>
-          <w:p>
-            <w:pPr>
-              <w:spacing w:line="252" w:lineRule="auto"/>
-            </w:pPr>
-            <w:r>
-              <w:rPr>
-                <w:sz w:val="20"/>
-                <w:szCs w:val="20"/>
-              </w:rPr>
-              <w:t>Small changes, quick detection and automated rollback</w:t>
-            </w:r>
-          </w:p>
-        </w:tc>
-      </w:tr>
-    </w:tbl>
-    <w:p>
-      <w:pPr>
-        <w:spacing w:after="160"/>
-      </w:pPr>
-    </w:p>
-    <w:p>
-      <w:pPr>
-        <w:pStyle w:val="Heading2"/>
-      </w:pPr>
-      <w:bookmarkStart w:id="20" w:name="_Toc241757565"/>
-      <w:r>
-        <w:t>3.5 Outcomes at Capital One</w:t>
-      </w:r>
-      <w:bookmarkEnd w:id="20"/>
-    </w:p>
-    <w:p>
-      <w:pPr>
-        <w:pStyle w:val="ListParagraph"/>
-        <w:numPr>
-          <w:ilvl w:val="0"/>
-          <w:numId w:val="3"/>
-        </w:numPr>
-        <w:spacing w:after="80" w:line="264" w:lineRule="auto"/>
-        <w:jc w:val="both"/>
-      </w:pPr>
-      <w:r>
-        <w:t>Release cycles shrank from 6–9 months to weeks and, for many teams, to frequent on-demand releases, while still satisfying regulatory requirements.</w:t>
-      </w:r>
-    </w:p>
-    <w:p>
-      <w:pPr>
-        <w:pStyle w:val="ListParagraph"/>
-        <w:numPr>
-          <w:ilvl w:val="0"/>
-          <w:numId w:val="3"/>
-        </w:numPr>
-        <w:spacing w:after="80" w:line="264" w:lineRule="auto"/>
-        <w:jc w:val="both"/>
-      </w:pPr>
-      <w:r>
-        <w:t>Capital One became one of the first major US banks to go “all-in” on the public cloud, exiting its own data centres in 2020.</w:t>
-      </w:r>
-    </w:p>
-    <w:p>
-      <w:pPr>
-        <w:pStyle w:val="ListParagraph"/>
-        <w:numPr>
-          <w:ilvl w:val="0"/>
-          <w:numId w:val="3"/>
-        </w:numPr>
-        <w:spacing w:after="80" w:line="264" w:lineRule="auto"/>
-        <w:jc w:val="both"/>
-      </w:pPr>
-      <w:r>
-        <w:t xml:space="preserve">Its open-source DevSecOps tools — </w:t>
-      </w:r>
-      <w:r>
-        <w:rPr>
-          <w:b/>
-          <w:bCs/>
-        </w:rPr>
-        <w:t>Cloud Custodian</w:t>
-      </w:r>
-      <w:r>
-        <w:t xml:space="preserve"> and </w:t>
-      </w:r>
-      <w:r>
-        <w:rPr>
-          <w:b/>
-          <w:bCs/>
-        </w:rPr>
-        <w:t>Hygieia</w:t>
-      </w:r>
-      <w:r>
-        <w:t xml:space="preserve"> — were adopted by many other organisations, evidence that the approach worked well enough to share.</w:t>
-      </w:r>
-    </w:p>
-    <w:p>
-      <w:pPr>
-        <w:pStyle w:val="ListParagraph"/>
-        <w:numPr>
-          <w:ilvl w:val="0"/>
-          <w:numId w:val="3"/>
-        </w:numPr>
-        <w:spacing w:after="80" w:line="264" w:lineRule="auto"/>
-        <w:jc w:val="both"/>
-      </w:pPr>
-      <w:r>
-        <w:t xml:space="preserve">Security and compliance shifted from being seen as blockers to being seen as </w:t>
-      </w:r>
-      <w:r>
-        <w:rPr>
-          <w:b/>
-          <w:bCs/>
-        </w:rPr>
-        <w:t>enablers</w:t>
-      </w:r>
-      <w:r>
-        <w:t xml:space="preserve"> of safe speed.</w:t>
-      </w:r>
-    </w:p>
-    <w:p>
-      <w:pPr>
-        <w:pStyle w:val="Heading2"/>
-      </w:pPr>
-      <w:bookmarkStart w:id="21" w:name="_Toc241757566"/>
-      <w:r>
-        <w:lastRenderedPageBreak/>
-        <w:t>3.6 Critical Analysis: Lessons from the 2019 Breach</w:t>
-      </w:r>
-      <w:bookmarkEnd w:id="21"/>
-    </w:p>
-    <w:p>
-      <w:pPr>
-        <w:spacing w:after="140" w:line="276" w:lineRule="auto"/>
-        <w:jc w:val="both"/>
-      </w:pPr>
-      <w:r>
-        <w:t xml:space="preserve">DevSecOps is not a silver bullet. In July 2019 Capital One disclosed a data breach affecting about </w:t>
-      </w:r>
-      <w:r>
-        <w:rPr>
-          <w:b/>
-          <w:bCs/>
-        </w:rPr>
-        <w:t>100 million people in the US and 6 million in Canada</w:t>
-      </w:r>
-      <w:r>
-        <w:t xml:space="preserve">. An attacker exploited a </w:t>
-      </w:r>
-      <w:r>
-        <w:rPr>
-          <w:b/>
-          <w:bCs/>
-        </w:rPr>
-        <w:t>misconfigured web application firewall</w:t>
-      </w:r>
-      <w:r>
-        <w:t xml:space="preserve"> to obtain cloud credentials that had broader permissions than necessary, and used them to access data in cloud storage. In 2020 the OCC fined Capital One </w:t>
-      </w:r>
-      <w:r>
-        <w:rPr>
-          <w:b/>
-          <w:bCs/>
-        </w:rPr>
-        <w:t>US $80 million</w:t>
-      </w:r>
-      <w:r>
-        <w:t>, citing weaknesses in risk management around its cloud migration.</w:t>
-      </w:r>
-    </w:p>
-    <w:p>
-      <w:pPr>
-        <w:pStyle w:val="ListParagraph"/>
-        <w:numPr>
-          <w:ilvl w:val="0"/>
-          <w:numId w:val="3"/>
-        </w:numPr>
-        <w:spacing w:after="80" w:line="264" w:lineRule="auto"/>
-        <w:jc w:val="both"/>
-      </w:pPr>
-      <w:r>
-        <w:rPr>
-          <w:b/>
-          <w:bCs/>
-        </w:rPr>
-        <w:t>Shift-left must include infrastructure and identity:</w:t>
-      </w:r>
-      <w:r>
-        <w:t xml:space="preserve"> cloud configuration (infrastructure-as-code scanning) and least-privilege access (IAM) need the same automated checks as application code.</w:t>
-      </w:r>
-    </w:p>
-    <w:p>
-      <w:pPr>
-        <w:pStyle w:val="ListParagraph"/>
-        <w:numPr>
-          <w:ilvl w:val="0"/>
-          <w:numId w:val="3"/>
-        </w:numPr>
-        <w:spacing w:after="80" w:line="264" w:lineRule="auto"/>
-        <w:jc w:val="both"/>
-      </w:pPr>
-      <w:r>
-        <w:rPr>
-          <w:b/>
-          <w:bCs/>
-        </w:rPr>
-        <w:t>“Shift right” is still needed:</w:t>
-      </w:r>
-      <w:r>
-        <w:t xml:space="preserve"> runtime monitoring, anomaly detection and rapid incident response must complement pre-production checks.</w:t>
-      </w:r>
-    </w:p>
-    <w:p>
-      <w:pPr>
-        <w:pStyle w:val="ListParagraph"/>
-        <w:numPr>
-          <w:ilvl w:val="0"/>
-          <w:numId w:val="3"/>
-        </w:numPr>
-        <w:spacing w:after="80" w:line="264" w:lineRule="auto"/>
-        <w:jc w:val="both"/>
-      </w:pPr>
-      <w:r>
-        <w:rPr>
-          <w:b/>
-          <w:bCs/>
-        </w:rPr>
-        <w:t>Governance must keep pace with speed:</w:t>
-      </w:r>
-      <w:r>
-        <w:t xml:space="preserve"> risk-management and oversight processes must evolve as fast as engineering practices do.</w:t>
-      </w:r>
-    </w:p>
-    <w:p>
-      <w:pPr>
-        <w:spacing w:after="140" w:line="276" w:lineRule="auto"/>
-        <w:jc w:val="both"/>
-      </w:pPr>
-      <w:r>
-        <w:t xml:space="preserve">Importantly, the root cause — a misconfiguration combined with excessive permissions — is exactly the kind of issue that automated policy-as-code and continuous compliance are designed to catch. The breach therefore strengthens the case for applying DevSecOps </w:t>
-      </w:r>
-      <w:r>
-        <w:rPr>
-          <w:b/>
-          <w:bCs/>
-        </w:rPr>
-        <w:t>more completely</w:t>
-      </w:r>
-      <w:r>
-        <w:t>, not for abandoning it.</w:t>
-      </w:r>
-    </w:p>
-    <w:p>
-      <w:pPr>
-        <w:spacing w:after="60"/>
-      </w:pPr>
-    </w:p>
-    <w:tbl>
-      <w:tblPr>
-        <w:tblW w:w="9026" w:type="dxa"/>
-        <w:tblBorders>
-          <w:top w:val="single" w:sz="4" w:space="0" w:color="auto"/>
-          <w:left w:val="single" w:sz="4" w:space="0" w:color="auto"/>
-          <w:bottom w:val="single" w:sz="4" w:space="0" w:color="auto"/>
-          <w:right w:val="single" w:sz="4" w:space="0" w:color="auto"/>
-          <w:insideH w:val="single" w:sz="4" w:space="0" w:color="auto"/>
-          <w:insideV w:val="single" w:sz="4" w:space="0" w:color="auto"/>
-        </w:tblBorders>
-        <w:tblCellMar>
-          <w:left w:w="10" w:type="dxa"/>
-          <w:right w:w="10" w:type="dxa"/>
-        </w:tblCellMar>
-        <w:tblLook w:val="04A0" w:firstRow="1" w:lastRow="0" w:firstColumn="1" w:lastColumn="0" w:noHBand="0" w:noVBand="1"/>
-      </w:tblPr>
-      <w:tblGrid>
-        <w:gridCol w:w="9026"/>
-      </w:tblGrid>
-      <w:tr>
-        <w:tblPrEx>
-          <w:tblCellMar>
-            <w:top w:w="0" w:type="dxa"/>
-            <w:bottom w:w="0" w:type="dxa"/>
-          </w:tblCellMar>
-        </w:tblPrEx>
-        <w:tc>
-          <w:tcPr>
-            <w:tcW w:w="9026" w:type="dxa"/>
-            <w:tcBorders>
-              <w:top w:val="none" w:sz="0" w:space="0" w:color="FFFFFF"/>
-              <w:left w:val="single" w:sz="24" w:space="0" w:color="D9730D"/>
-              <w:bottom w:val="none" w:sz="0" w:space="0" w:color="FFFFFF"/>
-              <w:right w:val="none" w:sz="0" w:space="0" w:color="FFFFFF"/>
-            </w:tcBorders>
-            <w:shd w:val="clear" w:color="auto" w:fill="FFF5E6"/>
-            <w:tcMar>
-              <w:top w:w="140" w:type="dxa"/>
-              <w:left w:w="220" w:type="dxa"/>
-              <w:bottom w:w="140" w:type="dxa"/>
-              <w:right w:w="220" w:type="dxa"/>
-            </w:tcMar>
-          </w:tcPr>
-          <w:p>
-            <w:pPr>
-              <w:spacing w:after="60"/>
-            </w:pPr>
-            <w:r>
-              <w:rPr>
-                <w:b/>
-                <w:bCs/>
-                <w:color w:val="B45309"/>
-              </w:rPr>
-              <w:t>Key takeaway</w:t>
-            </w:r>
-          </w:p>
-          <w:p>
-            <w:pPr>
-              <w:spacing w:after="40" w:line="264" w:lineRule="auto"/>
-              <w:jc w:val="both"/>
-            </w:pPr>
-            <w:r>
-              <w:t xml:space="preserve">In a regulated industry, embedding automated security and compliance into every stage of the pipeline turns security from a slow final gate into continuous, low-cost guardrails. This shortens release cycles, produces better audit evidence and reduces production incidents — proving that, done properly, </w:t>
-            </w:r>
-            <w:r>
-              <w:rPr>
-                <w:b/>
-                <w:bCs/>
-              </w:rPr>
-              <w:t>security and speed are allies, not opposites</w:t>
-            </w:r>
-            <w:r>
-              <w:t>.</w:t>
-            </w:r>
-          </w:p>
-        </w:tc>
-      </w:tr>
-    </w:tbl>
-    <w:p>
-      <w:pPr>
-        <w:spacing w:after="120"/>
-      </w:pPr>
-    </w:p>
-    <w:p>
-      <w:pPr>
-        <w:pStyle w:val="Heading2"/>
-      </w:pPr>
-      <w:bookmarkStart w:id="22" w:name="_Toc241757567"/>
-      <w:r>
-        <w:t>3.7 Conclusion</w:t>
-      </w:r>
-      <w:bookmarkEnd w:id="22"/>
-    </w:p>
-    <w:p>
-      <w:pPr>
-        <w:spacing w:after="140" w:line="276" w:lineRule="auto"/>
-        <w:jc w:val="both"/>
-      </w:pPr>
-      <w:r>
-        <w:t>Capital One faced the classic banking dilemma of needing to innovate quickly while meeting stringent security and regulatory standards. Its DevSecOps approach resolved this dilemma by shifting security left into design and coding, automating security scanning and compliance checks as pipeline gates, expressing policies as code and generating audit evidence automatically. Security stopped being a six-month bottleneck at the end of the process and became a fast, continuous feedback loop — accelerating innovat</w:t>
-      </w:r>
-      <w:r>
-        <w:t>ion and reducing production incidents at the same time.</w:t>
-      </w:r>
-    </w:p>
-    <w:p>
-      <w:pPr>
-        <w:pStyle w:val="Heading1"/>
-        <w:pageBreakBefore/>
-      </w:pPr>
-      <w:bookmarkStart w:id="23" w:name="_Toc241757568"/>
-      <w:r>
-        <w:lastRenderedPageBreak/>
-        <w:t>Comparative Summary</w:t>
-      </w:r>
-      <w:bookmarkEnd w:id="23"/>
-    </w:p>
-    <w:p>
-      <w:pPr>
-        <w:spacing w:after="140" w:line="276" w:lineRule="auto"/>
-        <w:jc w:val="both"/>
-      </w:pPr>
-      <w:r>
-        <w:t>Although the three companies operate in different industries, their DevOps journeys share a common pattern: a painful limitation of the old way of working led to changes in architecture, organisation and automation, producing delivery that is both faster and safer.</w:t>
-      </w:r>
-    </w:p>
-    <w:p>
-      <w:pPr>
-        <w:keepNext/>
-        <w:spacing w:before="120" w:after="80"/>
-      </w:pPr>
-      <w:r>
-        <w:rPr>
-          <w:b/>
-          <w:bCs/>
-          <w:color w:val="1F3864"/>
-          <w:sz w:val="20"/>
-          <w:szCs w:val="20"/>
-        </w:rPr>
-        <w:t>Table 4.1: The three case studies at a glance</w:t>
-      </w:r>
-    </w:p>
-    <w:tbl>
-      <w:tblPr>
-        <w:tblW w:w="9026" w:type="dxa"/>
-        <w:tblBorders>
-          <w:top w:val="single" w:sz="4" w:space="0" w:color="auto"/>
-          <w:left w:val="single" w:sz="4" w:space="0" w:color="auto"/>
-          <w:bottom w:val="single" w:sz="4" w:space="0" w:color="auto"/>
-          <w:right w:val="single" w:sz="4" w:space="0" w:color="auto"/>
-          <w:insideH w:val="single" w:sz="4" w:space="0" w:color="auto"/>
-          <w:insideV w:val="single" w:sz="4" w:space="0" w:color="auto"/>
-        </w:tblBorders>
-        <w:tblLayout w:type="fixed"/>
-        <w:tblCellMar>
-          <w:left w:w="10" w:type="dxa"/>
-          <w:right w:w="10" w:type="dxa"/>
-        </w:tblCellMar>
-        <w:tblLook w:val="04A0" w:firstRow="1" w:lastRow="0" w:firstColumn="1" w:lastColumn="0" w:noHBand="0" w:noVBand="1"/>
-      </w:tblPr>
-      <w:tblGrid>
-        <w:gridCol w:w="1800"/>
-        <w:gridCol w:w="2400"/>
-        <w:gridCol w:w="2400"/>
-        <w:gridCol w:w="2426"/>
-      </w:tblGrid>
-      <w:tr>
-        <w:tblPrEx>
-          <w:tblCellMar>
-            <w:top w:w="0" w:type="dxa"/>
-            <w:bottom w:w="0" w:type="dxa"/>
-          </w:tblCellMar>
-        </w:tblPrEx>
-        <w:trPr>
-          <w:tblHeader/>
-        </w:trPr>
-        <w:tc>
-          <w:tcPr>
-            <w:tcW w:w="1800" w:type="dxa"/>
+            <w:tcW w:w="2026" w:type="dxa"/>
             <w:tcBorders>
               <w:top w:val="single" w:sz="4" w:space="0" w:color="BFBFBF"/>
               <w:left w:val="single" w:sz="4" w:space="0" w:color="BFBFBF"/>
@@ -9810,7 +6645,7 @@
         </w:tc>
         <w:tc>
           <w:tcPr>
-            <w:tcW w:w="2400" w:type="dxa"/>
+            <w:tcW w:w="3500" w:type="dxa"/>
             <w:tcBorders>
               <w:top w:val="single" w:sz="4" w:space="0" w:color="BFBFBF"/>
               <w:left w:val="single" w:sz="4" w:space="0" w:color="BFBFBF"/>
@@ -9844,7 +6679,7 @@
         </w:tc>
         <w:tc>
           <w:tcPr>
-            <w:tcW w:w="2400" w:type="dxa"/>
+            <w:tcW w:w="3500" w:type="dxa"/>
             <w:tcBorders>
               <w:top w:val="single" w:sz="4" w:space="0" w:color="BFBFBF"/>
               <w:left w:val="single" w:sz="4" w:space="0" w:color="BFBFBF"/>
@@ -9876,54 +6711,14 @@
             </w:r>
           </w:p>
         </w:tc>
-        <w:tc>
-          <w:tcPr>
-            <w:tcW w:w="2426" w:type="dxa"/>
-            <w:tcBorders>
-              <w:top w:val="single" w:sz="4" w:space="0" w:color="BFBFBF"/>
-              <w:left w:val="single" w:sz="4" w:space="0" w:color="BFBFBF"/>
-              <w:bottom w:val="single" w:sz="4" w:space="0" w:color="BFBFBF"/>
-              <w:right w:val="single" w:sz="4" w:space="0" w:color="BFBFBF"/>
-            </w:tcBorders>
-            <w:shd w:val="clear" w:color="auto" w:fill="1F3864"/>
-            <w:tcMar>
-              <w:top w:w="70" w:type="dxa"/>
-              <w:left w:w="110" w:type="dxa"/>
-              <w:bottom w:w="70" w:type="dxa"/>
-              <w:right w:w="110" w:type="dxa"/>
-            </w:tcMar>
-            <w:vAlign w:val="center"/>
-          </w:tcPr>
-          <w:p>
-            <w:pPr>
-              <w:spacing w:line="252" w:lineRule="auto"/>
-            </w:pPr>
-            <w:r>
-              <w:rPr>
-                <w:b/>
-                <w:bCs/>
-                <w:color w:val="FFFFFF"/>
-                <w:sz w:val="20"/>
-                <w:szCs w:val="20"/>
-              </w:rPr>
-              <w:t>Capital One</w:t>
-            </w:r>
-          </w:p>
-        </w:tc>
       </w:tr>
       <w:tr>
-        <w:tblPrEx>
-          <w:tblCellMar>
-            <w:top w:w="0" w:type="dxa"/>
-            <w:bottom w:w="0" w:type="dxa"/>
-          </w:tblCellMar>
-        </w:tblPrEx>
         <w:trPr>
           <w:cantSplit/>
         </w:trPr>
         <w:tc>
           <w:tcPr>
-            <w:tcW w:w="1800" w:type="dxa"/>
+            <w:tcW w:w="2026" w:type="dxa"/>
             <w:tcBorders>
               <w:top w:val="single" w:sz="4" w:space="0" w:color="BFBFBF"/>
               <w:left w:val="single" w:sz="4" w:space="0" w:color="BFBFBF"/>
@@ -9954,7 +6749,7 @@
         </w:tc>
         <w:tc>
           <w:tcPr>
-            <w:tcW w:w="2400" w:type="dxa"/>
+            <w:tcW w:w="3500" w:type="dxa"/>
             <w:tcBorders>
               <w:top w:val="single" w:sz="4" w:space="0" w:color="BFBFBF"/>
               <w:left w:val="single" w:sz="4" w:space="0" w:color="BFBFBF"/>
@@ -9985,7 +6780,7 @@
         </w:tc>
         <w:tc>
           <w:tcPr>
-            <w:tcW w:w="2400" w:type="dxa"/>
+            <w:tcW w:w="3500" w:type="dxa"/>
             <w:tcBorders>
               <w:top w:val="single" w:sz="4" w:space="0" w:color="BFBFBF"/>
               <w:left w:val="single" w:sz="4" w:space="0" w:color="BFBFBF"/>
@@ -10014,9 +6809,112 @@
             </w:r>
           </w:p>
         </w:tc>
+      </w:tr>
+      <w:tr>
+        <w:trPr>
+          <w:cantSplit/>
+        </w:trPr>
         <w:tc>
           <w:tcPr>
-            <w:tcW w:w="2426" w:type="dxa"/>
+            <w:tcW w:w="2026" w:type="dxa"/>
+            <w:tcBorders>
+              <w:top w:val="single" w:sz="4" w:space="0" w:color="BFBFBF"/>
+              <w:left w:val="single" w:sz="4" w:space="0" w:color="BFBFBF"/>
+              <w:bottom w:val="single" w:sz="4" w:space="0" w:color="BFBFBF"/>
+              <w:right w:val="single" w:sz="4" w:space="0" w:color="BFBFBF"/>
+            </w:tcBorders>
+            <w:shd w:val="clear" w:color="auto" w:fill="F3F6FA"/>
+            <w:tcMar>
+              <w:top w:w="70" w:type="dxa"/>
+              <w:left w:w="110" w:type="dxa"/>
+              <w:bottom w:w="70" w:type="dxa"/>
+              <w:right w:w="110" w:type="dxa"/>
+            </w:tcMar>
+            <w:vAlign w:val="center"/>
+          </w:tcPr>
+          <w:p>
+            <w:pPr>
+              <w:spacing w:line="252" w:lineRule="auto"/>
+            </w:pPr>
+            <w:r>
+              <w:rPr>
+                <w:sz w:val="20"/>
+                <w:szCs w:val="20"/>
+              </w:rPr>
+              <w:t>Key architecture change</w:t>
+            </w:r>
+          </w:p>
+        </w:tc>
+        <w:tc>
+          <w:tcPr>
+            <w:tcW w:w="3500" w:type="dxa"/>
+            <w:tcBorders>
+              <w:top w:val="single" w:sz="4" w:space="0" w:color="BFBFBF"/>
+              <w:left w:val="single" w:sz="4" w:space="0" w:color="BFBFBF"/>
+              <w:bottom w:val="single" w:sz="4" w:space="0" w:color="BFBFBF"/>
+              <w:right w:val="single" w:sz="4" w:space="0" w:color="BFBFBF"/>
+            </w:tcBorders>
+            <w:shd w:val="clear" w:color="auto" w:fill="F3F6FA"/>
+            <w:tcMar>
+              <w:top w:w="70" w:type="dxa"/>
+              <w:left w:w="110" w:type="dxa"/>
+              <w:bottom w:w="70" w:type="dxa"/>
+              <w:right w:w="110" w:type="dxa"/>
+            </w:tcMar>
+            <w:vAlign w:val="center"/>
+          </w:tcPr>
+          <w:p>
+            <w:pPr>
+              <w:spacing w:line="252" w:lineRule="auto"/>
+            </w:pPr>
+            <w:r>
+              <w:rPr>
+                <w:sz w:val="20"/>
+                <w:szCs w:val="20"/>
+              </w:rPr>
+              <w:t>Cloud-native microservices on AWS, multi-region</w:t>
+            </w:r>
+          </w:p>
+        </w:tc>
+        <w:tc>
+          <w:tcPr>
+            <w:tcW w:w="3500" w:type="dxa"/>
+            <w:tcBorders>
+              <w:top w:val="single" w:sz="4" w:space="0" w:color="BFBFBF"/>
+              <w:left w:val="single" w:sz="4" w:space="0" w:color="BFBFBF"/>
+              <w:bottom w:val="single" w:sz="4" w:space="0" w:color="BFBFBF"/>
+              <w:right w:val="single" w:sz="4" w:space="0" w:color="BFBFBF"/>
+            </w:tcBorders>
+            <w:shd w:val="clear" w:color="auto" w:fill="F3F6FA"/>
+            <w:tcMar>
+              <w:top w:w="70" w:type="dxa"/>
+              <w:left w:w="110" w:type="dxa"/>
+              <w:bottom w:w="70" w:type="dxa"/>
+              <w:right w:w="110" w:type="dxa"/>
+            </w:tcMar>
+            <w:vAlign w:val="center"/>
+          </w:tcPr>
+          <w:p>
+            <w:pPr>
+              <w:spacing w:line="252" w:lineRule="auto"/>
+            </w:pPr>
+            <w:r>
+              <w:rPr>
+                <w:sz w:val="20"/>
+                <w:szCs w:val="20"/>
+              </w:rPr>
+              <w:t>Service-oriented architecture / microservices, API mandate</w:t>
+            </w:r>
+          </w:p>
+        </w:tc>
+      </w:tr>
+      <w:tr>
+        <w:trPr>
+          <w:cantSplit/>
+        </w:trPr>
+        <w:tc>
+          <w:tcPr>
+            <w:tcW w:w="2026" w:type="dxa"/>
             <w:tcBorders>
               <w:top w:val="single" w:sz="4" w:space="0" w:color="BFBFBF"/>
               <w:left w:val="single" w:sz="4" w:space="0" w:color="BFBFBF"/>
@@ -10041,24 +6939,80 @@
                 <w:sz w:val="20"/>
                 <w:szCs w:val="20"/>
               </w:rPr>
-              <w:t>6–9-month releases under strict security and regulatory requirements</w:t>
+              <w:t>Key organisational change</w:t>
+            </w:r>
+          </w:p>
+        </w:tc>
+        <w:tc>
+          <w:tcPr>
+            <w:tcW w:w="3500" w:type="dxa"/>
+            <w:tcBorders>
+              <w:top w:val="single" w:sz="4" w:space="0" w:color="BFBFBF"/>
+              <w:left w:val="single" w:sz="4" w:space="0" w:color="BFBFBF"/>
+              <w:bottom w:val="single" w:sz="4" w:space="0" w:color="BFBFBF"/>
+              <w:right w:val="single" w:sz="4" w:space="0" w:color="BFBFBF"/>
+            </w:tcBorders>
+            <w:shd w:val="clear" w:color="auto" w:fill="FFFFFF"/>
+            <w:tcMar>
+              <w:top w:w="70" w:type="dxa"/>
+              <w:left w:w="110" w:type="dxa"/>
+              <w:bottom w:w="70" w:type="dxa"/>
+              <w:right w:w="110" w:type="dxa"/>
+            </w:tcMar>
+            <w:vAlign w:val="center"/>
+          </w:tcPr>
+          <w:p>
+            <w:pPr>
+              <w:spacing w:line="252" w:lineRule="auto"/>
+            </w:pPr>
+            <w:r>
+              <w:rPr>
+                <w:sz w:val="20"/>
+                <w:szCs w:val="20"/>
+              </w:rPr>
+              <w:t>Freedom &amp; Responsibility; you build it, you run it</w:t>
+            </w:r>
+          </w:p>
+        </w:tc>
+        <w:tc>
+          <w:tcPr>
+            <w:tcW w:w="3500" w:type="dxa"/>
+            <w:tcBorders>
+              <w:top w:val="single" w:sz="4" w:space="0" w:color="BFBFBF"/>
+              <w:left w:val="single" w:sz="4" w:space="0" w:color="BFBFBF"/>
+              <w:bottom w:val="single" w:sz="4" w:space="0" w:color="BFBFBF"/>
+              <w:right w:val="single" w:sz="4" w:space="0" w:color="BFBFBF"/>
+            </w:tcBorders>
+            <w:shd w:val="clear" w:color="auto" w:fill="FFFFFF"/>
+            <w:tcMar>
+              <w:top w:w="70" w:type="dxa"/>
+              <w:left w:w="110" w:type="dxa"/>
+              <w:bottom w:w="70" w:type="dxa"/>
+              <w:right w:w="110" w:type="dxa"/>
+            </w:tcMar>
+            <w:vAlign w:val="center"/>
+          </w:tcPr>
+          <w:p>
+            <w:pPr>
+              <w:spacing w:line="252" w:lineRule="auto"/>
+            </w:pPr>
+            <w:r>
+              <w:rPr>
+                <w:sz w:val="20"/>
+                <w:szCs w:val="20"/>
+              </w:rPr>
+              <w:t>Two-pizza teams; single-threaded ownership</w:t>
             </w:r>
           </w:p>
         </w:tc>
       </w:tr>
       <w:tr>
-        <w:tblPrEx>
-          <w:tblCellMar>
-            <w:top w:w="0" w:type="dxa"/>
-            <w:bottom w:w="0" w:type="dxa"/>
-          </w:tblCellMar>
-        </w:tblPrEx>
         <w:trPr>
           <w:cantSplit/>
         </w:trPr>
         <w:tc>
           <w:tcPr>
-            <w:tcW w:w="1800" w:type="dxa"/>
+            <w:tcW w:w="2026" w:type="dxa"/>
             <w:tcBorders>
               <w:top w:val="single" w:sz="4" w:space="0" w:color="BFBFBF"/>
               <w:left w:val="single" w:sz="4" w:space="0" w:color="BFBFBF"/>
@@ -10083,13 +7037,13 @@
                 <w:sz w:val="20"/>
                 <w:szCs w:val="20"/>
               </w:rPr>
-              <w:t>Key architecture change</w:t>
+              <w:t>Signature practice</w:t>
             </w:r>
           </w:p>
         </w:tc>
         <w:tc>
           <w:tcPr>
-            <w:tcW w:w="2400" w:type="dxa"/>
+            <w:tcW w:w="3500" w:type="dxa"/>
             <w:tcBorders>
               <w:top w:val="single" w:sz="4" w:space="0" w:color="BFBFBF"/>
               <w:left w:val="single" w:sz="4" w:space="0" w:color="BFBFBF"/>
@@ -10114,13 +7068,13 @@
                 <w:sz w:val="20"/>
                 <w:szCs w:val="20"/>
               </w:rPr>
-              <w:t>Cloud-native microservices on AWS, multi-region</w:t>
+              <w:t>Chaos Engineering (Chaos Monkey, Simian Army)</w:t>
             </w:r>
           </w:p>
         </w:tc>
         <w:tc>
           <w:tcPr>
-            <w:tcW w:w="2400" w:type="dxa"/>
+            <w:tcW w:w="3500" w:type="dxa"/>
             <w:tcBorders>
               <w:top w:val="single" w:sz="4" w:space="0" w:color="BFBFBF"/>
               <w:left w:val="single" w:sz="4" w:space="0" w:color="BFBFBF"/>
@@ -10145,55 +7099,18 @@
                 <w:sz w:val="20"/>
                 <w:szCs w:val="20"/>
               </w:rPr>
-              <w:t>Service-oriented architecture / microservices, API mandate</w:t>
-            </w:r>
-          </w:p>
-        </w:tc>
-        <w:tc>
-          <w:tcPr>
-            <w:tcW w:w="2426" w:type="dxa"/>
-            <w:tcBorders>
-              <w:top w:val="single" w:sz="4" w:space="0" w:color="BFBFBF"/>
-              <w:left w:val="single" w:sz="4" w:space="0" w:color="BFBFBF"/>
-              <w:bottom w:val="single" w:sz="4" w:space="0" w:color="BFBFBF"/>
-              <w:right w:val="single" w:sz="4" w:space="0" w:color="BFBFBF"/>
-            </w:tcBorders>
-            <w:shd w:val="clear" w:color="auto" w:fill="F3F6FA"/>
-            <w:tcMar>
-              <w:top w:w="70" w:type="dxa"/>
-              <w:left w:w="110" w:type="dxa"/>
-              <w:bottom w:w="70" w:type="dxa"/>
-              <w:right w:w="110" w:type="dxa"/>
-            </w:tcMar>
-            <w:vAlign w:val="center"/>
-          </w:tcPr>
-          <w:p>
-            <w:pPr>
-              <w:spacing w:line="252" w:lineRule="auto"/>
-            </w:pPr>
-            <w:r>
-              <w:rPr>
-                <w:sz w:val="20"/>
-                <w:szCs w:val="20"/>
-              </w:rPr>
-              <w:t>Cloud migration, standardised pipelines, immutable infrastructure</w:t>
+              <w:t>Automated per-service deployment and experimentation</w:t>
             </w:r>
           </w:p>
         </w:tc>
       </w:tr>
       <w:tr>
-        <w:tblPrEx>
-          <w:tblCellMar>
-            <w:top w:w="0" w:type="dxa"/>
-            <w:bottom w:w="0" w:type="dxa"/>
-          </w:tblCellMar>
-        </w:tblPrEx>
         <w:trPr>
           <w:cantSplit/>
         </w:trPr>
         <w:tc>
           <w:tcPr>
-            <w:tcW w:w="1800" w:type="dxa"/>
+            <w:tcW w:w="2026" w:type="dxa"/>
             <w:tcBorders>
               <w:top w:val="single" w:sz="4" w:space="0" w:color="BFBFBF"/>
               <w:left w:val="single" w:sz="4" w:space="0" w:color="BFBFBF"/>
@@ -10218,13 +7135,13 @@
                 <w:sz w:val="20"/>
                 <w:szCs w:val="20"/>
               </w:rPr>
-              <w:t>Key organisational change</w:t>
+              <w:t>Main outcome</w:t>
             </w:r>
           </w:p>
         </w:tc>
         <w:tc>
           <w:tcPr>
-            <w:tcW w:w="2400" w:type="dxa"/>
+            <w:tcW w:w="3500" w:type="dxa"/>
             <w:tcBorders>
               <w:top w:val="single" w:sz="4" w:space="0" w:color="BFBFBF"/>
               <w:left w:val="single" w:sz="4" w:space="0" w:color="BFBFBF"/>
@@ -10249,13 +7166,13 @@
                 <w:sz w:val="20"/>
                 <w:szCs w:val="20"/>
               </w:rPr>
-              <w:t>Freedom &amp; Responsibility; you build it, you run it</w:t>
+              <w:t>Resilient, globally scalable streaming</w:t>
             </w:r>
           </w:p>
         </w:tc>
         <w:tc>
           <w:tcPr>
-            <w:tcW w:w="2400" w:type="dxa"/>
+            <w:tcW w:w="3500" w:type="dxa"/>
             <w:tcBorders>
               <w:top w:val="single" w:sz="4" w:space="0" w:color="BFBFBF"/>
               <w:left w:val="single" w:sz="4" w:space="0" w:color="BFBFBF"/>
@@ -10280,308 +7197,7 @@
                 <w:sz w:val="20"/>
                 <w:szCs w:val="20"/>
               </w:rPr>
-              <w:t>Two-pizza teams; single-threaded ownership</w:t>
-            </w:r>
-          </w:p>
-        </w:tc>
-        <w:tc>
-          <w:tcPr>
-            <w:tcW w:w="2426" w:type="dxa"/>
-            <w:tcBorders>
-              <w:top w:val="single" w:sz="4" w:space="0" w:color="BFBFBF"/>
-              <w:left w:val="single" w:sz="4" w:space="0" w:color="BFBFBF"/>
-              <w:bottom w:val="single" w:sz="4" w:space="0" w:color="BFBFBF"/>
-              <w:right w:val="single" w:sz="4" w:space="0" w:color="BFBFBF"/>
-            </w:tcBorders>
-            <w:shd w:val="clear" w:color="auto" w:fill="FFFFFF"/>
-            <w:tcMar>
-              <w:top w:w="70" w:type="dxa"/>
-              <w:left w:w="110" w:type="dxa"/>
-              <w:bottom w:w="70" w:type="dxa"/>
-              <w:right w:w="110" w:type="dxa"/>
-            </w:tcMar>
-            <w:vAlign w:val="center"/>
-          </w:tcPr>
-          <w:p>
-            <w:pPr>
-              <w:spacing w:line="252" w:lineRule="auto"/>
-            </w:pPr>
-            <w:r>
-              <w:rPr>
-                <w:sz w:val="20"/>
-                <w:szCs w:val="20"/>
-              </w:rPr>
-              <w:t>In-house engineering; security as shared responsibility</w:t>
-            </w:r>
-          </w:p>
-        </w:tc>
-      </w:tr>
-      <w:tr>
-        <w:tblPrEx>
-          <w:tblCellMar>
-            <w:top w:w="0" w:type="dxa"/>
-            <w:bottom w:w="0" w:type="dxa"/>
-          </w:tblCellMar>
-        </w:tblPrEx>
-        <w:trPr>
-          <w:cantSplit/>
-        </w:trPr>
-        <w:tc>
-          <w:tcPr>
-            <w:tcW w:w="1800" w:type="dxa"/>
-            <w:tcBorders>
-              <w:top w:val="single" w:sz="4" w:space="0" w:color="BFBFBF"/>
-              <w:left w:val="single" w:sz="4" w:space="0" w:color="BFBFBF"/>
-              <w:bottom w:val="single" w:sz="4" w:space="0" w:color="BFBFBF"/>
-              <w:right w:val="single" w:sz="4" w:space="0" w:color="BFBFBF"/>
-            </w:tcBorders>
-            <w:shd w:val="clear" w:color="auto" w:fill="F3F6FA"/>
-            <w:tcMar>
-              <w:top w:w="70" w:type="dxa"/>
-              <w:left w:w="110" w:type="dxa"/>
-              <w:bottom w:w="70" w:type="dxa"/>
-              <w:right w:w="110" w:type="dxa"/>
-            </w:tcMar>
-            <w:vAlign w:val="center"/>
-          </w:tcPr>
-          <w:p>
-            <w:pPr>
-              <w:spacing w:line="252" w:lineRule="auto"/>
-            </w:pPr>
-            <w:r>
-              <w:rPr>
-                <w:sz w:val="20"/>
-                <w:szCs w:val="20"/>
-              </w:rPr>
-              <w:t>Signature practice</w:t>
-            </w:r>
-          </w:p>
-        </w:tc>
-        <w:tc>
-          <w:tcPr>
-            <w:tcW w:w="2400" w:type="dxa"/>
-            <w:tcBorders>
-              <w:top w:val="single" w:sz="4" w:space="0" w:color="BFBFBF"/>
-              <w:left w:val="single" w:sz="4" w:space="0" w:color="BFBFBF"/>
-              <w:bottom w:val="single" w:sz="4" w:space="0" w:color="BFBFBF"/>
-              <w:right w:val="single" w:sz="4" w:space="0" w:color="BFBFBF"/>
-            </w:tcBorders>
-            <w:shd w:val="clear" w:color="auto" w:fill="F3F6FA"/>
-            <w:tcMar>
-              <w:top w:w="70" w:type="dxa"/>
-              <w:left w:w="110" w:type="dxa"/>
-              <w:bottom w:w="70" w:type="dxa"/>
-              <w:right w:w="110" w:type="dxa"/>
-            </w:tcMar>
-            <w:vAlign w:val="center"/>
-          </w:tcPr>
-          <w:p>
-            <w:pPr>
-              <w:spacing w:line="252" w:lineRule="auto"/>
-            </w:pPr>
-            <w:r>
-              <w:rPr>
-                <w:sz w:val="20"/>
-                <w:szCs w:val="20"/>
-              </w:rPr>
-              <w:t>Chaos Engineering (Chaos Monkey, Simian Army)</w:t>
-            </w:r>
-          </w:p>
-        </w:tc>
-        <w:tc>
-          <w:tcPr>
-            <w:tcW w:w="2400" w:type="dxa"/>
-            <w:tcBorders>
-              <w:top w:val="single" w:sz="4" w:space="0" w:color="BFBFBF"/>
-              <w:left w:val="single" w:sz="4" w:space="0" w:color="BFBFBF"/>
-              <w:bottom w:val="single" w:sz="4" w:space="0" w:color="BFBFBF"/>
-              <w:right w:val="single" w:sz="4" w:space="0" w:color="BFBFBF"/>
-            </w:tcBorders>
-            <w:shd w:val="clear" w:color="auto" w:fill="F3F6FA"/>
-            <w:tcMar>
-              <w:top w:w="70" w:type="dxa"/>
-              <w:left w:w="110" w:type="dxa"/>
-              <w:bottom w:w="70" w:type="dxa"/>
-              <w:right w:w="110" w:type="dxa"/>
-            </w:tcMar>
-            <w:vAlign w:val="center"/>
-          </w:tcPr>
-          <w:p>
-            <w:pPr>
-              <w:spacing w:line="252" w:lineRule="auto"/>
-            </w:pPr>
-            <w:r>
-              <w:rPr>
-                <w:sz w:val="20"/>
-                <w:szCs w:val="20"/>
-              </w:rPr>
-              <w:t>Automated per-service deployment and experimentation</w:t>
-            </w:r>
-          </w:p>
-        </w:tc>
-        <w:tc>
-          <w:tcPr>
-            <w:tcW w:w="2426" w:type="dxa"/>
-            <w:tcBorders>
-              <w:top w:val="single" w:sz="4" w:space="0" w:color="BFBFBF"/>
-              <w:left w:val="single" w:sz="4" w:space="0" w:color="BFBFBF"/>
-              <w:bottom w:val="single" w:sz="4" w:space="0" w:color="BFBFBF"/>
-              <w:right w:val="single" w:sz="4" w:space="0" w:color="BFBFBF"/>
-            </w:tcBorders>
-            <w:shd w:val="clear" w:color="auto" w:fill="F3F6FA"/>
-            <w:tcMar>
-              <w:top w:w="70" w:type="dxa"/>
-              <w:left w:w="110" w:type="dxa"/>
-              <w:bottom w:w="70" w:type="dxa"/>
-              <w:right w:w="110" w:type="dxa"/>
-            </w:tcMar>
-            <w:vAlign w:val="center"/>
-          </w:tcPr>
-          <w:p>
-            <w:pPr>
-              <w:spacing w:line="252" w:lineRule="auto"/>
-            </w:pPr>
-            <w:r>
-              <w:rPr>
-                <w:sz w:val="20"/>
-                <w:szCs w:val="20"/>
-              </w:rPr>
-              <w:t>DevSecOps: shift-left, automated security gates, compliance as code</w:t>
-            </w:r>
-          </w:p>
-        </w:tc>
-      </w:tr>
-      <w:tr>
-        <w:tblPrEx>
-          <w:tblCellMar>
-            <w:top w:w="0" w:type="dxa"/>
-            <w:bottom w:w="0" w:type="dxa"/>
-          </w:tblCellMar>
-        </w:tblPrEx>
-        <w:trPr>
-          <w:cantSplit/>
-        </w:trPr>
-        <w:tc>
-          <w:tcPr>
-            <w:tcW w:w="1800" w:type="dxa"/>
-            <w:tcBorders>
-              <w:top w:val="single" w:sz="4" w:space="0" w:color="BFBFBF"/>
-              <w:left w:val="single" w:sz="4" w:space="0" w:color="BFBFBF"/>
-              <w:bottom w:val="single" w:sz="4" w:space="0" w:color="BFBFBF"/>
-              <w:right w:val="single" w:sz="4" w:space="0" w:color="BFBFBF"/>
-            </w:tcBorders>
-            <w:shd w:val="clear" w:color="auto" w:fill="FFFFFF"/>
-            <w:tcMar>
-              <w:top w:w="70" w:type="dxa"/>
-              <w:left w:w="110" w:type="dxa"/>
-              <w:bottom w:w="70" w:type="dxa"/>
-              <w:right w:w="110" w:type="dxa"/>
-            </w:tcMar>
-            <w:vAlign w:val="center"/>
-          </w:tcPr>
-          <w:p>
-            <w:pPr>
-              <w:spacing w:line="252" w:lineRule="auto"/>
-            </w:pPr>
-            <w:r>
-              <w:rPr>
-                <w:sz w:val="20"/>
-                <w:szCs w:val="20"/>
-              </w:rPr>
-              <w:t>Main outcome</w:t>
-            </w:r>
-          </w:p>
-        </w:tc>
-        <w:tc>
-          <w:tcPr>
-            <w:tcW w:w="2400" w:type="dxa"/>
-            <w:tcBorders>
-              <w:top w:val="single" w:sz="4" w:space="0" w:color="BFBFBF"/>
-              <w:left w:val="single" w:sz="4" w:space="0" w:color="BFBFBF"/>
-              <w:bottom w:val="single" w:sz="4" w:space="0" w:color="BFBFBF"/>
-              <w:right w:val="single" w:sz="4" w:space="0" w:color="BFBFBF"/>
-            </w:tcBorders>
-            <w:shd w:val="clear" w:color="auto" w:fill="FFFFFF"/>
-            <w:tcMar>
-              <w:top w:w="70" w:type="dxa"/>
-              <w:left w:w="110" w:type="dxa"/>
-              <w:bottom w:w="70" w:type="dxa"/>
-              <w:right w:w="110" w:type="dxa"/>
-            </w:tcMar>
-            <w:vAlign w:val="center"/>
-          </w:tcPr>
-          <w:p>
-            <w:pPr>
-              <w:spacing w:line="252" w:lineRule="auto"/>
-            </w:pPr>
-            <w:r>
-              <w:rPr>
-                <w:sz w:val="20"/>
-                <w:szCs w:val="20"/>
-              </w:rPr>
-              <w:t>Resilient, globally scalable streaming</w:t>
-            </w:r>
-          </w:p>
-        </w:tc>
-        <w:tc>
-          <w:tcPr>
-            <w:tcW w:w="2400" w:type="dxa"/>
-            <w:tcBorders>
-              <w:top w:val="single" w:sz="4" w:space="0" w:color="BFBFBF"/>
-              <w:left w:val="single" w:sz="4" w:space="0" w:color="BFBFBF"/>
-              <w:bottom w:val="single" w:sz="4" w:space="0" w:color="BFBFBF"/>
-              <w:right w:val="single" w:sz="4" w:space="0" w:color="BFBFBF"/>
-            </w:tcBorders>
-            <w:shd w:val="clear" w:color="auto" w:fill="FFFFFF"/>
-            <w:tcMar>
-              <w:top w:w="70" w:type="dxa"/>
-              <w:left w:w="110" w:type="dxa"/>
-              <w:bottom w:w="70" w:type="dxa"/>
-              <w:right w:w="110" w:type="dxa"/>
-            </w:tcMar>
-            <w:vAlign w:val="center"/>
-          </w:tcPr>
-          <w:p>
-            <w:pPr>
-              <w:spacing w:line="252" w:lineRule="auto"/>
-            </w:pPr>
-            <w:r>
-              <w:rPr>
-                <w:sz w:val="20"/>
-                <w:szCs w:val="20"/>
-              </w:rPr>
               <w:t>Deployments every ~11.7 s; continuous innovation; AWS</w:t>
-            </w:r>
-          </w:p>
-        </w:tc>
-        <w:tc>
-          <w:tcPr>
-            <w:tcW w:w="2426" w:type="dxa"/>
-            <w:tcBorders>
-              <w:top w:val="single" w:sz="4" w:space="0" w:color="BFBFBF"/>
-              <w:left w:val="single" w:sz="4" w:space="0" w:color="BFBFBF"/>
-              <w:bottom w:val="single" w:sz="4" w:space="0" w:color="BFBFBF"/>
-              <w:right w:val="single" w:sz="4" w:space="0" w:color="BFBFBF"/>
-            </w:tcBorders>
-            <w:shd w:val="clear" w:color="auto" w:fill="FFFFFF"/>
-            <w:tcMar>
-              <w:top w:w="70" w:type="dxa"/>
-              <w:left w:w="110" w:type="dxa"/>
-              <w:bottom w:w="70" w:type="dxa"/>
-              <w:right w:w="110" w:type="dxa"/>
-            </w:tcMar>
-            <w:vAlign w:val="center"/>
-          </w:tcPr>
-          <w:p>
-            <w:pPr>
-              <w:spacing w:line="252" w:lineRule="auto"/>
-            </w:pPr>
-            <w:r>
-              <w:rPr>
-                <w:sz w:val="20"/>
-                <w:szCs w:val="20"/>
-              </w:rPr>
-              <w:t>Faster releases with stronger, auditable security</w:t>
             </w:r>
           </w:p>
         </w:tc>
@@ -10620,7 +7236,7 @@
                     </pic:cNvPicPr>
                   </pic:nvPicPr>
                   <pic:blipFill>
-                    <a:blip r:embed="rId18"/>
+                    <a:blip r:embed="rId15"/>
                     <a:srcRect/>
                     <a:stretch>
                       <a:fillRect/>
@@ -10657,7 +7273,7 @@
           <w:sz w:val="19"/>
           <w:szCs w:val="19"/>
         </w:rPr>
-        <w:t xml:space="preserve">Figure 4.1: </w:t>
+        <w:t xml:space="preserve">Figure 3.1: </w:t>
       </w:r>
       <w:r>
         <w:rPr>
@@ -10667,18 +7283,18 @@
           <w:sz w:val="19"/>
           <w:szCs w:val="19"/>
         </w:rPr>
-        <w:t>The common DevOps pattern across Netflix, Amazon and Capital One.</w:t>
+        <w:t>The common DevOps pattern in the Netflix and Amazon case studies.</w:t>
       </w:r>
     </w:p>
     <w:p>
       <w:pPr>
         <w:pStyle w:val="Heading2"/>
       </w:pPr>
-      <w:bookmarkStart w:id="24" w:name="_Toc241757569"/>
+      <w:bookmarkStart w:id="16" w:name="_Toc241782135"/>
       <w:r>
         <w:t>Overall Conclusion</w:t>
       </w:r>
-      <w:bookmarkEnd w:id="24"/>
+      <w:bookmarkEnd w:id="16"/>
     </w:p>
     <w:p>
       <w:pPr>
@@ -10691,7 +7307,6 @@
       <w:r>
         <w:rPr>
           <w:b/>
-          <w:bCs/>
         </w:rPr>
         <w:t>architecture</w:t>
       </w:r>
@@ -10701,7 +7316,6 @@
       <w:r>
         <w:rPr>
           <w:b/>
-          <w:bCs/>
         </w:rPr>
         <w:t>organisation</w:t>
       </w:r>
@@ -10711,32 +7325,38 @@
       <w:r>
         <w:rPr>
           <w:b/>
-          <w:bCs/>
         </w:rPr>
         <w:t>automation</w:t>
       </w:r>
       <w:r>
-        <w:t xml:space="preserve"> (CI/CD, testing, security and policy as code) and </w:t>
-      </w:r>
-      <w:r>
-        <w:rPr>
-          <w:b/>
-          <w:bCs/>
+        <w:t xml:space="preserve"> (CI/CD, testing and safe deployment pipelines) and </w:t>
+      </w:r>
+      <w:r>
+        <w:rPr>
+          <w:b/>
         </w:rPr>
         <w:t>culture</w:t>
       </w:r>
       <w:r>
-        <w:t xml:space="preserve"> (learning from failure, experimentation and shared responsibility). Netflix used it to achieve resilience, Amazon to achieve speed of innovation, and Capital One to achieve speed </w:t>
-      </w:r>
-      <w:r>
-        <w:rPr>
-          <w:b/>
-          <w:bCs/>
-        </w:rPr>
-        <w:t>with</w:t>
-      </w:r>
-      <w:r>
-        <w:t xml:space="preserve"> security in a regulated industry. In every case, the old assumption that speed and stability are opposites turned out to be false: when done well, each reinforces the other.</w:t>
+        <w:t xml:space="preserve"> (learning from failure, experimentation and shared responsibility). Netflix used it to achieve </w:t>
+      </w:r>
+      <w:r>
+        <w:rPr>
+          <w:b/>
+        </w:rPr>
+        <w:t>resilience</w:t>
+      </w:r>
+      <w:r>
+        <w:t xml:space="preserve">, and Amazon to achieve </w:t>
+      </w:r>
+      <w:r>
+        <w:rPr>
+          <w:b/>
+        </w:rPr>
+        <w:t>speed of innovation</w:t>
+      </w:r>
+      <w:r>
+        <w:t>. In both cases, the old assumption that speed and stability are opposites turned out to be false: when done well, each reinforces the other.</w:t>
       </w:r>
     </w:p>
     <w:p>
@@ -10744,12 +7364,12 @@
         <w:pStyle w:val="Heading1"/>
         <w:pageBreakBefore/>
       </w:pPr>
-      <w:bookmarkStart w:id="25" w:name="_Toc241757570"/>
+      <w:bookmarkStart w:id="17" w:name="_Toc241782136"/>
       <w:r>
         <w:lastRenderedPageBreak/>
         <w:t>References</w:t>
       </w:r>
-      <w:bookmarkEnd w:id="25"/>
+      <w:bookmarkEnd w:id="17"/>
     </w:p>
     <w:p>
       <w:pPr>
@@ -10972,96 +7592,11 @@
         <w:t>Kim, G., Humble, J., Debois, P., &amp; Willis, J. (2016). The DevOps Handbook. IT Revolution Press.</w:t>
       </w:r>
     </w:p>
-    <w:p>
-      <w:pPr>
-        <w:pStyle w:val="ListParagraph"/>
-        <w:numPr>
-          <w:ilvl w:val="0"/>
-          <w:numId w:val="6"/>
-        </w:numPr>
-        <w:spacing w:after="90" w:line="260" w:lineRule="auto"/>
-      </w:pPr>
-      <w:r>
-        <w:rPr>
-          <w:sz w:val="20"/>
-          <w:szCs w:val="20"/>
-        </w:rPr>
-        <w:t>Forsgren, N., Humble, J., &amp; Kim, G. (2018). Accelerate: The Science of Lean Software and DevOps. IT Revolution Press.</w:t>
-      </w:r>
-    </w:p>
-    <w:p>
-      <w:pPr>
-        <w:pStyle w:val="ListParagraph"/>
-        <w:numPr>
-          <w:ilvl w:val="0"/>
-          <w:numId w:val="6"/>
-        </w:numPr>
-        <w:spacing w:after="90" w:line="260" w:lineRule="auto"/>
-      </w:pPr>
-      <w:r>
-        <w:rPr>
-          <w:sz w:val="20"/>
-          <w:szCs w:val="20"/>
-        </w:rPr>
-        <w:t>Cloud Custodian project (originally developed at Capital One). cloudcustodian.io.</w:t>
-      </w:r>
-    </w:p>
-    <w:p>
-      <w:pPr>
-        <w:pStyle w:val="ListParagraph"/>
-        <w:numPr>
-          <w:ilvl w:val="0"/>
-          <w:numId w:val="6"/>
-        </w:numPr>
-        <w:spacing w:after="90" w:line="260" w:lineRule="auto"/>
-      </w:pPr>
-      <w:r>
-        <w:rPr>
-          <w:sz w:val="20"/>
-          <w:szCs w:val="20"/>
-        </w:rPr>
-        <w:t>Hygieia DevOps dashboard (open-sourced by Capital One). github.com/hygieia.</w:t>
-      </w:r>
-    </w:p>
-    <w:p>
-      <w:pPr>
-        <w:pStyle w:val="ListParagraph"/>
-        <w:numPr>
-          <w:ilvl w:val="0"/>
-          <w:numId w:val="6"/>
-        </w:numPr>
-        <w:spacing w:after="90" w:line="260" w:lineRule="auto"/>
-      </w:pPr>
-      <w:r>
-        <w:rPr>
-          <w:sz w:val="20"/>
-          <w:szCs w:val="20"/>
-        </w:rPr>
-        <w:t>Office of the Comptroller of the Currency. (2020, August 6). OCC assesses $80 million civil money penalty against Capital One.</w:t>
-      </w:r>
-    </w:p>
-    <w:p>
-      <w:pPr>
-        <w:pStyle w:val="ListParagraph"/>
-        <w:numPr>
-          <w:ilvl w:val="0"/>
-          <w:numId w:val="6"/>
-        </w:numPr>
-        <w:spacing w:after="90" w:line="260" w:lineRule="auto"/>
-      </w:pPr>
-      <w:r>
-        <w:rPr>
-          <w:sz w:val="20"/>
-          <w:szCs w:val="20"/>
-        </w:rPr>
-        <w:t>National Institute of Standards and Technology. (2022). Secure Software Development Framework (SSDF) Version 1.1, NIST SP 800-218.</w:t>
-      </w:r>
-    </w:p>
     <w:sectPr>
-      <w:headerReference w:type="default" r:id="rId19"/>
-      <w:footerReference w:type="default" r:id="rId20"/>
-      <w:headerReference w:type="first" r:id="rId21"/>
-      <w:footerReference w:type="first" r:id="rId22"/>
+      <w:headerReference w:type="default" r:id="rId16"/>
+      <w:footerReference w:type="default" r:id="rId17"/>
+      <w:headerReference w:type="first" r:id="rId18"/>
+      <w:footerReference w:type="first" r:id="rId19"/>
       <w:pgSz w:w="11906" w:h="16838"/>
       <w:pgMar w:top="1440" w:right="1440" w:bottom="1300" w:left="1440" w:header="600" w:footer="600" w:gutter="0"/>
       <w:cols w:space="720"/>

</xml_diff>

<commit_message>
Add student details and repository link to case study report
</commit_message>
<xml_diff>
--- a/docs/CA2_DevOps_Case_Studies.docx
+++ b/docs/CA2_DevOps_Case_Studies.docx
@@ -70,7 +70,7 @@
     </w:p>
     <w:tbl>
       <w:tblPr>
-        <w:tblW w:w="8000" w:type="dxa"/>
+        <w:tblW w:w="8800" w:type="dxa"/>
         <w:jc w:val="center"/>
         <w:tblBorders>
           <w:top w:val="single" w:sz="4" w:space="0" w:color="auto"/>
@@ -87,8 +87,8 @@
         <w:tblLook w:val="04A0" w:firstRow="1" w:lastRow="0" w:firstColumn="1" w:lastColumn="0" w:noHBand="0" w:noVBand="1"/>
       </w:tblPr>
       <w:tblGrid>
-        <w:gridCol w:w="2800"/>
-        <w:gridCol w:w="5200"/>
+        <w:gridCol w:w="2400"/>
+        <w:gridCol w:w="6400"/>
       </w:tblGrid>
       <w:tr>
         <w:trPr>
@@ -96,7 +96,7 @@
         </w:trPr>
         <w:tc>
           <w:tcPr>
-            <w:tcW w:w="2800" w:type="dxa"/>
+            <w:tcW w:w="2400" w:type="dxa"/>
             <w:tcBorders>
               <w:top w:val="none" w:sz="0" w:space="0" w:color="FFFFFF"/>
               <w:left w:val="none" w:sz="0" w:space="0" w:color="FFFFFF"/>
@@ -119,13 +119,13 @@
                 <w:sz w:val="24"/>
                 <w:szCs w:val="24"/>
               </w:rPr>
-              <w:t>Student Name</w:t>
-            </w:r>
-          </w:p>
-        </w:tc>
-        <w:tc>
-          <w:tcPr>
-            <w:tcW w:w="5200" w:type="dxa"/>
+              <w:t>Name</w:t>
+            </w:r>
+          </w:p>
+        </w:tc>
+        <w:tc>
+          <w:tcPr>
+            <w:tcW w:w="6400" w:type="dxa"/>
             <w:tcBorders>
               <w:top w:val="none" w:sz="0" w:space="0" w:color="FFFFFF"/>
               <w:left w:val="none" w:sz="0" w:space="0" w:color="FFFFFF"/>
@@ -139,7 +139,16 @@
               <w:right w:w="0" w:type="dxa"/>
             </w:tcMar>
           </w:tcPr>
-          <w:p/>
+          <w:p>
+            <w:r>
+              <w:rPr>
+                <w:color w:val="222222"/>
+                <w:sz w:val="24"/>
+                <w:szCs w:val="24"/>
+              </w:rPr>
+              <w:t>Anshul Ravindra Mandekar</w:t>
+            </w:r>
+          </w:p>
         </w:tc>
       </w:tr>
       <w:tr>
@@ -148,7 +157,7 @@
         </w:trPr>
         <w:tc>
           <w:tcPr>
-            <w:tcW w:w="2800" w:type="dxa"/>
+            <w:tcW w:w="2400" w:type="dxa"/>
             <w:tcBorders>
               <w:top w:val="none" w:sz="0" w:space="0" w:color="FFFFFF"/>
               <w:left w:val="none" w:sz="0" w:space="0" w:color="FFFFFF"/>
@@ -171,13 +180,13 @@
                 <w:sz w:val="24"/>
                 <w:szCs w:val="24"/>
               </w:rPr>
-              <w:t>Roll Number</w:t>
-            </w:r>
-          </w:p>
-        </w:tc>
-        <w:tc>
-          <w:tcPr>
-            <w:tcW w:w="5200" w:type="dxa"/>
+              <w:t>Class</w:t>
+            </w:r>
+          </w:p>
+        </w:tc>
+        <w:tc>
+          <w:tcPr>
+            <w:tcW w:w="6400" w:type="dxa"/>
             <w:tcBorders>
               <w:top w:val="none" w:sz="0" w:space="0" w:color="FFFFFF"/>
               <w:left w:val="none" w:sz="0" w:space="0" w:color="FFFFFF"/>
@@ -191,7 +200,16 @@
               <w:right w:w="0" w:type="dxa"/>
             </w:tcMar>
           </w:tcPr>
-          <w:p/>
+          <w:p>
+            <w:r>
+              <w:rPr>
+                <w:color w:val="222222"/>
+                <w:sz w:val="24"/>
+                <w:szCs w:val="24"/>
+              </w:rPr>
+              <w:t>DevOps L1</w:t>
+            </w:r>
+          </w:p>
         </w:tc>
       </w:tr>
       <w:tr>
@@ -200,7 +218,7 @@
         </w:trPr>
         <w:tc>
           <w:tcPr>
-            <w:tcW w:w="2800" w:type="dxa"/>
+            <w:tcW w:w="2400" w:type="dxa"/>
             <w:tcBorders>
               <w:top w:val="none" w:sz="0" w:space="0" w:color="FFFFFF"/>
               <w:left w:val="none" w:sz="0" w:space="0" w:color="FFFFFF"/>
@@ -223,13 +241,13 @@
                 <w:sz w:val="24"/>
                 <w:szCs w:val="24"/>
               </w:rPr>
-              <w:t>Class / Division</w:t>
-            </w:r>
-          </w:p>
-        </w:tc>
-        <w:tc>
-          <w:tcPr>
-            <w:tcW w:w="5200" w:type="dxa"/>
+              <w:t>PRN</w:t>
+            </w:r>
+          </w:p>
+        </w:tc>
+        <w:tc>
+          <w:tcPr>
+            <w:tcW w:w="6400" w:type="dxa"/>
             <w:tcBorders>
               <w:top w:val="none" w:sz="0" w:space="0" w:color="FFFFFF"/>
               <w:left w:val="none" w:sz="0" w:space="0" w:color="FFFFFF"/>
@@ -243,7 +261,16 @@
               <w:right w:w="0" w:type="dxa"/>
             </w:tcMar>
           </w:tcPr>
-          <w:p/>
+          <w:p>
+            <w:r>
+              <w:rPr>
+                <w:color w:val="222222"/>
+                <w:sz w:val="24"/>
+                <w:szCs w:val="24"/>
+              </w:rPr>
+              <w:t>23070122033</w:t>
+            </w:r>
+          </w:p>
         </w:tc>
       </w:tr>
       <w:tr>
@@ -252,7 +279,7 @@
         </w:trPr>
         <w:tc>
           <w:tcPr>
-            <w:tcW w:w="2800" w:type="dxa"/>
+            <w:tcW w:w="2400" w:type="dxa"/>
             <w:tcBorders>
               <w:top w:val="none" w:sz="0" w:space="0" w:color="FFFFFF"/>
               <w:left w:val="none" w:sz="0" w:space="0" w:color="FFFFFF"/>
@@ -275,13 +302,13 @@
                 <w:sz w:val="24"/>
                 <w:szCs w:val="24"/>
               </w:rPr>
-              <w:t>Subject</w:t>
-            </w:r>
-          </w:p>
-        </w:tc>
-        <w:tc>
-          <w:tcPr>
-            <w:tcW w:w="5200" w:type="dxa"/>
+              <w:t>Faculty</w:t>
+            </w:r>
+          </w:p>
+        </w:tc>
+        <w:tc>
+          <w:tcPr>
+            <w:tcW w:w="6400" w:type="dxa"/>
             <w:tcBorders>
               <w:top w:val="none" w:sz="0" w:space="0" w:color="FFFFFF"/>
               <w:left w:val="none" w:sz="0" w:space="0" w:color="FFFFFF"/>
@@ -295,7 +322,16 @@
               <w:right w:w="0" w:type="dxa"/>
             </w:tcMar>
           </w:tcPr>
-          <w:p/>
+          <w:p>
+            <w:r>
+              <w:rPr>
+                <w:color w:val="222222"/>
+                <w:sz w:val="24"/>
+                <w:szCs w:val="24"/>
+              </w:rPr>
+              <w:t>Arijit Dutta</w:t>
+            </w:r>
+          </w:p>
         </w:tc>
       </w:tr>
       <w:tr>
@@ -304,7 +340,7 @@
         </w:trPr>
         <w:tc>
           <w:tcPr>
-            <w:tcW w:w="2800" w:type="dxa"/>
+            <w:tcW w:w="2400" w:type="dxa"/>
             <w:tcBorders>
               <w:top w:val="none" w:sz="0" w:space="0" w:color="FFFFFF"/>
               <w:left w:val="none" w:sz="0" w:space="0" w:color="FFFFFF"/>
@@ -327,13 +363,13 @@
                 <w:sz w:val="24"/>
                 <w:szCs w:val="24"/>
               </w:rPr>
-              <w:t>Submitted To</w:t>
-            </w:r>
-          </w:p>
-        </w:tc>
-        <w:tc>
-          <w:tcPr>
-            <w:tcW w:w="5200" w:type="dxa"/>
+              <w:t>Project</w:t>
+            </w:r>
+          </w:p>
+        </w:tc>
+        <w:tc>
+          <w:tcPr>
+            <w:tcW w:w="6400" w:type="dxa"/>
             <w:tcBorders>
               <w:top w:val="none" w:sz="0" w:space="0" w:color="FFFFFF"/>
               <w:left w:val="none" w:sz="0" w:space="0" w:color="FFFFFF"/>
@@ -347,7 +383,16 @@
               <w:right w:w="0" w:type="dxa"/>
             </w:tcMar>
           </w:tcPr>
-          <w:p/>
+          <w:p>
+            <w:r>
+              <w:rPr>
+                <w:color w:val="222222"/>
+                <w:sz w:val="24"/>
+                <w:szCs w:val="24"/>
+              </w:rPr>
+              <w:t>Case Study Evaluation</w:t>
+            </w:r>
+          </w:p>
         </w:tc>
       </w:tr>
       <w:tr>
@@ -356,7 +401,7 @@
         </w:trPr>
         <w:tc>
           <w:tcPr>
-            <w:tcW w:w="2800" w:type="dxa"/>
+            <w:tcW w:w="2400" w:type="dxa"/>
             <w:tcBorders>
               <w:top w:val="none" w:sz="0" w:space="0" w:color="FFFFFF"/>
               <w:left w:val="none" w:sz="0" w:space="0" w:color="FFFFFF"/>
@@ -379,13 +424,13 @@
                 <w:sz w:val="24"/>
                 <w:szCs w:val="24"/>
               </w:rPr>
-              <w:t>Date of Submission</w:t>
-            </w:r>
-          </w:p>
-        </w:tc>
-        <w:tc>
-          <w:tcPr>
-            <w:tcW w:w="5200" w:type="dxa"/>
+              <w:t>GitHub Repository</w:t>
+            </w:r>
+          </w:p>
+        </w:tc>
+        <w:tc>
+          <w:tcPr>
+            <w:tcW w:w="6400" w:type="dxa"/>
             <w:tcBorders>
               <w:top w:val="none" w:sz="0" w:space="0" w:color="FFFFFF"/>
               <w:left w:val="none" w:sz="0" w:space="0" w:color="FFFFFF"/>
@@ -399,7 +444,18 @@
               <w:right w:w="0" w:type="dxa"/>
             </w:tcMar>
           </w:tcPr>
-          <w:p/>
+          <w:p>
+            <w:hyperlink r:id="rId7" w:history="1">
+              <w:r>
+                <w:rPr>
+                  <w:rStyle w:val="Hyperlink"/>
+                  <w:sz w:val="20"/>
+                  <w:szCs w:val="20"/>
+                </w:rPr>
+                <w:t>github.com/AnshulMandekar/AnshulMandekar-devops-case-study-main</w:t>
+              </w:r>
+            </w:hyperlink>
+          </w:p>
         </w:tc>
       </w:tr>
     </w:tbl>
@@ -467,7 +523,7 @@
           <w:r>
             <w:fldChar w:fldCharType="separate"/>
           </w:r>
-          <w:hyperlink w:anchor="_Toc241782119" w:history="1">
+          <w:hyperlink w:anchor="_Toc241782927" w:history="1">
             <w:r>
               <w:rPr>
                 <w:rStyle w:val="Hyperlink"/>
@@ -491,7 +547,7 @@
               <w:rPr>
                 <w:noProof/>
               </w:rPr>
-              <w:instrText xml:space="preserve"> PAGEREF _Toc241782119 \h </w:instrText>
+              <w:instrText xml:space="preserve"> PAGEREF _Toc241782927 \h </w:instrText>
             </w:r>
             <w:r>
               <w:rPr>
@@ -533,7 +589,7 @@
               <w14:ligatures w14:val="standardContextual"/>
             </w:rPr>
           </w:pPr>
-          <w:hyperlink w:anchor="_Toc241782120" w:history="1">
+          <w:hyperlink w:anchor="_Toc241782928" w:history="1">
             <w:r>
               <w:rPr>
                 <w:rStyle w:val="Hyperlink"/>
@@ -557,7 +613,7 @@
               <w:rPr>
                 <w:noProof/>
               </w:rPr>
-              <w:instrText xml:space="preserve"> PAGEREF _Toc241782120 \h </w:instrText>
+              <w:instrText xml:space="preserve"> PAGEREF _Toc241782928 \h </w:instrText>
             </w:r>
             <w:r>
               <w:rPr>
@@ -599,7 +655,7 @@
               <w14:ligatures w14:val="standardContextual"/>
             </w:rPr>
           </w:pPr>
-          <w:hyperlink w:anchor="_Toc241782121" w:history="1">
+          <w:hyperlink w:anchor="_Toc241782929" w:history="1">
             <w:r>
               <w:rPr>
                 <w:rStyle w:val="Hyperlink"/>
@@ -623,7 +679,7 @@
               <w:rPr>
                 <w:noProof/>
               </w:rPr>
-              <w:instrText xml:space="preserve"> PAGEREF _Toc241782121 \h </w:instrText>
+              <w:instrText xml:space="preserve"> PAGEREF _Toc241782929 \h </w:instrText>
             </w:r>
             <w:r>
               <w:rPr>
@@ -665,7 +721,7 @@
               <w14:ligatures w14:val="standardContextual"/>
             </w:rPr>
           </w:pPr>
-          <w:hyperlink w:anchor="_Toc241782122" w:history="1">
+          <w:hyperlink w:anchor="_Toc241782930" w:history="1">
             <w:r>
               <w:rPr>
                 <w:rStyle w:val="Hyperlink"/>
@@ -689,7 +745,7 @@
               <w:rPr>
                 <w:noProof/>
               </w:rPr>
-              <w:instrText xml:space="preserve"> PAGEREF _Toc241782122 \h </w:instrText>
+              <w:instrText xml:space="preserve"> PAGEREF _Toc241782930 \h </w:instrText>
             </w:r>
             <w:r>
               <w:rPr>
@@ -731,7 +787,7 @@
               <w14:ligatures w14:val="standardContextual"/>
             </w:rPr>
           </w:pPr>
-          <w:hyperlink w:anchor="_Toc241782123" w:history="1">
+          <w:hyperlink w:anchor="_Toc241782931" w:history="1">
             <w:r>
               <w:rPr>
                 <w:rStyle w:val="Hyperlink"/>
@@ -755,7 +811,7 @@
               <w:rPr>
                 <w:noProof/>
               </w:rPr>
-              <w:instrText xml:space="preserve"> PAGEREF _Toc241782123 \h </w:instrText>
+              <w:instrText xml:space="preserve"> PAGEREF _Toc241782931 \h </w:instrText>
             </w:r>
             <w:r>
               <w:rPr>
@@ -797,7 +853,7 @@
               <w14:ligatures w14:val="standardContextual"/>
             </w:rPr>
           </w:pPr>
-          <w:hyperlink w:anchor="_Toc241782124" w:history="1">
+          <w:hyperlink w:anchor="_Toc241782932" w:history="1">
             <w:r>
               <w:rPr>
                 <w:rStyle w:val="Hyperlink"/>
@@ -821,7 +877,7 @@
               <w:rPr>
                 <w:noProof/>
               </w:rPr>
-              <w:instrText xml:space="preserve"> PAGEREF _Toc241782124 \h </w:instrText>
+              <w:instrText xml:space="preserve"> PAGEREF _Toc241782932 \h </w:instrText>
             </w:r>
             <w:r>
               <w:rPr>
@@ -863,7 +919,7 @@
               <w14:ligatures w14:val="standardContextual"/>
             </w:rPr>
           </w:pPr>
-          <w:hyperlink w:anchor="_Toc241782125" w:history="1">
+          <w:hyperlink w:anchor="_Toc241782933" w:history="1">
             <w:r>
               <w:rPr>
                 <w:rStyle w:val="Hyperlink"/>
@@ -887,7 +943,7 @@
               <w:rPr>
                 <w:noProof/>
               </w:rPr>
-              <w:instrText xml:space="preserve"> PAGEREF _Toc241782125 \h </w:instrText>
+              <w:instrText xml:space="preserve"> PAGEREF _Toc241782933 \h </w:instrText>
             </w:r>
             <w:r>
               <w:rPr>
@@ -929,7 +985,7 @@
               <w14:ligatures w14:val="standardContextual"/>
             </w:rPr>
           </w:pPr>
-          <w:hyperlink w:anchor="_Toc241782126" w:history="1">
+          <w:hyperlink w:anchor="_Toc241782934" w:history="1">
             <w:r>
               <w:rPr>
                 <w:rStyle w:val="Hyperlink"/>
@@ -953,7 +1009,7 @@
               <w:rPr>
                 <w:noProof/>
               </w:rPr>
-              <w:instrText xml:space="preserve"> PAGEREF _Toc241782126 \h </w:instrText>
+              <w:instrText xml:space="preserve"> PAGEREF _Toc241782934 \h </w:instrText>
             </w:r>
             <w:r>
               <w:rPr>
@@ -995,7 +1051,7 @@
               <w14:ligatures w14:val="standardContextual"/>
             </w:rPr>
           </w:pPr>
-          <w:hyperlink w:anchor="_Toc241782127" w:history="1">
+          <w:hyperlink w:anchor="_Toc241782935" w:history="1">
             <w:r>
               <w:rPr>
                 <w:rStyle w:val="Hyperlink"/>
@@ -1019,7 +1075,7 @@
               <w:rPr>
                 <w:noProof/>
               </w:rPr>
-              <w:instrText xml:space="preserve"> PAGEREF _Toc241782127 \h </w:instrText>
+              <w:instrText xml:space="preserve"> PAGEREF _Toc241782935 \h </w:instrText>
             </w:r>
             <w:r>
               <w:rPr>
@@ -1061,7 +1117,7 @@
               <w14:ligatures w14:val="standardContextual"/>
             </w:rPr>
           </w:pPr>
-          <w:hyperlink w:anchor="_Toc241782128" w:history="1">
+          <w:hyperlink w:anchor="_Toc241782936" w:history="1">
             <w:r>
               <w:rPr>
                 <w:rStyle w:val="Hyperlink"/>
@@ -1085,7 +1141,7 @@
               <w:rPr>
                 <w:noProof/>
               </w:rPr>
-              <w:instrText xml:space="preserve"> PAGEREF _Toc241782128 \h </w:instrText>
+              <w:instrText xml:space="preserve"> PAGEREF _Toc241782936 \h </w:instrText>
             </w:r>
             <w:r>
               <w:rPr>
@@ -1127,7 +1183,7 @@
               <w14:ligatures w14:val="standardContextual"/>
             </w:rPr>
           </w:pPr>
-          <w:hyperlink w:anchor="_Toc241782129" w:history="1">
+          <w:hyperlink w:anchor="_Toc241782937" w:history="1">
             <w:r>
               <w:rPr>
                 <w:rStyle w:val="Hyperlink"/>
@@ -1151,7 +1207,7 @@
               <w:rPr>
                 <w:noProof/>
               </w:rPr>
-              <w:instrText xml:space="preserve"> PAGEREF _Toc241782129 \h </w:instrText>
+              <w:instrText xml:space="preserve"> PAGEREF _Toc241782937 \h </w:instrText>
             </w:r>
             <w:r>
               <w:rPr>
@@ -1193,7 +1249,7 @@
               <w14:ligatures w14:val="standardContextual"/>
             </w:rPr>
           </w:pPr>
-          <w:hyperlink w:anchor="_Toc241782130" w:history="1">
+          <w:hyperlink w:anchor="_Toc241782938" w:history="1">
             <w:r>
               <w:rPr>
                 <w:rStyle w:val="Hyperlink"/>
@@ -1217,7 +1273,7 @@
               <w:rPr>
                 <w:noProof/>
               </w:rPr>
-              <w:instrText xml:space="preserve"> PAGEREF _Toc241782130 \h </w:instrText>
+              <w:instrText xml:space="preserve"> PAGEREF _Toc241782938 \h </w:instrText>
             </w:r>
             <w:r>
               <w:rPr>
@@ -1259,7 +1315,7 @@
               <w14:ligatures w14:val="standardContextual"/>
             </w:rPr>
           </w:pPr>
-          <w:hyperlink w:anchor="_Toc241782131" w:history="1">
+          <w:hyperlink w:anchor="_Toc241782939" w:history="1">
             <w:r>
               <w:rPr>
                 <w:rStyle w:val="Hyperlink"/>
@@ -1283,7 +1339,7 @@
               <w:rPr>
                 <w:noProof/>
               </w:rPr>
-              <w:instrText xml:space="preserve"> PAGEREF _Toc241782131 \h </w:instrText>
+              <w:instrText xml:space="preserve"> PAGEREF _Toc241782939 \h </w:instrText>
             </w:r>
             <w:r>
               <w:rPr>
@@ -1325,7 +1381,7 @@
               <w14:ligatures w14:val="standardContextual"/>
             </w:rPr>
           </w:pPr>
-          <w:hyperlink w:anchor="_Toc241782132" w:history="1">
+          <w:hyperlink w:anchor="_Toc241782940" w:history="1">
             <w:r>
               <w:rPr>
                 <w:rStyle w:val="Hyperlink"/>
@@ -1349,7 +1405,7 @@
               <w:rPr>
                 <w:noProof/>
               </w:rPr>
-              <w:instrText xml:space="preserve"> PAGEREF _Toc241782132 \h </w:instrText>
+              <w:instrText xml:space="preserve"> PAGEREF _Toc241782940 \h </w:instrText>
             </w:r>
             <w:r>
               <w:rPr>
@@ -1391,7 +1447,7 @@
               <w14:ligatures w14:val="standardContextual"/>
             </w:rPr>
           </w:pPr>
-          <w:hyperlink w:anchor="_Toc241782133" w:history="1">
+          <w:hyperlink w:anchor="_Toc241782941" w:history="1">
             <w:r>
               <w:rPr>
                 <w:rStyle w:val="Hyperlink"/>
@@ -1415,7 +1471,7 @@
               <w:rPr>
                 <w:noProof/>
               </w:rPr>
-              <w:instrText xml:space="preserve"> PAGEREF _Toc241782133 \h </w:instrText>
+              <w:instrText xml:space="preserve"> PAGEREF _Toc241782941 \h </w:instrText>
             </w:r>
             <w:r>
               <w:rPr>
@@ -1457,7 +1513,7 @@
               <w14:ligatures w14:val="standardContextual"/>
             </w:rPr>
           </w:pPr>
-          <w:hyperlink w:anchor="_Toc241782134" w:history="1">
+          <w:hyperlink w:anchor="_Toc241782942" w:history="1">
             <w:r>
               <w:rPr>
                 <w:rStyle w:val="Hyperlink"/>
@@ -1481,7 +1537,7 @@
               <w:rPr>
                 <w:noProof/>
               </w:rPr>
-              <w:instrText xml:space="preserve"> PAGEREF _Toc241782134 \h </w:instrText>
+              <w:instrText xml:space="preserve"> PAGEREF _Toc241782942 \h </w:instrText>
             </w:r>
             <w:r>
               <w:rPr>
@@ -1523,7 +1579,7 @@
               <w14:ligatures w14:val="standardContextual"/>
             </w:rPr>
           </w:pPr>
-          <w:hyperlink w:anchor="_Toc241782135" w:history="1">
+          <w:hyperlink w:anchor="_Toc241782943" w:history="1">
             <w:r>
               <w:rPr>
                 <w:rStyle w:val="Hyperlink"/>
@@ -1547,7 +1603,7 @@
               <w:rPr>
                 <w:noProof/>
               </w:rPr>
-              <w:instrText xml:space="preserve"> PAGEREF _Toc241782135 \h </w:instrText>
+              <w:instrText xml:space="preserve"> PAGEREF _Toc241782943 \h </w:instrText>
             </w:r>
             <w:r>
               <w:rPr>
@@ -1589,12 +1645,78 @@
               <w14:ligatures w14:val="standardContextual"/>
             </w:rPr>
           </w:pPr>
-          <w:hyperlink w:anchor="_Toc241782136" w:history="1">
+          <w:hyperlink w:anchor="_Toc241782944" w:history="1">
             <w:r>
               <w:rPr>
                 <w:rStyle w:val="Hyperlink"/>
                 <w:noProof/>
               </w:rPr>
+              <w:t>Practical Implementation (GitHub Repository)</w:t>
+            </w:r>
+            <w:r>
+              <w:rPr>
+                <w:noProof/>
+              </w:rPr>
+              <w:tab/>
+            </w:r>
+            <w:r>
+              <w:rPr>
+                <w:noProof/>
+              </w:rPr>
+              <w:fldChar w:fldCharType="begin"/>
+            </w:r>
+            <w:r>
+              <w:rPr>
+                <w:noProof/>
+              </w:rPr>
+              <w:instrText xml:space="preserve"> PAGEREF _Toc241782944 \h </w:instrText>
+            </w:r>
+            <w:r>
+              <w:rPr>
+                <w:noProof/>
+              </w:rPr>
+            </w:r>
+            <w:r>
+              <w:rPr>
+                <w:noProof/>
+              </w:rPr>
+              <w:fldChar w:fldCharType="separate"/>
+            </w:r>
+            <w:r>
+              <w:rPr>
+                <w:noProof/>
+              </w:rPr>
+              <w:t>16</w:t>
+            </w:r>
+            <w:r>
+              <w:rPr>
+                <w:noProof/>
+              </w:rPr>
+              <w:fldChar w:fldCharType="end"/>
+            </w:r>
+          </w:hyperlink>
+        </w:p>
+        <w:p>
+          <w:pPr>
+            <w:pStyle w:val="TOC1"/>
+            <w:tabs>
+              <w:tab w:val="right" w:leader="dot" w:pos="9016"/>
+            </w:tabs>
+            <w:rPr>
+              <w:rFonts w:asciiTheme="minorHAnsi" w:eastAsiaTheme="minorEastAsia" w:hAnsiTheme="minorHAnsi" w:cstheme="minorBidi"/>
+              <w:noProof/>
+              <w:kern w:val="2"/>
+              <w:sz w:val="24"/>
+              <w:szCs w:val="24"/>
+              <w14:ligatures w14:val="standardContextual"/>
+            </w:rPr>
+          </w:pPr>
+          <w:hyperlink w:anchor="_Toc241782945" w:history="1">
+            <w:r>
+              <w:rPr>
+                <w:rStyle w:val="Hyperlink"/>
+                <w:noProof/>
+              </w:rPr>
               <w:t>References</w:t>
             </w:r>
             <w:r>
@@ -1613,7 +1735,7 @@
               <w:rPr>
                 <w:noProof/>
               </w:rPr>
-              <w:instrText xml:space="preserve"> PAGEREF _Toc241782136 \h </w:instrText>
+              <w:instrText xml:space="preserve"> PAGEREF _Toc241782945 \h </w:instrText>
             </w:r>
             <w:r>
               <w:rPr>
@@ -1630,7 +1752,7 @@
               <w:rPr>
                 <w:noProof/>
               </w:rPr>
-              <w:t>16</w:t>
+              <w:t>17</w:t>
             </w:r>
             <w:r>
               <w:rPr>
@@ -1652,7 +1774,7 @@
         <w:pStyle w:val="Heading1"/>
         <w:pageBreakBefore/>
       </w:pPr>
-      <w:bookmarkStart w:id="0" w:name="_Toc241782119"/>
+      <w:bookmarkStart w:id="0" w:name="_Toc241782927"/>
       <w:r>
         <w:lastRenderedPageBreak/>
         <w:t>Question 1: Netflix — From a Fragile Monolith to Resilient, Chaos-Tested Microservices</w:t>
@@ -1752,7 +1874,7 @@
       <w:pPr>
         <w:pStyle w:val="Heading2"/>
       </w:pPr>
-      <w:bookmarkStart w:id="1" w:name="_Toc241782120"/>
+      <w:bookmarkStart w:id="1" w:name="_Toc241782928"/>
       <w:r>
         <w:t>1.1 Introduction and Background</w:t>
       </w:r>
@@ -1830,7 +1952,7 @@
       <w:pPr>
         <w:pStyle w:val="Heading2"/>
       </w:pPr>
-      <w:bookmarkStart w:id="2" w:name="_Toc241782121"/>
+      <w:bookmarkStart w:id="2" w:name="_Toc241782929"/>
       <w:r>
         <w:t>1.2 Challenges Exposed by the 2008 Database Corruption</w:t>
       </w:r>
@@ -2008,317 +2130,6 @@
             <wp:extent cx="5715000" cy="4000500"/>
             <wp:effectExtent l="0" t="0" r="0" b="0"/>
             <wp:docPr id="1" name="q1_monolith.png" descr="Netflix’s 2008 monolithic architecture: every module depended on one vertically scaled database, so one corruption stopped the whole business." title="Netflix’s 2008 monolithic architecture: every module depended on one vertically scaled database, so one corruption stopped the whole business."/>
-            <wp:cNvGraphicFramePr>
-              <a:graphicFrameLocks xmlns:a="http://schemas.openxmlformats.org/drawingml/2006/main" noChangeAspect="1"/>
-            </wp:cNvGraphicFramePr>
-            <a:graphic xmlns:a="http://schemas.openxmlformats.org/drawingml/2006/main">
-              <a:graphicData uri="http://schemas.openxmlformats.org/drawingml/2006/picture">
-                <pic:pic xmlns:pic="http://schemas.openxmlformats.org/drawingml/2006/picture">
-                  <pic:nvPicPr>
-                    <pic:cNvPr id="0" name=""/>
-                    <pic:cNvPicPr>
-                      <a:picLocks noChangeAspect="1" noChangeArrowheads="1"/>
-                    </pic:cNvPicPr>
-                  </pic:nvPicPr>
-                  <pic:blipFill>
-                    <a:blip r:embed="rId7"/>
-                    <a:srcRect/>
-                    <a:stretch>
-                      <a:fillRect/>
-                    </a:stretch>
-                  </pic:blipFill>
-                  <pic:spPr bwMode="auto">
-                    <a:xfrm>
-                      <a:off x="0" y="0"/>
-                      <a:ext cx="5715000" cy="4000500"/>
-                    </a:xfrm>
-                    <a:prstGeom prst="rect">
-                      <a:avLst/>
-                    </a:prstGeom>
-                  </pic:spPr>
-                </pic:pic>
-              </a:graphicData>
-            </a:graphic>
-          </wp:inline>
-        </w:drawing>
-      </w:r>
-    </w:p>
-    <w:p>
-      <w:pPr>
-        <w:spacing w:after="220"/>
-        <w:jc w:val="center"/>
-      </w:pPr>
-      <w:r>
-        <w:rPr>
-          <w:b/>
-          <w:bCs/>
-          <w:i/>
-          <w:iCs/>
-          <w:color w:val="595959"/>
-          <w:sz w:val="19"/>
-          <w:szCs w:val="19"/>
-        </w:rPr>
-        <w:t xml:space="preserve">Figure 1.1: </w:t>
-      </w:r>
-      <w:r>
-        <w:rPr>
-          <w:i/>
-          <w:iCs/>
-          <w:color w:val="595959"/>
-          <w:sz w:val="19"/>
-          <w:szCs w:val="19"/>
-        </w:rPr>
-        <w:t>Netflix’s 2008 monolithic architecture: every module depended on one vertically scaled database, so one corruption stopped the whole business.</w:t>
-      </w:r>
-    </w:p>
-    <w:p>
-      <w:pPr>
-        <w:pStyle w:val="Heading2"/>
-      </w:pPr>
-      <w:bookmarkStart w:id="3" w:name="_Toc241782122"/>
-      <w:r>
-        <w:t>1.3 The DevOps Solution</w:t>
-      </w:r>
-      <w:bookmarkEnd w:id="3"/>
-    </w:p>
-    <w:p>
-      <w:pPr>
-        <w:pStyle w:val="Heading3"/>
-      </w:pPr>
-      <w:r>
-        <w:t>1.3.1 Re-architecting for the Cloud: Monolith to Microservices</w:t>
-      </w:r>
-    </w:p>
-    <w:p>
-      <w:pPr>
-        <w:spacing w:after="140" w:line="276" w:lineRule="auto"/>
-        <w:jc w:val="both"/>
-      </w:pPr>
-      <w:r>
-        <w:t xml:space="preserve">Netflix chose Amazon Web Services (AWS) as its cloud platform but, crucially, did </w:t>
-      </w:r>
-      <w:r>
-        <w:rPr>
-          <w:b/>
-          <w:bCs/>
-        </w:rPr>
-        <w:t>not</w:t>
-      </w:r>
-      <w:r>
-        <w:t xml:space="preserve"> simply “lift and shift” the monolith onto rented servers. Moving the same fragile design to the cloud would have moved the same problems. Instead Netflix took a </w:t>
-      </w:r>
-      <w:r>
-        <w:rPr>
-          <w:b/>
-          <w:bCs/>
-        </w:rPr>
-        <w:t>cloud-native approach</w:t>
-      </w:r>
-      <w:r>
-        <w:t xml:space="preserve"> and rebuilt almost all of its technology. Non-customer-facing workloads such as video encoding moved first (2009); customer-facing systems followed from 2010; and the migration was completed in </w:t>
-      </w:r>
-      <w:r>
-        <w:rPr>
-          <w:b/>
-          <w:bCs/>
-        </w:rPr>
-        <w:t>January 2016</w:t>
-      </w:r>
-      <w:r>
-        <w:t>, when the last data-centre components were shut down. The main design changes were:</w:t>
-      </w:r>
-    </w:p>
-    <w:p>
-      <w:pPr>
-        <w:pStyle w:val="ListParagraph"/>
-        <w:numPr>
-          <w:ilvl w:val="0"/>
-          <w:numId w:val="3"/>
-        </w:numPr>
-        <w:spacing w:after="80" w:line="264" w:lineRule="auto"/>
-        <w:jc w:val="both"/>
-      </w:pPr>
-      <w:r>
-        <w:rPr>
-          <w:b/>
-          <w:bCs/>
-        </w:rPr>
-        <w:t>Decomposition into microservices:</w:t>
-      </w:r>
-      <w:r>
-        <w:t xml:space="preserve"> the monolith was split into hundreds of small, independently deployable services (sign-up, billing, catalogue, search, playback, recommendations, etc.), each owned by one team and each focused on one business capability.</w:t>
-      </w:r>
-    </w:p>
-    <w:p>
-      <w:pPr>
-        <w:pStyle w:val="ListParagraph"/>
-        <w:numPr>
-          <w:ilvl w:val="0"/>
-          <w:numId w:val="3"/>
-        </w:numPr>
-        <w:spacing w:after="80" w:line="264" w:lineRule="auto"/>
-        <w:jc w:val="both"/>
-      </w:pPr>
-      <w:r>
-        <w:rPr>
-          <w:b/>
-          <w:bCs/>
-        </w:rPr>
-        <w:lastRenderedPageBreak/>
-        <w:t>Database-per-service and distributed data:</w:t>
-      </w:r>
-      <w:r>
-        <w:t xml:space="preserve"> instead of one Oracle database, data was spread across horizontally scalable NoSQL stores such as </w:t>
-      </w:r>
-      <w:r>
-        <w:rPr>
-          <w:b/>
-          <w:bCs/>
-        </w:rPr>
-        <w:t>Apache Cassandra</w:t>
-      </w:r>
-      <w:r>
-        <w:t xml:space="preserve"> and the </w:t>
-      </w:r>
-      <w:r>
-        <w:rPr>
-          <w:b/>
-          <w:bCs/>
-        </w:rPr>
-        <w:t>EVCache</w:t>
-      </w:r>
-      <w:r>
-        <w:t xml:space="preserve"> caching layer, replicated across multiple Availability Zones. There is no longer one database whose corruption can halt the company.</w:t>
-      </w:r>
-    </w:p>
-    <w:p>
-      <w:pPr>
-        <w:pStyle w:val="ListParagraph"/>
-        <w:numPr>
-          <w:ilvl w:val="0"/>
-          <w:numId w:val="3"/>
-        </w:numPr>
-        <w:spacing w:after="80" w:line="264" w:lineRule="auto"/>
-        <w:jc w:val="both"/>
-      </w:pPr>
-      <w:r>
-        <w:rPr>
-          <w:b/>
-          <w:bCs/>
-        </w:rPr>
-        <w:t>Stateless services and horizontal scaling:</w:t>
-      </w:r>
-      <w:r>
-        <w:t xml:space="preserve"> service instances keep no critical local state, so any instance can be killed and replaced, and auto-scaling adds or removes instances in minutes as demand changes.</w:t>
-      </w:r>
-    </w:p>
-    <w:p>
-      <w:pPr>
-        <w:pStyle w:val="ListParagraph"/>
-        <w:numPr>
-          <w:ilvl w:val="0"/>
-          <w:numId w:val="3"/>
-        </w:numPr>
-        <w:spacing w:after="80" w:line="264" w:lineRule="auto"/>
-        <w:jc w:val="both"/>
-      </w:pPr>
-      <w:r>
-        <w:rPr>
-          <w:b/>
-          <w:bCs/>
-        </w:rPr>
-        <w:t>Redundancy across zones and regions:</w:t>
-      </w:r>
-      <w:r>
-        <w:t xml:space="preserve"> services run in several Availability Zones and in an </w:t>
-      </w:r>
-      <w:r>
-        <w:rPr>
-          <w:b/>
-          <w:bCs/>
-        </w:rPr>
-        <w:t>active–active multi-region</w:t>
-      </w:r>
-      <w:r>
-        <w:t xml:space="preserve"> set-up, so even the loss of an entire AWS region can be handled by moving traffic elsewhere.</w:t>
-      </w:r>
-    </w:p>
-    <w:p>
-      <w:pPr>
-        <w:pStyle w:val="ListParagraph"/>
-        <w:numPr>
-          <w:ilvl w:val="0"/>
-          <w:numId w:val="3"/>
-        </w:numPr>
-        <w:spacing w:after="80" w:line="264" w:lineRule="auto"/>
-        <w:jc w:val="both"/>
-      </w:pPr>
-      <w:r>
-        <w:rPr>
-          <w:b/>
-          <w:bCs/>
-        </w:rPr>
-        <w:t>Resilience patterns in code (Netflix OSS):</w:t>
-      </w:r>
-      <w:r>
-        <w:t xml:space="preserve"> </w:t>
-      </w:r>
-      <w:r>
-        <w:rPr>
-          <w:b/>
-          <w:bCs/>
-        </w:rPr>
-        <w:t>Eureka</w:t>
-      </w:r>
-      <w:r>
-        <w:t xml:space="preserve"> for service discovery, </w:t>
-      </w:r>
-      <w:r>
-        <w:rPr>
-          <w:b/>
-          <w:bCs/>
-        </w:rPr>
-        <w:t>Zuul</w:t>
-      </w:r>
-      <w:r>
-        <w:t xml:space="preserve"> as the edge API gateway, </w:t>
-      </w:r>
-      <w:r>
-        <w:rPr>
-          <w:b/>
-          <w:bCs/>
-        </w:rPr>
-        <w:t>Ribbon</w:t>
-      </w:r>
-      <w:r>
-        <w:t xml:space="preserve"> for client-side load balancing and </w:t>
-      </w:r>
-      <w:r>
-        <w:rPr>
-          <w:b/>
-          <w:bCs/>
-        </w:rPr>
-        <w:t>Hystrix</w:t>
-      </w:r>
-      <w:r>
-        <w:t xml:space="preserve"> for circuit breakers. With Hystrix, if the personalised-recommendations service fails, the user sees a generic list of popular titles instead of an error page — graceful degradation instead of total failure.</w:t>
-      </w:r>
-    </w:p>
-    <w:p>
-      <w:pPr>
-        <w:keepNext/>
-        <w:spacing w:before="160" w:after="60"/>
-        <w:jc w:val="center"/>
-      </w:pPr>
-      <w:r>
-        <w:rPr>
-          <w:noProof/>
-        </w:rPr>
-        <w:drawing>
-          <wp:inline distT="0" distB="0" distL="0" distR="0" wp14:anchorId="3471CF56" wp14:editId="0D2BE8D1">
-            <wp:extent cx="5715000" cy="4143375"/>
-            <wp:effectExtent l="0" t="0" r="0" b="0"/>
-            <wp:docPr id="2" name="q1_microservices.png" descr="Cloud-native microservices on AWS: independent services, separate data stores, circuit breakers and multi-region redundancy." title="Cloud-native microservices on AWS: independent services, separate data stores, circuit breakers and multi-region redundancy."/>
             <wp:cNvGraphicFramePr>
               <a:graphicFrameLocks xmlns:a="http://schemas.openxmlformats.org/drawingml/2006/main" noChangeAspect="1"/>
             </wp:cNvGraphicFramePr>
@@ -2341,7 +2152,7 @@
                   <pic:spPr bwMode="auto">
                     <a:xfrm>
                       <a:off x="0" y="0"/>
-                      <a:ext cx="5715000" cy="4143375"/>
+                      <a:ext cx="5715000" cy="4000500"/>
                     </a:xfrm>
                     <a:prstGeom prst="rect">
                       <a:avLst/>
@@ -2369,7 +2180,7 @@
           <w:sz w:val="19"/>
           <w:szCs w:val="19"/>
         </w:rPr>
-        <w:t xml:space="preserve">Figure 1.2: </w:t>
+        <w:t xml:space="preserve">Figure 1.1: </w:t>
       </w:r>
       <w:r>
         <w:rPr>
@@ -2379,15 +2190,25 @@
           <w:sz w:val="19"/>
           <w:szCs w:val="19"/>
         </w:rPr>
-        <w:t>Cloud-native microservices on AWS: independent services, separate data stores, circuit breakers and multi-region redundancy.</w:t>
-      </w:r>
+        <w:t>Netflix’s 2008 monolithic architecture: every module depended on one vertically scaled database, so one corruption stopped the whole business.</w:t>
+      </w:r>
+    </w:p>
+    <w:p>
+      <w:pPr>
+        <w:pStyle w:val="Heading2"/>
+      </w:pPr>
+      <w:bookmarkStart w:id="3" w:name="_Toc241782930"/>
+      <w:r>
+        <w:t>1.3 The DevOps Solution</w:t>
+      </w:r>
+      <w:bookmarkEnd w:id="3"/>
     </w:p>
     <w:p>
       <w:pPr>
         <w:pStyle w:val="Heading3"/>
       </w:pPr>
       <w:r>
-        <w:t>1.3.2 DevOps Culture and Continuous Delivery</w:t>
+        <w:t>1.3.1 Re-architecting for the Cloud: Monolith to Microservices</w:t>
       </w:r>
     </w:p>
     <w:p>
@@ -2396,7 +2217,37 @@
         <w:jc w:val="both"/>
       </w:pPr>
       <w:r>
-        <w:t>Architecture alone was not enough; Netflix paired it with a strong DevOps culture:</w:t>
+        <w:t xml:space="preserve">Netflix chose Amazon Web Services (AWS) as its cloud platform but, crucially, did </w:t>
+      </w:r>
+      <w:r>
+        <w:rPr>
+          <w:b/>
+          <w:bCs/>
+        </w:rPr>
+        <w:t>not</w:t>
+      </w:r>
+      <w:r>
+        <w:t xml:space="preserve"> simply “lift and shift” the monolith onto rented servers. Moving the same fragile design to the cloud would have moved the same problems. Instead Netflix took a </w:t>
+      </w:r>
+      <w:r>
+        <w:rPr>
+          <w:b/>
+          <w:bCs/>
+        </w:rPr>
+        <w:t>cloud-native approach</w:t>
+      </w:r>
+      <w:r>
+        <w:t xml:space="preserve"> and rebuilt almost all of its technology. Non-customer-facing workloads such as video encoding moved first (2009); customer-facing systems followed from 2010; and the migration was completed in </w:t>
+      </w:r>
+      <w:r>
+        <w:rPr>
+          <w:b/>
+          <w:bCs/>
+        </w:rPr>
+        <w:t>January 2016</w:t>
+      </w:r>
+      <w:r>
+        <w:t>, when the last data-centre components were shut down. The main design changes were:</w:t>
       </w:r>
     </w:p>
     <w:p>
@@ -2414,10 +2265,10 @@
           <w:b/>
           <w:bCs/>
         </w:rPr>
-        <w:t>“Freedom and Responsibility” and “You build it, you run it”:</w:t>
-      </w:r>
-      <w:r>
-        <w:t xml:space="preserve"> each team owns its service end-to-end — design, coding, testing, deployment and on-call support. There is no separate operations team to “throw code over the wall” to, so developers feel the consequences of their design choices and build for reliability.</w:t>
+        <w:t>Decomposition into microservices:</w:t>
+      </w:r>
+      <w:r>
+        <w:t xml:space="preserve"> the monolith was split into hundreds of small, independently deployable services (sign-up, billing, catalogue, search, playback, recommendations, etc.), each owned by one team and each focused on one business capability.</w:t>
       </w:r>
     </w:p>
     <w:p>
@@ -2436,20 +2287,30 @@
           <w:bCs/>
         </w:rPr>
         <w:lastRenderedPageBreak/>
-        <w:t>Continuous delivery with Spinnaker:</w:t>
-      </w:r>
-      <w:r>
-        <w:t xml:space="preserve"> Netflix built (and open-sourced in 2015) Spinnaker, a deployment platform supporting automated pipelines, red/black (blue–green) deployments, </w:t>
-      </w:r>
-      <w:r>
-        <w:rPr>
-          <w:b/>
-          <w:bCs/>
-        </w:rPr>
-        <w:t>automated canary analysis</w:t>
-      </w:r>
-      <w:r>
-        <w:t xml:space="preserve"> (a new version first receives a small share of traffic and is compared with the old version) and one-click rollback.</w:t>
+        <w:t>Database-per-service and distributed data:</w:t>
+      </w:r>
+      <w:r>
+        <w:t xml:space="preserve"> instead of one Oracle database, data was spread across horizontally scalable NoSQL stores such as </w:t>
+      </w:r>
+      <w:r>
+        <w:rPr>
+          <w:b/>
+          <w:bCs/>
+        </w:rPr>
+        <w:t>Apache Cassandra</w:t>
+      </w:r>
+      <w:r>
+        <w:t xml:space="preserve"> and the </w:t>
+      </w:r>
+      <w:r>
+        <w:rPr>
+          <w:b/>
+          <w:bCs/>
+        </w:rPr>
+        <w:t>EVCache</w:t>
+      </w:r>
+      <w:r>
+        <w:t xml:space="preserve"> caching layer, replicated across multiple Availability Zones. There is no longer one database whose corruption can halt the company.</w:t>
       </w:r>
     </w:p>
     <w:p>
@@ -2467,10 +2328,10 @@
           <w:b/>
           <w:bCs/>
         </w:rPr>
-        <w:t>The “paved road”:</w:t>
-      </w:r>
-      <w:r>
-        <w:t xml:space="preserve"> central platform teams provide well-supported tools and templates so that the safe, resilient way is also the easiest way for product teams.</w:t>
+        <w:t>Stateless services and horizontal scaling:</w:t>
+      </w:r>
+      <w:r>
+        <w:t xml:space="preserve"> service instances keep no critical local state, so any instance can be killed and replaced, and auto-scaling adds or removes instances in minutes as demand changes.</w:t>
       </w:r>
     </w:p>
     <w:p>
@@ -2488,67 +2349,81 @@
           <w:b/>
           <w:bCs/>
         </w:rPr>
-        <w:t>Observability and blameless learning:</w:t>
-      </w:r>
-      <w:r>
-        <w:t xml:space="preserve"> real-time telemetry (e.g., the Atlas monitoring system) and blameless post-incident reviews turn every failure into an improvement.</w:t>
-      </w:r>
-    </w:p>
-    <w:p>
-      <w:pPr>
-        <w:pStyle w:val="Heading3"/>
-      </w:pPr>
-      <w:r>
-        <w:t>1.3.3 Pioneering Chaos Engineering</w:t>
-      </w:r>
-    </w:p>
-    <w:p>
-      <w:pPr>
-        <w:spacing w:after="140" w:line="276" w:lineRule="auto"/>
+        <w:t>Redundancy across zones and regions:</w:t>
+      </w:r>
+      <w:r>
+        <w:t xml:space="preserve"> services run in several Availability Zones and in an </w:t>
+      </w:r>
+      <w:r>
+        <w:rPr>
+          <w:b/>
+          <w:bCs/>
+        </w:rPr>
+        <w:t>active–active multi-region</w:t>
+      </w:r>
+      <w:r>
+        <w:t xml:space="preserve"> set-up, so even the loss of an entire AWS region can be handled by moving traffic elsewhere.</w:t>
+      </w:r>
+    </w:p>
+    <w:p>
+      <w:pPr>
+        <w:pStyle w:val="ListParagraph"/>
+        <w:numPr>
+          <w:ilvl w:val="0"/>
+          <w:numId w:val="3"/>
+        </w:numPr>
+        <w:spacing w:after="80" w:line="264" w:lineRule="auto"/>
         <w:jc w:val="both"/>
       </w:pPr>
       <w:r>
-        <w:t xml:space="preserve">With thousands of cloud instances, failures are not a question of </w:t>
-      </w:r>
-      <w:r>
-        <w:rPr>
-          <w:b/>
-          <w:bCs/>
-        </w:rPr>
-        <w:t>if</w:t>
-      </w:r>
-      <w:r>
-        <w:t xml:space="preserve"> but </w:t>
-      </w:r>
-      <w:r>
-        <w:rPr>
-          <w:b/>
-          <w:bCs/>
-        </w:rPr>
-        <w:t>when</w:t>
-      </w:r>
-      <w:r>
-        <w:t xml:space="preserve">. Netflix’s insight was that the best way to avoid being surprised by failure at 3 a.m. is to </w:t>
-      </w:r>
-      <w:r>
-        <w:rPr>
-          <w:b/>
-          <w:bCs/>
-        </w:rPr>
-        <w:t>cause failure deliberately, during working hours, when engineers are present</w:t>
-      </w:r>
-      <w:r>
-        <w:t xml:space="preserve"> to observe and fix weaknesses. This became the discipline of </w:t>
-      </w:r>
-      <w:r>
-        <w:rPr>
-          <w:b/>
-          <w:bCs/>
-        </w:rPr>
-        <w:t>Chaos Engineering</w:t>
-      </w:r>
-      <w:r>
-        <w:t>: running controlled experiments on a production system to build confidence that it can withstand turbulent, real-world conditions.</w:t>
+        <w:rPr>
+          <w:b/>
+          <w:bCs/>
+        </w:rPr>
+        <w:t>Resilience patterns in code (Netflix OSS):</w:t>
+      </w:r>
+      <w:r>
+        <w:t xml:space="preserve"> </w:t>
+      </w:r>
+      <w:r>
+        <w:rPr>
+          <w:b/>
+          <w:bCs/>
+        </w:rPr>
+        <w:t>Eureka</w:t>
+      </w:r>
+      <w:r>
+        <w:t xml:space="preserve"> for service discovery, </w:t>
+      </w:r>
+      <w:r>
+        <w:rPr>
+          <w:b/>
+          <w:bCs/>
+        </w:rPr>
+        <w:t>Zuul</w:t>
+      </w:r>
+      <w:r>
+        <w:t xml:space="preserve"> as the edge API gateway, </w:t>
+      </w:r>
+      <w:r>
+        <w:rPr>
+          <w:b/>
+          <w:bCs/>
+        </w:rPr>
+        <w:t>Ribbon</w:t>
+      </w:r>
+      <w:r>
+        <w:t xml:space="preserve"> for client-side load balancing and </w:t>
+      </w:r>
+      <w:r>
+        <w:rPr>
+          <w:b/>
+          <w:bCs/>
+        </w:rPr>
+        <w:t>Hystrix</w:t>
+      </w:r>
+      <w:r>
+        <w:t xml:space="preserve"> for circuit breakers. With Hystrix, if the personalised-recommendations service fails, the user sees a generic list of popular titles instead of an error page — graceful degradation instead of total failure.</w:t>
       </w:r>
     </w:p>
     <w:p>
@@ -2562,10 +2437,10 @@
           <w:noProof/>
         </w:rPr>
         <w:drawing>
-          <wp:inline distT="0" distB="0" distL="0" distR="0" wp14:anchorId="688F53D8" wp14:editId="5D906EF7">
-            <wp:extent cx="5715000" cy="3286125"/>
+          <wp:inline distT="0" distB="0" distL="0" distR="0" wp14:anchorId="3471CF56" wp14:editId="0D2BE8D1">
+            <wp:extent cx="5715000" cy="4143375"/>
             <wp:effectExtent l="0" t="0" r="0" b="0"/>
-            <wp:docPr id="3" name="q1_chaos.png" descr="The Chaos Engineering experiment cycle (left) and the Simian Army’s progressively larger failure scenarios (right)." title="The Chaos Engineering experiment cycle (left) and the Simian Army’s progressively larger failure scenarios (right)."/>
+            <wp:docPr id="2" name="q1_microservices.png" descr="Cloud-native microservices on AWS: independent services, separate data stores, circuit breakers and multi-region redundancy." title="Cloud-native microservices on AWS: independent services, separate data stores, circuit breakers and multi-region redundancy."/>
             <wp:cNvGraphicFramePr>
               <a:graphicFrameLocks xmlns:a="http://schemas.openxmlformats.org/drawingml/2006/main" noChangeAspect="1"/>
             </wp:cNvGraphicFramePr>
@@ -2588,6 +2463,253 @@
                   <pic:spPr bwMode="auto">
                     <a:xfrm>
                       <a:off x="0" y="0"/>
+                      <a:ext cx="5715000" cy="4143375"/>
+                    </a:xfrm>
+                    <a:prstGeom prst="rect">
+                      <a:avLst/>
+                    </a:prstGeom>
+                  </pic:spPr>
+                </pic:pic>
+              </a:graphicData>
+            </a:graphic>
+          </wp:inline>
+        </w:drawing>
+      </w:r>
+    </w:p>
+    <w:p>
+      <w:pPr>
+        <w:spacing w:after="220"/>
+        <w:jc w:val="center"/>
+      </w:pPr>
+      <w:r>
+        <w:rPr>
+          <w:b/>
+          <w:bCs/>
+          <w:i/>
+          <w:iCs/>
+          <w:color w:val="595959"/>
+          <w:sz w:val="19"/>
+          <w:szCs w:val="19"/>
+        </w:rPr>
+        <w:t xml:space="preserve">Figure 1.2: </w:t>
+      </w:r>
+      <w:r>
+        <w:rPr>
+          <w:i/>
+          <w:iCs/>
+          <w:color w:val="595959"/>
+          <w:sz w:val="19"/>
+          <w:szCs w:val="19"/>
+        </w:rPr>
+        <w:t>Cloud-native microservices on AWS: independent services, separate data stores, circuit breakers and multi-region redundancy.</w:t>
+      </w:r>
+    </w:p>
+    <w:p>
+      <w:pPr>
+        <w:pStyle w:val="Heading3"/>
+      </w:pPr>
+      <w:r>
+        <w:t>1.3.2 DevOps Culture and Continuous Delivery</w:t>
+      </w:r>
+    </w:p>
+    <w:p>
+      <w:pPr>
+        <w:spacing w:after="140" w:line="276" w:lineRule="auto"/>
+        <w:jc w:val="both"/>
+      </w:pPr>
+      <w:r>
+        <w:t>Architecture alone was not enough; Netflix paired it with a strong DevOps culture:</w:t>
+      </w:r>
+    </w:p>
+    <w:p>
+      <w:pPr>
+        <w:pStyle w:val="ListParagraph"/>
+        <w:numPr>
+          <w:ilvl w:val="0"/>
+          <w:numId w:val="3"/>
+        </w:numPr>
+        <w:spacing w:after="80" w:line="264" w:lineRule="auto"/>
+        <w:jc w:val="both"/>
+      </w:pPr>
+      <w:r>
+        <w:rPr>
+          <w:b/>
+          <w:bCs/>
+        </w:rPr>
+        <w:t>“Freedom and Responsibility” and “You build it, you run it”:</w:t>
+      </w:r>
+      <w:r>
+        <w:t xml:space="preserve"> each team owns its service end-to-end — design, coding, testing, deployment and on-call support. There is no separate operations team to “throw code over the wall” to, so developers feel the consequences of their design choices and build for reliability.</w:t>
+      </w:r>
+    </w:p>
+    <w:p>
+      <w:pPr>
+        <w:pStyle w:val="ListParagraph"/>
+        <w:numPr>
+          <w:ilvl w:val="0"/>
+          <w:numId w:val="3"/>
+        </w:numPr>
+        <w:spacing w:after="80" w:line="264" w:lineRule="auto"/>
+        <w:jc w:val="both"/>
+      </w:pPr>
+      <w:r>
+        <w:rPr>
+          <w:b/>
+          <w:bCs/>
+        </w:rPr>
+        <w:lastRenderedPageBreak/>
+        <w:t>Continuous delivery with Spinnaker:</w:t>
+      </w:r>
+      <w:r>
+        <w:t xml:space="preserve"> Netflix built (and open-sourced in 2015) Spinnaker, a deployment platform supporting automated pipelines, red/black (blue–green) deployments, </w:t>
+      </w:r>
+      <w:r>
+        <w:rPr>
+          <w:b/>
+          <w:bCs/>
+        </w:rPr>
+        <w:t>automated canary analysis</w:t>
+      </w:r>
+      <w:r>
+        <w:t xml:space="preserve"> (a new version first receives a small share of traffic and is compared with the old version) and one-click rollback.</w:t>
+      </w:r>
+    </w:p>
+    <w:p>
+      <w:pPr>
+        <w:pStyle w:val="ListParagraph"/>
+        <w:numPr>
+          <w:ilvl w:val="0"/>
+          <w:numId w:val="3"/>
+        </w:numPr>
+        <w:spacing w:after="80" w:line="264" w:lineRule="auto"/>
+        <w:jc w:val="both"/>
+      </w:pPr>
+      <w:r>
+        <w:rPr>
+          <w:b/>
+          <w:bCs/>
+        </w:rPr>
+        <w:t>The “paved road”:</w:t>
+      </w:r>
+      <w:r>
+        <w:t xml:space="preserve"> central platform teams provide well-supported tools and templates so that the safe, resilient way is also the easiest way for product teams.</w:t>
+      </w:r>
+    </w:p>
+    <w:p>
+      <w:pPr>
+        <w:pStyle w:val="ListParagraph"/>
+        <w:numPr>
+          <w:ilvl w:val="0"/>
+          <w:numId w:val="3"/>
+        </w:numPr>
+        <w:spacing w:after="80" w:line="264" w:lineRule="auto"/>
+        <w:jc w:val="both"/>
+      </w:pPr>
+      <w:r>
+        <w:rPr>
+          <w:b/>
+          <w:bCs/>
+        </w:rPr>
+        <w:t>Observability and blameless learning:</w:t>
+      </w:r>
+      <w:r>
+        <w:t xml:space="preserve"> real-time telemetry (e.g., the Atlas monitoring system) and blameless post-incident reviews turn every failure into an improvement.</w:t>
+      </w:r>
+    </w:p>
+    <w:p>
+      <w:pPr>
+        <w:pStyle w:val="Heading3"/>
+      </w:pPr>
+      <w:r>
+        <w:t>1.3.3 Pioneering Chaos Engineering</w:t>
+      </w:r>
+    </w:p>
+    <w:p>
+      <w:pPr>
+        <w:spacing w:after="140" w:line="276" w:lineRule="auto"/>
+        <w:jc w:val="both"/>
+      </w:pPr>
+      <w:r>
+        <w:t xml:space="preserve">With thousands of cloud instances, failures are not a question of </w:t>
+      </w:r>
+      <w:r>
+        <w:rPr>
+          <w:b/>
+          <w:bCs/>
+        </w:rPr>
+        <w:t>if</w:t>
+      </w:r>
+      <w:r>
+        <w:t xml:space="preserve"> but </w:t>
+      </w:r>
+      <w:r>
+        <w:rPr>
+          <w:b/>
+          <w:bCs/>
+        </w:rPr>
+        <w:t>when</w:t>
+      </w:r>
+      <w:r>
+        <w:t xml:space="preserve">. Netflix’s insight was that the best way to avoid being surprised by failure at 3 a.m. is to </w:t>
+      </w:r>
+      <w:r>
+        <w:rPr>
+          <w:b/>
+          <w:bCs/>
+        </w:rPr>
+        <w:t>cause failure deliberately, during working hours, when engineers are present</w:t>
+      </w:r>
+      <w:r>
+        <w:t xml:space="preserve"> to observe and fix weaknesses. This became the discipline of </w:t>
+      </w:r>
+      <w:r>
+        <w:rPr>
+          <w:b/>
+          <w:bCs/>
+        </w:rPr>
+        <w:t>Chaos Engineering</w:t>
+      </w:r>
+      <w:r>
+        <w:t>: running controlled experiments on a production system to build confidence that it can withstand turbulent, real-world conditions.</w:t>
+      </w:r>
+    </w:p>
+    <w:p>
+      <w:pPr>
+        <w:keepNext/>
+        <w:spacing w:before="160" w:after="60"/>
+        <w:jc w:val="center"/>
+      </w:pPr>
+      <w:r>
+        <w:rPr>
+          <w:noProof/>
+        </w:rPr>
+        <w:drawing>
+          <wp:inline distT="0" distB="0" distL="0" distR="0" wp14:anchorId="688F53D8" wp14:editId="5D906EF7">
+            <wp:extent cx="5715000" cy="3286125"/>
+            <wp:effectExtent l="0" t="0" r="0" b="0"/>
+            <wp:docPr id="3" name="q1_chaos.png" descr="The Chaos Engineering experiment cycle (left) and the Simian Army’s progressively larger failure scenarios (right)." title="The Chaos Engineering experiment cycle (left) and the Simian Army’s progressively larger failure scenarios (right)."/>
+            <wp:cNvGraphicFramePr>
+              <a:graphicFrameLocks xmlns:a="http://schemas.openxmlformats.org/drawingml/2006/main" noChangeAspect="1"/>
+            </wp:cNvGraphicFramePr>
+            <a:graphic xmlns:a="http://schemas.openxmlformats.org/drawingml/2006/main">
+              <a:graphicData uri="http://schemas.openxmlformats.org/drawingml/2006/picture">
+                <pic:pic xmlns:pic="http://schemas.openxmlformats.org/drawingml/2006/picture">
+                  <pic:nvPicPr>
+                    <pic:cNvPr id="0" name=""/>
+                    <pic:cNvPicPr>
+                      <a:picLocks noChangeAspect="1" noChangeArrowheads="1"/>
+                    </pic:cNvPicPr>
+                  </pic:nvPicPr>
+                  <pic:blipFill>
+                    <a:blip r:embed="rId10"/>
+                    <a:srcRect/>
+                    <a:stretch>
+                      <a:fillRect/>
+                    </a:stretch>
+                  </pic:blipFill>
+                  <pic:spPr bwMode="auto">
+                    <a:xfrm>
+                      <a:off x="0" y="0"/>
                       <a:ext cx="5715000" cy="3286125"/>
                     </a:xfrm>
                     <a:prstGeom prst="rect">
@@ -2791,7 +2913,7 @@
       <w:pPr>
         <w:pStyle w:val="Heading2"/>
       </w:pPr>
-      <w:bookmarkStart w:id="4" w:name="_Toc241782123"/>
+      <w:bookmarkStart w:id="4" w:name="_Toc241782931"/>
       <w:r>
         <w:t>1.4 Impact on Resilience and Scalability</w:t>
       </w:r>
@@ -3710,7 +3832,7 @@
                     </pic:cNvPicPr>
                   </pic:nvPicPr>
                   <pic:blipFill>
-                    <a:blip r:embed="rId10"/>
+                    <a:blip r:embed="rId11"/>
                     <a:srcRect/>
                     <a:stretch>
                       <a:fillRect/>
@@ -3764,7 +3886,7 @@
       <w:pPr>
         <w:pStyle w:val="Heading2"/>
       </w:pPr>
-      <w:bookmarkStart w:id="5" w:name="_Toc241782124"/>
+      <w:bookmarkStart w:id="5" w:name="_Toc241782932"/>
       <w:r>
         <w:t>1.5 Critical Analysis</w:t>
       </w:r>
@@ -3940,7 +4062,7 @@
       <w:pPr>
         <w:pStyle w:val="Heading2"/>
       </w:pPr>
-      <w:bookmarkStart w:id="6" w:name="_Toc241782125"/>
+      <w:bookmarkStart w:id="6" w:name="_Toc241782933"/>
       <w:r>
         <w:t>1.6 Conclusion</w:t>
       </w:r>
@@ -3960,7 +4082,7 @@
         <w:pStyle w:val="Heading1"/>
         <w:pageBreakBefore/>
       </w:pPr>
-      <w:bookmarkStart w:id="7" w:name="_Toc241782126"/>
+      <w:bookmarkStart w:id="7" w:name="_Toc241782934"/>
       <w:r>
         <w:lastRenderedPageBreak/>
         <w:t>Question 2: Amazon — Two-Pizza Teams, Microservices and a Culture of Continuous Innovation</w:t>
@@ -4060,7 +4182,7 @@
       <w:pPr>
         <w:pStyle w:val="Heading2"/>
       </w:pPr>
-      <w:bookmarkStart w:id="8" w:name="_Toc241782127"/>
+      <w:bookmarkStart w:id="8" w:name="_Toc241782935"/>
       <w:r>
         <w:t>2.1 Introduction and Background</w:t>
       </w:r>
@@ -4099,7 +4221,7 @@
       <w:pPr>
         <w:pStyle w:val="Heading2"/>
       </w:pPr>
-      <w:bookmarkStart w:id="9" w:name="_Toc241782128"/>
+      <w:bookmarkStart w:id="9" w:name="_Toc241782936"/>
       <w:r>
         <w:t>2.2 Challenges of the Monolithic System</w:t>
       </w:r>
@@ -4260,7 +4382,7 @@
                     </pic:cNvPicPr>
                   </pic:nvPicPr>
                   <pic:blipFill>
-                    <a:blip r:embed="rId11"/>
+                    <a:blip r:embed="rId12"/>
                     <a:srcRect/>
                     <a:stretch>
                       <a:fillRect/>
@@ -4878,7 +5000,7 @@
       <w:pPr>
         <w:pStyle w:val="Heading2"/>
       </w:pPr>
-      <w:bookmarkStart w:id="10" w:name="_Toc241782129"/>
+      <w:bookmarkStart w:id="10" w:name="_Toc241782937"/>
       <w:r>
         <w:t>2.3 Amazon’s Solution</w:t>
       </w:r>
@@ -5133,125 +5255,6 @@
             <wp:extent cx="5715000" cy="3790950"/>
             <wp:effectExtent l="0" t="0" r="0" b="0"/>
             <wp:docPr id="6" name="q2_two_pizza.png" descr="Two-pizza teams: each small, autonomous team owns one microservice and its data, and services interact only through APIs." title="Two-pizza teams: each small, autonomous team owns one microservice and its data, and services interact only through APIs."/>
-            <wp:cNvGraphicFramePr>
-              <a:graphicFrameLocks xmlns:a="http://schemas.openxmlformats.org/drawingml/2006/main" noChangeAspect="1"/>
-            </wp:cNvGraphicFramePr>
-            <a:graphic xmlns:a="http://schemas.openxmlformats.org/drawingml/2006/main">
-              <a:graphicData uri="http://schemas.openxmlformats.org/drawingml/2006/picture">
-                <pic:pic xmlns:pic="http://schemas.openxmlformats.org/drawingml/2006/picture">
-                  <pic:nvPicPr>
-                    <pic:cNvPr id="0" name=""/>
-                    <pic:cNvPicPr>
-                      <a:picLocks noChangeAspect="1" noChangeArrowheads="1"/>
-                    </pic:cNvPicPr>
-                  </pic:nvPicPr>
-                  <pic:blipFill>
-                    <a:blip r:embed="rId12"/>
-                    <a:srcRect/>
-                    <a:stretch>
-                      <a:fillRect/>
-                    </a:stretch>
-                  </pic:blipFill>
-                  <pic:spPr bwMode="auto">
-                    <a:xfrm>
-                      <a:off x="0" y="0"/>
-                      <a:ext cx="5715000" cy="3790950"/>
-                    </a:xfrm>
-                    <a:prstGeom prst="rect">
-                      <a:avLst/>
-                    </a:prstGeom>
-                  </pic:spPr>
-                </pic:pic>
-              </a:graphicData>
-            </a:graphic>
-          </wp:inline>
-        </w:drawing>
-      </w:r>
-    </w:p>
-    <w:p>
-      <w:pPr>
-        <w:spacing w:after="220"/>
-        <w:jc w:val="center"/>
-      </w:pPr>
-      <w:r>
-        <w:rPr>
-          <w:b/>
-          <w:bCs/>
-          <w:i/>
-          <w:iCs/>
-          <w:color w:val="595959"/>
-          <w:sz w:val="19"/>
-          <w:szCs w:val="19"/>
-        </w:rPr>
-        <w:t xml:space="preserve">Figure 2.2: </w:t>
-      </w:r>
-      <w:r>
-        <w:rPr>
-          <w:i/>
-          <w:iCs/>
-          <w:color w:val="595959"/>
-          <w:sz w:val="19"/>
-          <w:szCs w:val="19"/>
-        </w:rPr>
-        <w:t>Two-pizza teams: each small, autonomous team owns one microservice and its data, and services interact only through APIs.</w:t>
-      </w:r>
-    </w:p>
-    <w:p>
-      <w:pPr>
-        <w:pStyle w:val="Heading3"/>
-      </w:pPr>
-      <w:r>
-        <w:t>2.3.3 Automation: Continuous Delivery at Scale</w:t>
-      </w:r>
-    </w:p>
-    <w:p>
-      <w:pPr>
-        <w:spacing w:after="140" w:line="276" w:lineRule="auto"/>
-        <w:jc w:val="both"/>
-      </w:pPr>
-      <w:r>
-        <w:t xml:space="preserve">Independent teams can only move fast if releasing software is cheap and safe. Amazon therefore built internal deployment tooling (the “Apollo” deployment system and automated pipelines) so that each service has its own pipeline: code is built and tested automatically, deployed first to a single host </w:t>
-      </w:r>
-      <w:r>
-        <w:lastRenderedPageBreak/>
-        <w:t xml:space="preserve">(canary), then to one Availability Zone, then region by region, with health metrics monitored at every step and </w:t>
-      </w:r>
-      <w:r>
-        <w:rPr>
-          <w:b/>
-          <w:bCs/>
-        </w:rPr>
-        <w:t>automatic rollback</w:t>
-      </w:r>
-      <w:r>
-        <w:t xml:space="preserve"> if alarms fire. The internal infrastructure platforms built during this period later became the foundation of </w:t>
-      </w:r>
-      <w:r>
-        <w:rPr>
-          <w:b/>
-          <w:bCs/>
-        </w:rPr>
-        <w:t>Amazon Web Services (AWS)</w:t>
-      </w:r>
-      <w:r>
-        <w:t>, launched publicly in 2006.</w:t>
-      </w:r>
-    </w:p>
-    <w:p>
-      <w:pPr>
-        <w:keepNext/>
-        <w:spacing w:before="160" w:after="60"/>
-        <w:jc w:val="center"/>
-      </w:pPr>
-      <w:r>
-        <w:rPr>
-          <w:noProof/>
-        </w:rPr>
-        <w:drawing>
-          <wp:inline distT="0" distB="0" distL="0" distR="0" wp14:anchorId="2A806CC3" wp14:editId="1BD9429E">
-            <wp:extent cx="5715000" cy="2076450"/>
-            <wp:effectExtent l="0" t="0" r="0" b="0"/>
-            <wp:docPr id="7" name="q2_pipeline.png" descr="A per-service automated deployment pipeline with staged rollout and automatic rollback." title="A per-service automated deployment pipeline with staged rollout and automatic rollback."/>
             <wp:cNvGraphicFramePr>
               <a:graphicFrameLocks xmlns:a="http://schemas.openxmlformats.org/drawingml/2006/main" noChangeAspect="1"/>
             </wp:cNvGraphicFramePr>
@@ -5274,6 +5277,125 @@
                   <pic:spPr bwMode="auto">
                     <a:xfrm>
                       <a:off x="0" y="0"/>
+                      <a:ext cx="5715000" cy="3790950"/>
+                    </a:xfrm>
+                    <a:prstGeom prst="rect">
+                      <a:avLst/>
+                    </a:prstGeom>
+                  </pic:spPr>
+                </pic:pic>
+              </a:graphicData>
+            </a:graphic>
+          </wp:inline>
+        </w:drawing>
+      </w:r>
+    </w:p>
+    <w:p>
+      <w:pPr>
+        <w:spacing w:after="220"/>
+        <w:jc w:val="center"/>
+      </w:pPr>
+      <w:r>
+        <w:rPr>
+          <w:b/>
+          <w:bCs/>
+          <w:i/>
+          <w:iCs/>
+          <w:color w:val="595959"/>
+          <w:sz w:val="19"/>
+          <w:szCs w:val="19"/>
+        </w:rPr>
+        <w:t xml:space="preserve">Figure 2.2: </w:t>
+      </w:r>
+      <w:r>
+        <w:rPr>
+          <w:i/>
+          <w:iCs/>
+          <w:color w:val="595959"/>
+          <w:sz w:val="19"/>
+          <w:szCs w:val="19"/>
+        </w:rPr>
+        <w:t>Two-pizza teams: each small, autonomous team owns one microservice and its data, and services interact only through APIs.</w:t>
+      </w:r>
+    </w:p>
+    <w:p>
+      <w:pPr>
+        <w:pStyle w:val="Heading3"/>
+      </w:pPr>
+      <w:r>
+        <w:t>2.3.3 Automation: Continuous Delivery at Scale</w:t>
+      </w:r>
+    </w:p>
+    <w:p>
+      <w:pPr>
+        <w:spacing w:after="140" w:line="276" w:lineRule="auto"/>
+        <w:jc w:val="both"/>
+      </w:pPr>
+      <w:r>
+        <w:t xml:space="preserve">Independent teams can only move fast if releasing software is cheap and safe. Amazon therefore built internal deployment tooling (the “Apollo” deployment system and automated pipelines) so that each service has its own pipeline: code is built and tested automatically, deployed first to a single host </w:t>
+      </w:r>
+      <w:r>
+        <w:lastRenderedPageBreak/>
+        <w:t xml:space="preserve">(canary), then to one Availability Zone, then region by region, with health metrics monitored at every step and </w:t>
+      </w:r>
+      <w:r>
+        <w:rPr>
+          <w:b/>
+          <w:bCs/>
+        </w:rPr>
+        <w:t>automatic rollback</w:t>
+      </w:r>
+      <w:r>
+        <w:t xml:space="preserve"> if alarms fire. The internal infrastructure platforms built during this period later became the foundation of </w:t>
+      </w:r>
+      <w:r>
+        <w:rPr>
+          <w:b/>
+          <w:bCs/>
+        </w:rPr>
+        <w:t>Amazon Web Services (AWS)</w:t>
+      </w:r>
+      <w:r>
+        <w:t>, launched publicly in 2006.</w:t>
+      </w:r>
+    </w:p>
+    <w:p>
+      <w:pPr>
+        <w:keepNext/>
+        <w:spacing w:before="160" w:after="60"/>
+        <w:jc w:val="center"/>
+      </w:pPr>
+      <w:r>
+        <w:rPr>
+          <w:noProof/>
+        </w:rPr>
+        <w:drawing>
+          <wp:inline distT="0" distB="0" distL="0" distR="0" wp14:anchorId="2A806CC3" wp14:editId="1BD9429E">
+            <wp:extent cx="5715000" cy="2076450"/>
+            <wp:effectExtent l="0" t="0" r="0" b="0"/>
+            <wp:docPr id="7" name="q2_pipeline.png" descr="A per-service automated deployment pipeline with staged rollout and automatic rollback." title="A per-service automated deployment pipeline with staged rollout and automatic rollback."/>
+            <wp:cNvGraphicFramePr>
+              <a:graphicFrameLocks xmlns:a="http://schemas.openxmlformats.org/drawingml/2006/main" noChangeAspect="1"/>
+            </wp:cNvGraphicFramePr>
+            <a:graphic xmlns:a="http://schemas.openxmlformats.org/drawingml/2006/main">
+              <a:graphicData uri="http://schemas.openxmlformats.org/drawingml/2006/picture">
+                <pic:pic xmlns:pic="http://schemas.openxmlformats.org/drawingml/2006/picture">
+                  <pic:nvPicPr>
+                    <pic:cNvPr id="0" name=""/>
+                    <pic:cNvPicPr>
+                      <a:picLocks noChangeAspect="1" noChangeArrowheads="1"/>
+                    </pic:cNvPicPr>
+                  </pic:nvPicPr>
+                  <pic:blipFill>
+                    <a:blip r:embed="rId14"/>
+                    <a:srcRect/>
+                    <a:stretch>
+                      <a:fillRect/>
+                    </a:stretch>
+                  </pic:blipFill>
+                  <pic:spPr bwMode="auto">
+                    <a:xfrm>
+                      <a:off x="0" y="0"/>
                       <a:ext cx="5715000" cy="2076450"/>
                     </a:xfrm>
                     <a:prstGeom prst="rect">
@@ -5319,7 +5441,7 @@
       <w:pPr>
         <w:pStyle w:val="Heading2"/>
       </w:pPr>
-      <w:bookmarkStart w:id="11" w:name="_Toc241782130"/>
+      <w:bookmarkStart w:id="11" w:name="_Toc241782938"/>
       <w:r>
         <w:t>2.4 How the Shift Directly Solved the Monolith’s Problems</w:t>
       </w:r>
@@ -6069,7 +6191,7 @@
       <w:pPr>
         <w:pStyle w:val="Heading2"/>
       </w:pPr>
-      <w:bookmarkStart w:id="12" w:name="_Toc241782131"/>
+      <w:bookmarkStart w:id="12" w:name="_Toc241782939"/>
       <w:r>
         <w:t>2.5 Fostering a Culture of Continuous Innovation (Deploying Every 11.7 Seconds)</w:t>
       </w:r>
@@ -6330,7 +6452,7 @@
                     </pic:cNvPicPr>
                   </pic:nvPicPr>
                   <pic:blipFill>
-                    <a:blip r:embed="rId14"/>
+                    <a:blip r:embed="rId15"/>
                     <a:srcRect/>
                     <a:stretch>
                       <a:fillRect/>
@@ -6457,7 +6579,7 @@
       <w:pPr>
         <w:pStyle w:val="Heading2"/>
       </w:pPr>
-      <w:bookmarkStart w:id="13" w:name="_Toc241782132"/>
+      <w:bookmarkStart w:id="13" w:name="_Toc241782940"/>
       <w:r>
         <w:t>2.6 Critical Analysis</w:t>
       </w:r>
@@ -6540,7 +6662,7 @@
       <w:pPr>
         <w:pStyle w:val="Heading2"/>
       </w:pPr>
-      <w:bookmarkStart w:id="14" w:name="_Toc241782133"/>
+      <w:bookmarkStart w:id="14" w:name="_Toc241782941"/>
       <w:r>
         <w:t>2.7 Conclusion</w:t>
       </w:r>
@@ -6560,7 +6682,7 @@
         <w:pStyle w:val="Heading1"/>
         <w:pageBreakBefore/>
       </w:pPr>
-      <w:bookmarkStart w:id="15" w:name="_Toc241782134"/>
+      <w:bookmarkStart w:id="15" w:name="_Toc241782942"/>
       <w:r>
         <w:lastRenderedPageBreak/>
         <w:t>Comparative Summary</w:t>
@@ -7236,7 +7358,7 @@
                     </pic:cNvPicPr>
                   </pic:nvPicPr>
                   <pic:blipFill>
-                    <a:blip r:embed="rId15"/>
+                    <a:blip r:embed="rId16"/>
                     <a:srcRect/>
                     <a:stretch>
                       <a:fillRect/>
@@ -7290,7 +7412,7 @@
       <w:pPr>
         <w:pStyle w:val="Heading2"/>
       </w:pPr>
-      <w:bookmarkStart w:id="16" w:name="_Toc241782135"/>
+      <w:bookmarkStart w:id="16" w:name="_Toc241782943"/>
       <w:r>
         <w:t>Overall Conclusion</w:t>
       </w:r>
@@ -7364,12 +7486,531 @@
         <w:pStyle w:val="Heading1"/>
         <w:pageBreakBefore/>
       </w:pPr>
-      <w:bookmarkStart w:id="17" w:name="_Toc241782136"/>
+      <w:bookmarkStart w:id="17" w:name="_Toc241782944"/>
+      <w:r>
+        <w:lastRenderedPageBreak/>
+        <w:t>Practical Implementation (GitHub Repository)</w:t>
+      </w:r>
+      <w:bookmarkEnd w:id="17"/>
+    </w:p>
+    <w:p>
+      <w:pPr>
+        <w:spacing w:after="140" w:line="276" w:lineRule="auto"/>
+      </w:pPr>
+      <w:r>
+        <w:t xml:space="preserve">The hands-on part of this evaluation is implemented in a public GitHub repository: </w:t>
+      </w:r>
+      <w:hyperlink r:id="rId17" w:history="1">
+        <w:r>
+          <w:rPr>
+            <w:rStyle w:val="Hyperlink"/>
+          </w:rPr>
+          <w:t>https://github.com/AnshulMandekar/AnshulMandekar-devops-case-study-main</w:t>
+        </w:r>
+      </w:hyperlink>
+    </w:p>
+    <w:p>
+      <w:pPr>
+        <w:spacing w:after="140" w:line="276" w:lineRule="auto"/>
+        <w:jc w:val="both"/>
+      </w:pPr>
+      <w:r>
+        <w:t xml:space="preserve">The repository applies the DevOps practices discussed in the two case studies to a microservice taken from my B.Tech PBL project, </w:t>
+      </w:r>
+      <w:r>
+        <w:rPr>
+          <w:b/>
+          <w:bCs/>
+        </w:rPr>
+        <w:t>FinVeritas</w:t>
+      </w:r>
+      <w:r>
+        <w:t xml:space="preserve"> (an explainable financial-analysis system). Its financial-ratio engine is packaged as an independent service and then built, tested, deployed, configured and monitored with a complete DevOps toolchain. The CI/CD pipeline runs automatically on every push to the main branch.</w:t>
+      </w:r>
+    </w:p>
+    <w:p>
+      <w:pPr>
+        <w:keepNext/>
+        <w:spacing w:before="120" w:after="80"/>
+      </w:pPr>
+      <w:r>
+        <w:rPr>
+          <w:color w:val="1F3864"/>
+          <w:sz w:val="20"/>
+          <w:szCs w:val="20"/>
+        </w:rPr>
+        <w:t>Table 4.1: Practical tasks and where they are implemented in the repository</w:t>
+      </w:r>
+    </w:p>
+    <w:tbl>
+      <w:tblPr>
+        <w:tblW w:w="9026" w:type="dxa"/>
+        <w:tblBorders>
+          <w:top w:val="single" w:sz="4" w:space="0" w:color="auto"/>
+          <w:left w:val="single" w:sz="4" w:space="0" w:color="auto"/>
+          <w:bottom w:val="single" w:sz="4" w:space="0" w:color="auto"/>
+          <w:right w:val="single" w:sz="4" w:space="0" w:color="auto"/>
+          <w:insideH w:val="single" w:sz="4" w:space="0" w:color="auto"/>
+          <w:insideV w:val="single" w:sz="4" w:space="0" w:color="auto"/>
+        </w:tblBorders>
+        <w:tblLayout w:type="fixed"/>
+        <w:tblCellMar>
+          <w:left w:w="10" w:type="dxa"/>
+          <w:right w:w="10" w:type="dxa"/>
+        </w:tblCellMar>
+        <w:tblLook w:val="04A0" w:firstRow="1" w:lastRow="0" w:firstColumn="1" w:lastColumn="0" w:noHBand="0" w:noVBand="1"/>
+      </w:tblPr>
+      <w:tblGrid>
+        <w:gridCol w:w="2700"/>
+        <w:gridCol w:w="6326"/>
+      </w:tblGrid>
+      <w:tr>
+        <w:trPr>
+          <w:tblHeader/>
+        </w:trPr>
+        <w:tc>
+          <w:tcPr>
+            <w:tcW w:w="2700" w:type="dxa"/>
+            <w:tcBorders>
+              <w:top w:val="single" w:sz="4" w:space="0" w:color="BFBFBF"/>
+              <w:left w:val="single" w:sz="4" w:space="0" w:color="BFBFBF"/>
+              <w:bottom w:val="single" w:sz="4" w:space="0" w:color="BFBFBF"/>
+              <w:right w:val="single" w:sz="4" w:space="0" w:color="BFBFBF"/>
+            </w:tcBorders>
+            <w:shd w:val="clear" w:color="auto" w:fill="1F3864"/>
+            <w:tcMar>
+              <w:top w:w="70" w:type="dxa"/>
+              <w:left w:w="110" w:type="dxa"/>
+              <w:bottom w:w="70" w:type="dxa"/>
+              <w:right w:w="110" w:type="dxa"/>
+            </w:tcMar>
+            <w:vAlign w:val="center"/>
+          </w:tcPr>
+          <w:p>
+            <w:pPr>
+              <w:spacing w:line="252" w:lineRule="auto"/>
+            </w:pPr>
+            <w:r>
+              <w:rPr>
+                <w:color w:val="FFFFFF"/>
+                <w:sz w:val="20"/>
+                <w:szCs w:val="20"/>
+              </w:rPr>
+              <w:t>Task</w:t>
+            </w:r>
+          </w:p>
+        </w:tc>
+        <w:tc>
+          <w:tcPr>
+            <w:tcW w:w="6326" w:type="dxa"/>
+            <w:tcBorders>
+              <w:top w:val="single" w:sz="4" w:space="0" w:color="BFBFBF"/>
+              <w:left w:val="single" w:sz="4" w:space="0" w:color="BFBFBF"/>
+              <w:bottom w:val="single" w:sz="4" w:space="0" w:color="BFBFBF"/>
+              <w:right w:val="single" w:sz="4" w:space="0" w:color="BFBFBF"/>
+            </w:tcBorders>
+            <w:shd w:val="clear" w:color="auto" w:fill="1F3864"/>
+            <w:tcMar>
+              <w:top w:w="70" w:type="dxa"/>
+              <w:left w:w="110" w:type="dxa"/>
+              <w:bottom w:w="70" w:type="dxa"/>
+              <w:right w:w="110" w:type="dxa"/>
+            </w:tcMar>
+            <w:vAlign w:val="center"/>
+          </w:tcPr>
+          <w:p>
+            <w:pPr>
+              <w:spacing w:line="252" w:lineRule="auto"/>
+            </w:pPr>
+            <w:r>
+              <w:rPr>
+                <w:color w:val="FFFFFF"/>
+                <w:sz w:val="20"/>
+                <w:szCs w:val="20"/>
+              </w:rPr>
+              <w:t>Implementation in the repository</w:t>
+            </w:r>
+          </w:p>
+        </w:tc>
+      </w:tr>
+      <w:tr>
+        <w:trPr>
+          <w:cantSplit/>
+        </w:trPr>
+        <w:tc>
+          <w:tcPr>
+            <w:tcW w:w="2700" w:type="dxa"/>
+            <w:tcBorders>
+              <w:top w:val="single" w:sz="4" w:space="0" w:color="BFBFBF"/>
+              <w:left w:val="single" w:sz="4" w:space="0" w:color="BFBFBF"/>
+              <w:bottom w:val="single" w:sz="4" w:space="0" w:color="BFBFBF"/>
+              <w:right w:val="single" w:sz="4" w:space="0" w:color="BFBFBF"/>
+            </w:tcBorders>
+            <w:shd w:val="clear" w:color="auto" w:fill="FFFFFF"/>
+            <w:tcMar>
+              <w:top w:w="70" w:type="dxa"/>
+              <w:left w:w="110" w:type="dxa"/>
+              <w:bottom w:w="70" w:type="dxa"/>
+              <w:right w:w="110" w:type="dxa"/>
+            </w:tcMar>
+            <w:vAlign w:val="center"/>
+          </w:tcPr>
+          <w:p>
+            <w:pPr>
+              <w:spacing w:line="252" w:lineRule="auto"/>
+            </w:pPr>
+            <w:r>
+              <w:rPr>
+                <w:b/>
+                <w:bCs/>
+                <w:sz w:val="20"/>
+                <w:szCs w:val="20"/>
+              </w:rPr>
+              <w:t>1 – Deployment strategy</w:t>
+            </w:r>
+          </w:p>
+        </w:tc>
+        <w:tc>
+          <w:tcPr>
+            <w:tcW w:w="6326" w:type="dxa"/>
+            <w:tcBorders>
+              <w:top w:val="single" w:sz="4" w:space="0" w:color="BFBFBF"/>
+              <w:left w:val="single" w:sz="4" w:space="0" w:color="BFBFBF"/>
+              <w:bottom w:val="single" w:sz="4" w:space="0" w:color="BFBFBF"/>
+              <w:right w:val="single" w:sz="4" w:space="0" w:color="BFBFBF"/>
+            </w:tcBorders>
+            <w:shd w:val="clear" w:color="auto" w:fill="FFFFFF"/>
+            <w:tcMar>
+              <w:top w:w="70" w:type="dxa"/>
+              <w:left w:w="110" w:type="dxa"/>
+              <w:bottom w:w="70" w:type="dxa"/>
+              <w:right w:w="110" w:type="dxa"/>
+            </w:tcMar>
+            <w:vAlign w:val="center"/>
+          </w:tcPr>
+          <w:p>
+            <w:pPr>
+              <w:spacing w:line="252" w:lineRule="auto"/>
+            </w:pPr>
+            <w:r>
+              <w:rPr>
+                <w:sz w:val="20"/>
+                <w:szCs w:val="20"/>
+              </w:rPr>
+              <w:t>GitHub Actions CI/CD pipeline (.github/workflows/ci-cd.yml): lint and unit tests, security scan, Docker build and push to GitHub Container Registry, then a rolling deployment to Kubernetes with smoke tests</w:t>
+            </w:r>
+          </w:p>
+        </w:tc>
+      </w:tr>
+      <w:tr>
+        <w:trPr>
+          <w:cantSplit/>
+        </w:trPr>
+        <w:tc>
+          <w:tcPr>
+            <w:tcW w:w="2700" w:type="dxa"/>
+            <w:tcBorders>
+              <w:top w:val="single" w:sz="4" w:space="0" w:color="BFBFBF"/>
+              <w:left w:val="single" w:sz="4" w:space="0" w:color="BFBFBF"/>
+              <w:bottom w:val="single" w:sz="4" w:space="0" w:color="BFBFBF"/>
+              <w:right w:val="single" w:sz="4" w:space="0" w:color="BFBFBF"/>
+            </w:tcBorders>
+            <w:shd w:val="clear" w:color="auto" w:fill="F3F6FA"/>
+            <w:tcMar>
+              <w:top w:w="70" w:type="dxa"/>
+              <w:left w:w="110" w:type="dxa"/>
+              <w:bottom w:w="70" w:type="dxa"/>
+              <w:right w:w="110" w:type="dxa"/>
+            </w:tcMar>
+            <w:vAlign w:val="center"/>
+          </w:tcPr>
+          <w:p>
+            <w:pPr>
+              <w:spacing w:line="252" w:lineRule="auto"/>
+            </w:pPr>
+            <w:r>
+              <w:rPr>
+                <w:b/>
+                <w:bCs/>
+                <w:sz w:val="20"/>
+                <w:szCs w:val="20"/>
+              </w:rPr>
+              <w:t>2 – Configuration management</w:t>
+            </w:r>
+          </w:p>
+        </w:tc>
+        <w:tc>
+          <w:tcPr>
+            <w:tcW w:w="6326" w:type="dxa"/>
+            <w:tcBorders>
+              <w:top w:val="single" w:sz="4" w:space="0" w:color="BFBFBF"/>
+              <w:left w:val="single" w:sz="4" w:space="0" w:color="BFBFBF"/>
+              <w:bottom w:val="single" w:sz="4" w:space="0" w:color="BFBFBF"/>
+              <w:right w:val="single" w:sz="4" w:space="0" w:color="BFBFBF"/>
+            </w:tcBorders>
+            <w:shd w:val="clear" w:color="auto" w:fill="F3F6FA"/>
+            <w:tcMar>
+              <w:top w:w="70" w:type="dxa"/>
+              <w:left w:w="110" w:type="dxa"/>
+              <w:bottom w:w="70" w:type="dxa"/>
+              <w:right w:w="110" w:type="dxa"/>
+            </w:tcMar>
+            <w:vAlign w:val="center"/>
+          </w:tcPr>
+          <w:p>
+            <w:pPr>
+              <w:spacing w:line="252" w:lineRule="auto"/>
+            </w:pPr>
+            <w:r>
+              <w:rPr>
+                <w:sz w:val="20"/>
+                <w:szCs w:val="20"/>
+              </w:rPr>
+              <w:t>Ansible playbook and inventory (ansible/) that install packages, create users, manage files and run the service with systemd</w:t>
+            </w:r>
+          </w:p>
+        </w:tc>
+      </w:tr>
+      <w:tr>
+        <w:trPr>
+          <w:cantSplit/>
+        </w:trPr>
+        <w:tc>
+          <w:tcPr>
+            <w:tcW w:w="2700" w:type="dxa"/>
+            <w:tcBorders>
+              <w:top w:val="single" w:sz="4" w:space="0" w:color="BFBFBF"/>
+              <w:left w:val="single" w:sz="4" w:space="0" w:color="BFBFBF"/>
+              <w:bottom w:val="single" w:sz="4" w:space="0" w:color="BFBFBF"/>
+              <w:right w:val="single" w:sz="4" w:space="0" w:color="BFBFBF"/>
+            </w:tcBorders>
+            <w:shd w:val="clear" w:color="auto" w:fill="FFFFFF"/>
+            <w:tcMar>
+              <w:top w:w="70" w:type="dxa"/>
+              <w:left w:w="110" w:type="dxa"/>
+              <w:bottom w:w="70" w:type="dxa"/>
+              <w:right w:w="110" w:type="dxa"/>
+            </w:tcMar>
+            <w:vAlign w:val="center"/>
+          </w:tcPr>
+          <w:p>
+            <w:pPr>
+              <w:spacing w:line="252" w:lineRule="auto"/>
+            </w:pPr>
+            <w:r>
+              <w:rPr>
+                <w:b/>
+                <w:bCs/>
+                <w:sz w:val="20"/>
+                <w:szCs w:val="20"/>
+              </w:rPr>
+              <w:t>3 – Containerization &amp; orchestration</w:t>
+            </w:r>
+          </w:p>
+        </w:tc>
+        <w:tc>
+          <w:tcPr>
+            <w:tcW w:w="6326" w:type="dxa"/>
+            <w:tcBorders>
+              <w:top w:val="single" w:sz="4" w:space="0" w:color="BFBFBF"/>
+              <w:left w:val="single" w:sz="4" w:space="0" w:color="BFBFBF"/>
+              <w:bottom w:val="single" w:sz="4" w:space="0" w:color="BFBFBF"/>
+              <w:right w:val="single" w:sz="4" w:space="0" w:color="BFBFBF"/>
+            </w:tcBorders>
+            <w:shd w:val="clear" w:color="auto" w:fill="FFFFFF"/>
+            <w:tcMar>
+              <w:top w:w="70" w:type="dxa"/>
+              <w:left w:w="110" w:type="dxa"/>
+              <w:bottom w:w="70" w:type="dxa"/>
+              <w:right w:w="110" w:type="dxa"/>
+            </w:tcMar>
+            <w:vAlign w:val="center"/>
+          </w:tcPr>
+          <w:p>
+            <w:pPr>
+              <w:spacing w:line="252" w:lineRule="auto"/>
+            </w:pPr>
+            <w:r>
+              <w:rPr>
+                <w:sz w:val="20"/>
+                <w:szCs w:val="20"/>
+              </w:rPr>
+              <w:t>Dockerfile and Kubernetes Deployment/Service manifests (k8s/) with rolling-update and rollback commands</w:t>
+            </w:r>
+          </w:p>
+        </w:tc>
+      </w:tr>
+      <w:tr>
+        <w:trPr>
+          <w:cantSplit/>
+        </w:trPr>
+        <w:tc>
+          <w:tcPr>
+            <w:tcW w:w="2700" w:type="dxa"/>
+            <w:tcBorders>
+              <w:top w:val="single" w:sz="4" w:space="0" w:color="BFBFBF"/>
+              <w:left w:val="single" w:sz="4" w:space="0" w:color="BFBFBF"/>
+              <w:bottom w:val="single" w:sz="4" w:space="0" w:color="BFBFBF"/>
+              <w:right w:val="single" w:sz="4" w:space="0" w:color="BFBFBF"/>
+            </w:tcBorders>
+            <w:shd w:val="clear" w:color="auto" w:fill="F3F6FA"/>
+            <w:tcMar>
+              <w:top w:w="70" w:type="dxa"/>
+              <w:left w:w="110" w:type="dxa"/>
+              <w:bottom w:w="70" w:type="dxa"/>
+              <w:right w:w="110" w:type="dxa"/>
+            </w:tcMar>
+            <w:vAlign w:val="center"/>
+          </w:tcPr>
+          <w:p>
+            <w:pPr>
+              <w:spacing w:line="252" w:lineRule="auto"/>
+            </w:pPr>
+            <w:r>
+              <w:rPr>
+                <w:b/>
+                <w:bCs/>
+                <w:sz w:val="20"/>
+                <w:szCs w:val="20"/>
+              </w:rPr>
+              <w:t>4 – Monitoring &amp; logging</w:t>
+            </w:r>
+          </w:p>
+        </w:tc>
+        <w:tc>
+          <w:tcPr>
+            <w:tcW w:w="6326" w:type="dxa"/>
+            <w:tcBorders>
+              <w:top w:val="single" w:sz="4" w:space="0" w:color="BFBFBF"/>
+              <w:left w:val="single" w:sz="4" w:space="0" w:color="BFBFBF"/>
+              <w:bottom w:val="single" w:sz="4" w:space="0" w:color="BFBFBF"/>
+              <w:right w:val="single" w:sz="4" w:space="0" w:color="BFBFBF"/>
+            </w:tcBorders>
+            <w:shd w:val="clear" w:color="auto" w:fill="F3F6FA"/>
+            <w:tcMar>
+              <w:top w:w="70" w:type="dxa"/>
+              <w:left w:w="110" w:type="dxa"/>
+              <w:bottom w:w="70" w:type="dxa"/>
+              <w:right w:w="110" w:type="dxa"/>
+            </w:tcMar>
+            <w:vAlign w:val="center"/>
+          </w:tcPr>
+          <w:p>
+            <w:pPr>
+              <w:spacing w:line="252" w:lineRule="auto"/>
+            </w:pPr>
+            <w:r>
+              <w:rPr>
+                <w:sz w:val="20"/>
+                <w:szCs w:val="20"/>
+              </w:rPr>
+              <w:t>Prometheus and Grafana (monitoring/) with a dashboard for uptime, latency and error rate, plus alert rules</w:t>
+            </w:r>
+          </w:p>
+        </w:tc>
+      </w:tr>
+      <w:tr>
+        <w:trPr>
+          <w:cantSplit/>
+        </w:trPr>
+        <w:tc>
+          <w:tcPr>
+            <w:tcW w:w="2700" w:type="dxa"/>
+            <w:tcBorders>
+              <w:top w:val="single" w:sz="4" w:space="0" w:color="BFBFBF"/>
+              <w:left w:val="single" w:sz="4" w:space="0" w:color="BFBFBF"/>
+              <w:bottom w:val="single" w:sz="4" w:space="0" w:color="BFBFBF"/>
+              <w:right w:val="single" w:sz="4" w:space="0" w:color="BFBFBF"/>
+            </w:tcBorders>
+            <w:shd w:val="clear" w:color="auto" w:fill="FFFFFF"/>
+            <w:tcMar>
+              <w:top w:w="70" w:type="dxa"/>
+              <w:left w:w="110" w:type="dxa"/>
+              <w:bottom w:w="70" w:type="dxa"/>
+              <w:right w:w="110" w:type="dxa"/>
+            </w:tcMar>
+            <w:vAlign w:val="center"/>
+          </w:tcPr>
+          <w:p>
+            <w:pPr>
+              <w:spacing w:line="252" w:lineRule="auto"/>
+            </w:pPr>
+            <w:r>
+              <w:rPr>
+                <w:b/>
+                <w:bCs/>
+                <w:sz w:val="20"/>
+                <w:szCs w:val="20"/>
+              </w:rPr>
+              <w:t>5 – Reflection &amp; report</w:t>
+            </w:r>
+          </w:p>
+        </w:tc>
+        <w:tc>
+          <w:tcPr>
+            <w:tcW w:w="6326" w:type="dxa"/>
+            <w:tcBorders>
+              <w:top w:val="single" w:sz="4" w:space="0" w:color="BFBFBF"/>
+              <w:left w:val="single" w:sz="4" w:space="0" w:color="BFBFBF"/>
+              <w:bottom w:val="single" w:sz="4" w:space="0" w:color="BFBFBF"/>
+              <w:right w:val="single" w:sz="4" w:space="0" w:color="BFBFBF"/>
+            </w:tcBorders>
+            <w:shd w:val="clear" w:color="auto" w:fill="FFFFFF"/>
+            <w:tcMar>
+              <w:top w:w="70" w:type="dxa"/>
+              <w:left w:w="110" w:type="dxa"/>
+              <w:bottom w:w="70" w:type="dxa"/>
+              <w:right w:w="110" w:type="dxa"/>
+            </w:tcMar>
+            <w:vAlign w:val="center"/>
+          </w:tcPr>
+          <w:p>
+            <w:pPr>
+              <w:spacing w:line="252" w:lineRule="auto"/>
+            </w:pPr>
+            <w:r>
+              <w:rPr>
+                <w:sz w:val="20"/>
+                <w:szCs w:val="20"/>
+              </w:rPr>
+              <w:t>Architecture, pipeline flow, challenges and lessons learned documented in README.md</w:t>
+            </w:r>
+          </w:p>
+        </w:tc>
+      </w:tr>
+    </w:tbl>
+    <w:p>
+      <w:pPr>
+        <w:spacing w:after="160"/>
+      </w:pPr>
+    </w:p>
+    <w:p>
+      <w:pPr>
+        <w:spacing w:after="140" w:line="276" w:lineRule="auto"/>
+        <w:jc w:val="both"/>
+      </w:pPr>
+      <w:r>
+        <w:rPr>
+          <w:b/>
+          <w:bCs/>
+        </w:rPr>
+        <w:t>Link to the case studies:</w:t>
+      </w:r>
+      <w:r>
+        <w:t xml:space="preserve"> the service is deployed independently through its own pipeline, as in Amazon's microservices and two-pizza-team model (Q2), and it runs as several replicas with health probes, rolling updates and chaos-engineering switches for fault and latency injection, applying Netflix's design-for-failure approach (Q1).</w:t>
+      </w:r>
+    </w:p>
+    <w:p>
+      <w:pPr>
+        <w:pStyle w:val="Heading1"/>
+        <w:pageBreakBefore/>
+      </w:pPr>
+      <w:bookmarkStart w:id="18" w:name="_Toc241782945"/>
       <w:r>
         <w:lastRenderedPageBreak/>
         <w:t>References</w:t>
       </w:r>
-      <w:bookmarkEnd w:id="17"/>
+      <w:bookmarkEnd w:id="18"/>
     </w:p>
     <w:p>
       <w:pPr>
@@ -7593,10 +8234,10 @@
       </w:r>
     </w:p>
     <w:sectPr>
-      <w:headerReference w:type="default" r:id="rId16"/>
-      <w:footerReference w:type="default" r:id="rId17"/>
-      <w:headerReference w:type="first" r:id="rId18"/>
-      <w:footerReference w:type="first" r:id="rId19"/>
+      <w:headerReference w:type="default" r:id="rId18"/>
+      <w:footerReference w:type="default" r:id="rId19"/>
+      <w:headerReference w:type="first" r:id="rId20"/>
+      <w:footerReference w:type="first" r:id="rId21"/>
       <w:pgSz w:w="11906" w:h="16838"/>
       <w:pgMar w:top="1440" w:right="1440" w:bottom="1300" w:left="1440" w:header="600" w:footer="600" w:gutter="0"/>
       <w:cols w:space="720"/>

</xml_diff>